<commit_message>
Point the validated state at the final submission tag
Both reports still declared milestone-10-evaluation as their validated
state, but that tag predates the multi-category run, the delivery-record
fix and the Word and PDF deliverables, so anyone resolving it would have
read numbers the documents no longer quote.

The evidence index and milestone tracker record the new tag rather than a
fixed hash, since a hash cannot be known before the commit it names.
</commit_message>
<xml_diff>
--- a/docs/deliverables/ConferenceCheck Final Report.docx
+++ b/docs/deliverables/ConferenceCheck Final Report.docx
@@ -81,7 +81,7 @@
         <w:rPr>
           <w:rStyle w:val="VerbatimChar"/>
         </w:rPr>
-        <w:t xml:space="preserve">milestone-10-evaluation</w:t>
+        <w:t xml:space="preserve">milestone-12-final-submission</w:t>
       </w:r>
     </w:p>
     <w:bookmarkStart w:id="10" w:name="declaration"/>
@@ -13908,7 +13908,7 @@
         <w:rPr>
           <w:rStyle w:val="NormalTok"/>
         </w:rPr>
-        <w:t xml:space="preserve"> milestone-10-evaluation</w:t>
+        <w:t xml:space="preserve"> milestone-12-final-submission</w:t>
       </w:r>
     </w:p>
     <w:bookmarkEnd w:id="64"/>

</xml_diff>

<commit_message>
Cite the Firebase pages that carry the claims
The Firebase reference pointed at the documentation root while the claims
made from it live on pages below that root, so a reader following the
citation would not have found what it was cited for. It is now three
entries: the landing page, the architectural overview that states each app
instance is identified by its own registration token, and the delivery page
that states an accepted message is not thereby a delivered one.

Checking the landing page turned up a second overstatement. Section 1 cited
it for reliable, low-latency delivery at no marginal cost; the page mentions
neither latency nor cost, so both claims are gone. It also had Section 1
asserting reliable delivery while three later sections correctly call it
best-effort, which that section now defers to rather than contradicts.
</commit_message>
<xml_diff>
--- a/docs/deliverables/ConferenceCheck Final Report.docx
+++ b/docs/deliverables/ConferenceCheck Final Report.docx
@@ -4162,13 +4162,13 @@
         <w:t xml:space="preserve"> </w:t>
       </w:r>
       <w:r>
-        <w:t xml:space="preserve">Messaging provide reliable, low-latency delivery of updates to mobile</w:t>
-      </w:r>
-      <w:r>
-        <w:t xml:space="preserve"> </w:t>
-      </w:r>
-      <w:r>
-        <w:t xml:space="preserve">devices at no marginal cost [6], and modern cross-platform toolkits such as</w:t>
+        <w:t xml:space="preserve">Messaging exist to send messages to mobile devices reliably [6], within the</w:t>
+      </w:r>
+      <w:r>
+        <w:t xml:space="preserve"> </w:t>
+      </w:r>
+      <w:r>
+        <w:t xml:space="preserve">delivery guarantees Section 2 sets out, and modern cross-platform toolkits such as</w:t>
       </w:r>
       <w:r>
         <w:t xml:space="preserve"> </w:t>
@@ -4180,7 +4180,7 @@
         <w:t xml:space="preserve"> </w:t>
       </w:r>
       <w:r>
-        <w:t xml:space="preserve">and notification functionality [14]. This project applies these</w:t>
+        <w:t xml:space="preserve">and notification functionality [16]. This project applies these</w:t>
       </w:r>
       <w:r>
         <w:t xml:space="preserve"> </w:t>
@@ -4872,7 +4872,7 @@
         <w:pStyle w:val="BodyText"/>
       </w:pPr>
       <w:r>
-        <w:t xml:space="preserve">For the redemption transaction itself, Helland [11] provides the canonical</w:t>
+        <w:t xml:space="preserve">For the redemption transaction itself, Helland [13] provides the canonical</w:t>
       </w:r>
       <w:r>
         <w:t xml:space="preserve"> </w:t>
@@ -4990,19 +4990,43 @@
         <w:pStyle w:val="BodyText"/>
       </w:pPr>
       <w:r>
-        <w:t xml:space="preserve">For attendee communication, Firebase Cloud Messaging documentation [6]</w:t>
-      </w:r>
-      <w:r>
-        <w:t xml:space="preserve"> </w:t>
-      </w:r>
-      <w:r>
-        <w:t xml:space="preserve">describes a store-and-forward push architecture with per-device</w:t>
-      </w:r>
-      <w:r>
-        <w:t xml:space="preserve"> </w:t>
-      </w:r>
-      <w:r>
-        <w:t xml:space="preserve">registration tokens; delivery is best-effort, tokens expire, and devices</w:t>
+        <w:t xml:space="preserve">For attendee communication, Firebase Cloud Messaging documentation describes</w:t>
+      </w:r>
+      <w:r>
+        <w:t xml:space="preserve"> </w:t>
+      </w:r>
+      <w:r>
+        <w:t xml:space="preserve">an architecture in which each app instance registers for messages and is</w:t>
+      </w:r>
+      <w:r>
+        <w:t xml:space="preserve"> </w:t>
+      </w:r>
+      <w:r>
+        <w:t xml:space="preserve">identified by its own registration token [7], and states that a message</w:t>
+      </w:r>
+      <w:r>
+        <w:t xml:space="preserve"> </w:t>
+      </w:r>
+      <w:r>
+        <w:t xml:space="preserve">accepted by FCM has not thereby been delivered: a message for an offline</w:t>
+      </w:r>
+      <w:r>
+        <w:t xml:space="preserve"> </w:t>
+      </w:r>
+      <w:r>
+        <w:t xml:space="preserve">device is stored and delivered when the device reconnects, and delivery may be</w:t>
+      </w:r>
+      <w:r>
+        <w:t xml:space="preserve"> </w:t>
+      </w:r>
+      <w:r>
+        <w:t xml:space="preserve">delayed or may not happen at all [8]. Delivery is therefore best-effort rather</w:t>
+      </w:r>
+      <w:r>
+        <w:t xml:space="preserve"> </w:t>
+      </w:r>
+      <w:r>
+        <w:t xml:space="preserve">than guaranteed, tokens expire, and devices</w:t>
       </w:r>
       <w:r>
         <w:t xml:space="preserve"> </w:t>
@@ -5032,13 +5056,13 @@
         <w:t xml:space="preserve"> </w:t>
       </w:r>
       <w:r>
-        <w:t xml:space="preserve">architectural style [7]; endpoint authentication uses bearer tokens as</w:t>
-      </w:r>
-      <w:r>
-        <w:t xml:space="preserve"> </w:t>
-      </w:r>
-      <w:r>
-        <w:t xml:space="preserve">specified in RFC 6750 [8] and implemented by Laravel Sanctum [9], with</w:t>
+        <w:t xml:space="preserve">architectural style [9]; endpoint authentication uses bearer tokens as</w:t>
+      </w:r>
+      <w:r>
+        <w:t xml:space="preserve"> </w:t>
+      </w:r>
+      <w:r>
+        <w:t xml:space="preserve">specified in RFC 6750 [10] and implemented by Laravel Sanctum [11], with</w:t>
       </w:r>
       <w:r>
         <w:t xml:space="preserve"> </w:t>
@@ -5050,7 +5074,7 @@
         <w:t xml:space="preserve"> </w:t>
       </w:r>
       <w:r>
-        <w:t xml:space="preserve">Verification Standard [10]. The client architecture applies the separation</w:t>
+        <w:t xml:space="preserve">Verification Standard [12]. The client architecture applies the separation</w:t>
       </w:r>
       <w:r>
         <w:t xml:space="preserve"> </w:t>
@@ -5062,13 +5086,13 @@
         <w:t xml:space="preserve"> </w:t>
       </w:r>
       <w:r>
-        <w:t xml:space="preserve">Controller pattern [12], realised in Flutter's widget and provider model</w:t>
-      </w:r>
-      <w:r>
-        <w:t xml:space="preserve"> </w:t>
-      </w:r>
-      <w:r>
-        <w:t xml:space="preserve">[14].</w:t>
+        <w:t xml:space="preserve">Controller pattern [14], realised in Flutter's widget and provider model</w:t>
+      </w:r>
+      <w:r>
+        <w:t xml:space="preserve"> </w:t>
+      </w:r>
+      <w:r>
+        <w:t xml:space="preserve">[16].</w:t>
       </w:r>
     </w:p>
     <w:p>
@@ -5145,7 +5169,7 @@
         <w:t xml:space="preserve"> </w:t>
       </w:r>
       <w:r>
-        <w:t xml:space="preserve">mobile application, the CMS v4 Laravel backend exposing a REST API [7], and</w:t>
+        <w:t xml:space="preserve">mobile application, the CMS v4 Laravel backend exposing a REST API [9], and</w:t>
       </w:r>
       <w:r>
         <w:t xml:space="preserve"> </w:t>
@@ -5376,7 +5400,7 @@
         <w:t xml:space="preserve"> </w:t>
       </w:r>
       <w:r>
-        <w:t xml:space="preserve">Model-View-Controller separation [12]: a presentation layer of Flutter</w:t>
+        <w:t xml:space="preserve">Model-View-Controller separation [14]: a presentation layer of Flutter</w:t>
       </w:r>
       <w:r>
         <w:t xml:space="preserve"> </w:t>
@@ -5439,7 +5463,7 @@
         <w:t xml:space="preserve"> </w:t>
       </w:r>
       <w:r>
-        <w:t xml:space="preserve">Every endpoint requires a Sanctum-issued bearer token [8, 9] and returns a</w:t>
+        <w:t xml:space="preserve">Every endpoint requires a Sanctum-issued bearer token [10, 11] and returns a</w:t>
       </w:r>
       <w:r>
         <w:t xml:space="preserve"> </w:t>
@@ -6112,7 +6136,7 @@
         <w:t xml:space="preserve"> </w:t>
       </w:r>
       <w:r>
-        <w:t xml:space="preserve">[11]. The redemption record, including the redeeming device identifier and</w:t>
+        <w:t xml:space="preserve">[13]. The redemption record, including the redeeming device identifier and</w:t>
       </w:r>
       <w:r>
         <w:t xml:space="preserve"> </w:t>
@@ -6426,13 +6450,13 @@
         <w:t xml:space="preserve"> </w:t>
       </w:r>
       <w:r>
-        <w:t xml:space="preserve">[6] to every registered device token. Because FCM delivery is best-effort</w:t>
-      </w:r>
-      <w:r>
-        <w:t xml:space="preserve"> </w:t>
-      </w:r>
-      <w:r>
-        <w:t xml:space="preserve">[6], every notification is simultaneously persisted and served through an</w:t>
+        <w:t xml:space="preserve">to every registered device token [7]. Because FCM delivery is best-effort</w:t>
+      </w:r>
+      <w:r>
+        <w:t xml:space="preserve"> </w:t>
+      </w:r>
+      <w:r>
+        <w:t xml:space="preserve">[8], every notification is simultaneously persisted and served through an</w:t>
       </w:r>
       <w:r>
         <w:t xml:space="preserve"> </w:t>
@@ -6626,7 +6650,7 @@
         <w:t xml:space="preserve"> </w:t>
       </w:r>
       <w:r>
-        <w:t xml:space="preserve">requirements of the Data Protection Act No. 3 of 2021 of Zambia [13].</w:t>
+        <w:t xml:space="preserve">requirements of the Data Protection Act No. 3 of 2021 of Zambia [15].</w:t>
       </w:r>
       <w:r>
         <w:t xml:space="preserve"> </w:t>
@@ -6650,7 +6674,7 @@
         <w:t xml:space="preserve"> </w:t>
       </w:r>
       <w:r>
-        <w:t xml:space="preserve">guidance [10], and evaluation is performed exclusively on synthetically</w:t>
+        <w:t xml:space="preserve">guidance [12], and evaluation is performed exclusively on synthetically</w:t>
       </w:r>
       <w:r>
         <w:t xml:space="preserve"> </w:t>
@@ -9717,7 +9741,7 @@
         <w:t xml:space="preserve"> </w:t>
       </w:r>
       <w:r>
-        <w:t xml:space="preserve">implied to be covered. Because delivery is best-effort by design [6], the</w:t>
+        <w:t xml:space="preserve">implied to be covered. Because delivery is best-effort by design [8], the</w:t>
       </w:r>
       <w:r>
         <w:t xml:space="preserve"> </w:t>
@@ -10502,7 +10526,7 @@
         <w:t xml:space="preserve"> </w:t>
       </w:r>
       <w:r>
-        <w:t xml:space="preserve">compatibility is expected from Flutter's cross-platform model [14] but was</w:t>
+        <w:t xml:space="preserve">compatibility is expected from Flutter's cross-platform model [16] but was</w:t>
       </w:r>
       <w:r>
         <w:t xml:space="preserve"> </w:t>
@@ -10668,7 +10692,7 @@
       </w:r>
     </w:p>
     <w:bookmarkEnd w:id="50"/>
-    <w:bookmarkStart w:id="55" w:name="references"/>
+    <w:bookmarkStart w:id="57" w:name="references"/>
     <w:p>
       <w:pPr>
         <w:pStyle w:val="Heading1"/>
@@ -10939,20 +10963,38 @@
         </w:numPr>
       </w:pPr>
       <w:r>
-        <w:t xml:space="preserve">R. T. Fielding, "Architectural styles and the design of network-based</w:t>
-      </w:r>
-      <w:r>
-        <w:t xml:space="preserve"> </w:t>
-      </w:r>
-      <w:r>
-        <w:t xml:space="preserve">software architectures," Ph.D. dissertation, Univ. of California,</w:t>
-      </w:r>
-      <w:r>
-        <w:t xml:space="preserve"> </w:t>
-      </w:r>
-      <w:r>
-        <w:t xml:space="preserve">Irvine, CA, USA, 2000.</w:t>
-      </w:r>
+        <w:t xml:space="preserve">Google, "FCM architectural overview,"</w:t>
+      </w:r>
+      <w:r>
+        <w:t xml:space="preserve"> </w:t>
+      </w:r>
+      <w:r>
+        <w:rPr>
+          <w:i/>
+          <w:iCs/>
+        </w:rPr>
+        <w:t xml:space="preserve">Firebase Documentation</w:t>
+      </w:r>
+      <w:r>
+        <w:t xml:space="preserve">, 2025.</w:t>
+      </w:r>
+      <w:r>
+        <w:t xml:space="preserve"> </w:t>
+      </w:r>
+      <w:r>
+        <w:t xml:space="preserve">[Online]. Available:</w:t>
+      </w:r>
+      <w:r>
+        <w:t xml:space="preserve"> </w:t>
+      </w:r>
+      <w:hyperlink r:id="rId52">
+        <w:r>
+          <w:rPr>
+            <w:rStyle w:val="Hyperlink"/>
+          </w:rPr>
+          <w:t xml:space="preserve">https://firebase.google.com/docs/cloud-messaging/fcm-architecture</w:t>
+        </w:r>
+      </w:hyperlink>
     </w:p>
     <w:p>
       <w:pPr>
@@ -10963,14 +11005,38 @@
         </w:numPr>
       </w:pPr>
       <w:r>
-        <w:t xml:space="preserve">M. Jones and D. Hardt, "The OAuth 2.0 Authorization Framework: Bearer</w:t>
-      </w:r>
-      <w:r>
-        <w:t xml:space="preserve"> </w:t>
-      </w:r>
-      <w:r>
-        <w:t xml:space="preserve">Token Usage," IETF RFC 6750, Oct. 2012.</w:t>
-      </w:r>
+        <w:t xml:space="preserve">Google, "Understanding message delivery,"</w:t>
+      </w:r>
+      <w:r>
+        <w:t xml:space="preserve"> </w:t>
+      </w:r>
+      <w:r>
+        <w:rPr>
+          <w:i/>
+          <w:iCs/>
+        </w:rPr>
+        <w:t xml:space="preserve">Firebase Documentation</w:t>
+      </w:r>
+      <w:r>
+        <w:t xml:space="preserve">, 2025.</w:t>
+      </w:r>
+      <w:r>
+        <w:t xml:space="preserve"> </w:t>
+      </w:r>
+      <w:r>
+        <w:t xml:space="preserve">[Online]. Available:</w:t>
+      </w:r>
+      <w:r>
+        <w:t xml:space="preserve"> </w:t>
+      </w:r>
+      <w:hyperlink r:id="rId53">
+        <w:r>
+          <w:rPr>
+            <w:rStyle w:val="Hyperlink"/>
+          </w:rPr>
+          <w:t xml:space="preserve">https://firebase.google.com/docs/cloud-messaging/understand-delivery</w:t>
+        </w:r>
+      </w:hyperlink>
     </w:p>
     <w:p>
       <w:pPr>
@@ -10981,6 +11047,48 @@
         </w:numPr>
       </w:pPr>
       <w:r>
+        <w:t xml:space="preserve">R. T. Fielding, "Architectural styles and the design of network-based</w:t>
+      </w:r>
+      <w:r>
+        <w:t xml:space="preserve"> </w:t>
+      </w:r>
+      <w:r>
+        <w:t xml:space="preserve">software architectures," Ph.D. dissertation, Univ. of California,</w:t>
+      </w:r>
+      <w:r>
+        <w:t xml:space="preserve"> </w:t>
+      </w:r>
+      <w:r>
+        <w:t xml:space="preserve">Irvine, CA, USA, 2000.</w:t>
+      </w:r>
+    </w:p>
+    <w:p>
+      <w:pPr>
+        <w:pStyle w:val="Compact"/>
+        <w:numPr>
+          <w:ilvl w:val="0"/>
+          <w:numId w:val="1002"/>
+        </w:numPr>
+      </w:pPr>
+      <w:r>
+        <w:t xml:space="preserve">M. Jones and D. Hardt, "The OAuth 2.0 Authorization Framework: Bearer</w:t>
+      </w:r>
+      <w:r>
+        <w:t xml:space="preserve"> </w:t>
+      </w:r>
+      <w:r>
+        <w:t xml:space="preserve">Token Usage," IETF RFC 6750, Oct. 2012.</w:t>
+      </w:r>
+    </w:p>
+    <w:p>
+      <w:pPr>
+        <w:pStyle w:val="Compact"/>
+        <w:numPr>
+          <w:ilvl w:val="0"/>
+          <w:numId w:val="1002"/>
+        </w:numPr>
+      </w:pPr>
+      <w:r>
         <w:t xml:space="preserve">Laravel, "Laravel Sanctum,"</w:t>
       </w:r>
       <w:r>
@@ -11005,7 +11113,7 @@
       <w:r>
         <w:t xml:space="preserve"> </w:t>
       </w:r>
-      <w:hyperlink r:id="rId52">
+      <w:hyperlink r:id="rId54">
         <w:r>
           <w:rPr>
             <w:rStyle w:val="Hyperlink"/>
@@ -11055,7 +11163,7 @@
       <w:r>
         <w:t xml:space="preserve"> </w:t>
       </w:r>
-      <w:hyperlink r:id="rId53">
+      <w:hyperlink r:id="rId55">
         <w:r>
           <w:rPr>
             <w:rStyle w:val="Hyperlink"/>
@@ -11185,7 +11293,7 @@
       <w:r>
         <w:t xml:space="preserve"> </w:t>
       </w:r>
-      <w:hyperlink r:id="rId54">
+      <w:hyperlink r:id="rId56">
         <w:r>
           <w:rPr>
             <w:rStyle w:val="Hyperlink"/>
@@ -11259,8 +11367,8 @@
         <w:t xml:space="preserve">correct.</w:t>
       </w:r>
     </w:p>
-    <w:bookmarkEnd w:id="55"/>
-    <w:bookmarkStart w:id="60" w:name="X037053293eb9ad08c241ce36f243ee7ade64cd4"/>
+    <w:bookmarkEnd w:id="57"/>
+    <w:bookmarkStart w:id="62" w:name="X037053293eb9ad08c241ce36f243ee7ade64cd4"/>
     <w:p>
       <w:pPr>
         <w:pStyle w:val="Heading1"/>
@@ -11269,7 +11377,7 @@
         <w:t xml:space="preserve">Appendix A. Artificial intelligence usage disclosure</w:t>
       </w:r>
     </w:p>
-    <w:bookmarkStart w:id="56" w:name="a1-purpose-and-scope"/>
+    <w:bookmarkStart w:id="58" w:name="a1-purpose-and-scope"/>
     <w:p>
       <w:pPr>
         <w:pStyle w:val="Heading2"/>
@@ -11334,8 +11442,8 @@
         <w:t xml:space="preserve">is the student's own.</w:t>
       </w:r>
     </w:p>
-    <w:bookmarkEnd w:id="56"/>
-    <w:bookmarkStart w:id="57" w:name="X31bbee64b3be661744ffdb9935ee6c0fd49beb6"/>
+    <w:bookmarkEnd w:id="58"/>
+    <w:bookmarkStart w:id="59" w:name="X31bbee64b3be661744ffdb9935ee6c0fd49beb6"/>
     <w:p>
       <w:pPr>
         <w:pStyle w:val="Heading2"/>
@@ -11400,8 +11508,8 @@
         <w:t xml:space="preserve">statement that these constitute the project's academic contribution.</w:t>
       </w:r>
     </w:p>
-    <w:bookmarkEnd w:id="57"/>
-    <w:bookmarkStart w:id="58" w:name="a3-validation-of-ai-assisted-output"/>
+    <w:bookmarkEnd w:id="59"/>
+    <w:bookmarkStart w:id="60" w:name="a3-validation-of-ai-assisted-output"/>
     <w:p>
       <w:pPr>
         <w:pStyle w:val="Heading2"/>
@@ -11442,8 +11550,8 @@
         <w:t xml:space="preserve">documentation.</w:t>
       </w:r>
     </w:p>
-    <w:bookmarkEnd w:id="58"/>
-    <w:bookmarkStart w:id="59" w:name="X30fbf2ebb32d8828bd256136a9cb72e1c8ad235"/>
+    <w:bookmarkEnd w:id="60"/>
+    <w:bookmarkStart w:id="61" w:name="X30fbf2ebb32d8828bd256136a9cb72e1c8ad235"/>
     <w:p>
       <w:pPr>
         <w:pStyle w:val="Heading2"/>
@@ -11526,9 +11634,9 @@
         <w:t xml:space="preserve">.</w:t>
       </w:r>
     </w:p>
-    <w:bookmarkEnd w:id="59"/>
-    <w:bookmarkEnd w:id="60"/>
-    <w:bookmarkStart w:id="61" w:name="X249f0d2157194399b77a8676c0e126e929c29b0"/>
+    <w:bookmarkEnd w:id="61"/>
+    <w:bookmarkEnd w:id="62"/>
+    <w:bookmarkStart w:id="63" w:name="X249f0d2157194399b77a8676c0e126e929c29b0"/>
     <w:p>
       <w:pPr>
         <w:pStyle w:val="Heading1"/>
@@ -12289,8 +12397,8 @@
         <w:t xml:space="preserve">19/19.</w:t>
       </w:r>
     </w:p>
-    <w:bookmarkEnd w:id="61"/>
-    <w:bookmarkStart w:id="62" w:name="appendix-c-full-evaluation-figures"/>
+    <w:bookmarkEnd w:id="63"/>
+    <w:bookmarkStart w:id="64" w:name="appendix-c-full-evaluation-figures"/>
     <w:p>
       <w:pPr>
         <w:pStyle w:val="Heading1"/>
@@ -14005,8 +14113,8 @@
         <w:t xml:space="preserve">}</w:t>
       </w:r>
     </w:p>
-    <w:bookmarkEnd w:id="62"/>
-    <w:bookmarkStart w:id="63" w:name="appendix-d-reproduction-commands"/>
+    <w:bookmarkEnd w:id="64"/>
+    <w:bookmarkStart w:id="65" w:name="appendix-d-reproduction-commands"/>
     <w:p>
       <w:pPr>
         <w:pStyle w:val="Heading1"/>
@@ -14643,8 +14751,8 @@
         <w:t xml:space="preserve"> milestone-12-final-submission</w:t>
       </w:r>
     </w:p>
-    <w:bookmarkEnd w:id="63"/>
-    <w:bookmarkStart w:id="92" w:name="X3904e79689775bc93f65e393b9e8d9a787105b3"/>
+    <w:bookmarkEnd w:id="65"/>
+    <w:bookmarkStart w:id="94" w:name="X3904e79689775bc93f65e393b9e8d9a787105b3"/>
     <w:p>
       <w:pPr>
         <w:pStyle w:val="Heading1"/>
@@ -14703,18 +14811,18 @@
           <wp:inline>
             <wp:extent cx="2674620" cy="5943600"/>
             <wp:effectExtent b="0" l="0" r="0" t="0"/>
-            <wp:docPr descr="Organiser analytics dashboard showing check-in progress, meal redemption count and rate, session attendance, overcrowded session count and notification count" title="" id="65" name="Picture"/>
+            <wp:docPr descr="Organiser analytics dashboard showing check-in progress, meal redemption count and rate, session attendance, overcrowded session count and notification count" title="" id="67" name="Picture"/>
             <a:graphic>
               <a:graphicData uri="http://schemas.openxmlformats.org/drawingml/2006/picture">
                 <pic:pic>
                   <pic:nvPicPr>
-                    <pic:cNvPr descr="../evidence-ui-dashboard.png" id="66" name="Picture"/>
+                    <pic:cNvPr descr="../evidence-ui-dashboard.png" id="68" name="Picture"/>
                     <pic:cNvPicPr>
                       <a:picLocks noChangeArrowheads="1" noChangeAspect="1"/>
                     </pic:cNvPicPr>
                   </pic:nvPicPr>
                   <pic:blipFill>
-                    <a:blip r:embed="rId64"/>
+                    <a:blip r:embed="rId66"/>
                     <a:stretch>
                       <a:fillRect/>
                     </a:stretch>
@@ -14797,18 +14905,18 @@
           <wp:inline>
             <wp:extent cx="2674620" cy="5943600"/>
             <wp:effectExtent b="0" l="0" r="0" t="0"/>
-            <wp:docPr descr="Check-ins over time as a line chart, meal redemptions as a bar chart split by Breakfast, Lunch and Supper, and session capacity bars for two sessions" title="" id="68" name="Picture"/>
+            <wp:docPr descr="Check-ins over time as a line chart, meal redemptions as a bar chart split by Breakfast, Lunch and Supper, and session capacity bars for two sessions" title="" id="70" name="Picture"/>
             <a:graphic>
               <a:graphicData uri="http://schemas.openxmlformats.org/drawingml/2006/picture">
                 <pic:pic>
                   <pic:nvPicPr>
-                    <pic:cNvPr descr="../evidence-ui-charts.png" id="69" name="Picture"/>
+                    <pic:cNvPr descr="../evidence-ui-charts.png" id="71" name="Picture"/>
                     <pic:cNvPicPr>
                       <a:picLocks noChangeArrowheads="1" noChangeAspect="1"/>
                     </pic:cNvPicPr>
                   </pic:nvPicPr>
                   <pic:blipFill>
-                    <a:blip r:embed="rId67"/>
+                    <a:blip r:embed="rId69"/>
                     <a:stretch>
                       <a:fillRect/>
                     </a:stretch>
@@ -14897,18 +15005,18 @@
           <wp:inline>
             <wp:extent cx="2674620" cy="5943600"/>
             <wp:effectExtent b="0" l="0" r="0" t="0"/>
-            <wp:docPr descr="Android notification shade showing two alerts from conference_check_mobile: Session over capacity, and Session filling up, both for the Closing Panel session" title="" id="71" name="Picture"/>
+            <wp:docPr descr="Android notification shade showing two alerts from conference_check_mobile: Session over capacity, and Session filling up, both for the Closing Panel session" title="" id="73" name="Picture"/>
             <a:graphic>
               <a:graphicData uri="http://schemas.openxmlformats.org/drawingml/2006/picture">
                 <pic:pic>
                   <pic:nvPicPr>
-                    <pic:cNvPr descr="../evidence-capacity-alerts.png" id="72" name="Picture"/>
+                    <pic:cNvPr descr="../evidence-capacity-alerts.png" id="74" name="Picture"/>
                     <pic:cNvPicPr>
                       <a:picLocks noChangeArrowheads="1" noChangeAspect="1"/>
                     </pic:cNvPicPr>
                   </pic:nvPicPr>
                   <pic:blipFill>
-                    <a:blip r:embed="rId70"/>
+                    <a:blip r:embed="rId72"/>
                     <a:stretch>
                       <a:fillRect/>
                     </a:stretch>
@@ -14991,18 +15099,18 @@
           <wp:inline>
             <wp:extent cx="2674620" cy="5943600"/>
             <wp:effectExtent b="0" l="0" r="0" t="0"/>
-            <wp:docPr descr="Android notification shade showing a notification from conference_check_mobile reading &quot;Lunch is served. Vouchers are now redeemable at Hall B.&quot;" title="" id="74" name="Picture"/>
+            <wp:docPr descr="Android notification shade showing a notification from conference_check_mobile reading &quot;Lunch is served. Vouchers are now redeemable at Hall B.&quot;" title="" id="76" name="Picture"/>
             <a:graphic>
               <a:graphicData uri="http://schemas.openxmlformats.org/drawingml/2006/picture">
                 <pic:pic>
                   <pic:nvPicPr>
-                    <pic:cNvPr descr="../evidence-push-delivered.png" id="75" name="Picture"/>
+                    <pic:cNvPr descr="../evidence-push-delivered.png" id="77" name="Picture"/>
                     <pic:cNvPicPr>
                       <a:picLocks noChangeArrowheads="1" noChangeAspect="1"/>
                     </pic:cNvPicPr>
                   </pic:nvPicPr>
                   <pic:blipFill>
-                    <a:blip r:embed="rId73"/>
+                    <a:blip r:embed="rId75"/>
                     <a:stretch>
                       <a:fillRect/>
                     </a:stretch>
@@ -15079,18 +15187,18 @@
           <wp:inline>
             <wp:extent cx="2674620" cy="5943600"/>
             <wp:effectExtent b="0" l="0" r="0" t="0"/>
-            <wp:docPr descr="Attendee pass screen showing a QR code with the ticket code CONF-2026-001 for Demo Attendee" title="" id="77" name="Picture"/>
+            <wp:docPr descr="Attendee pass screen showing a QR code with the ticket code CONF-2026-001 for Demo Attendee" title="" id="79" name="Picture"/>
             <a:graphic>
               <a:graphicData uri="http://schemas.openxmlformats.org/drawingml/2006/picture">
                 <pic:pic>
                   <pic:nvPicPr>
-                    <pic:cNvPr descr="../evidence-ui-attendee-pass.png" id="78" name="Picture"/>
+                    <pic:cNvPr descr="../evidence-ui-attendee-pass.png" id="80" name="Picture"/>
                     <pic:cNvPicPr>
                       <a:picLocks noChangeArrowheads="1" noChangeAspect="1"/>
                     </pic:cNvPicPr>
                   </pic:nvPicPr>
                   <pic:blipFill>
-                    <a:blip r:embed="rId76"/>
+                    <a:blip r:embed="rId78"/>
                     <a:stretch>
                       <a:fillRect/>
                     </a:stretch>
@@ -15173,18 +15281,18 @@
           <wp:inline>
             <wp:extent cx="2674620" cy="5943600"/>
             <wp:effectExtent b="0" l="0" r="0" t="0"/>
-            <wp:docPr descr="Meals screen listing Breakfast, Lunch and Supper as active categories, with recent redemptions each tagged with the device that recorded them" title="" id="80" name="Picture"/>
+            <wp:docPr descr="Meals screen listing Breakfast, Lunch and Supper as active categories, with recent redemptions each tagged with the device that recorded them" title="" id="82" name="Picture"/>
             <a:graphic>
               <a:graphicData uri="http://schemas.openxmlformats.org/drawingml/2006/picture">
                 <pic:pic>
                   <pic:nvPicPr>
-                    <pic:cNvPr descr="../evidence-ui-meals.png" id="81" name="Picture"/>
+                    <pic:cNvPr descr="../evidence-ui-meals.png" id="83" name="Picture"/>
                     <pic:cNvPicPr>
                       <a:picLocks noChangeArrowheads="1" noChangeAspect="1"/>
                     </pic:cNvPicPr>
                   </pic:nvPicPr>
                   <pic:blipFill>
-                    <a:blip r:embed="rId79"/>
+                    <a:blip r:embed="rId81"/>
                     <a:stretch>
                       <a:fillRect/>
                     </a:stretch>
@@ -15255,18 +15363,18 @@
           <wp:inline>
             <wp:extent cx="2674620" cy="5943600"/>
             <wp:effectExtent b="0" l="0" r="0" t="0"/>
-            <wp:docPr descr="Meal voucher scan screen with the token EVAL-SCAN-OK entered and a green confirmation reading &quot;Voucher redeemed successfully.&quot;" title="" id="83" name="Picture"/>
+            <wp:docPr descr="Meal voucher scan screen with the token EVAL-SCAN-OK entered and a green confirmation reading &quot;Voucher redeemed successfully.&quot;" title="" id="85" name="Picture"/>
             <a:graphic>
               <a:graphicData uri="http://schemas.openxmlformats.org/drawingml/2006/picture">
                 <pic:pic>
                   <pic:nvPicPr>
-                    <pic:cNvPr descr="../evidence-scan-accepted.png" id="84" name="Picture"/>
+                    <pic:cNvPr descr="../evidence-scan-accepted.png" id="86" name="Picture"/>
                     <pic:cNvPicPr>
                       <a:picLocks noChangeArrowheads="1" noChangeAspect="1"/>
                     </pic:cNvPicPr>
                   </pic:nvPicPr>
                   <pic:blipFill>
-                    <a:blip r:embed="rId82"/>
+                    <a:blip r:embed="rId84"/>
                     <a:stretch>
                       <a:fillRect/>
                     </a:stretch>
@@ -15317,18 +15425,18 @@
           <wp:inline>
             <wp:extent cx="2674620" cy="5943600"/>
             <wp:effectExtent b="0" l="0" r="0" t="0"/>
-            <wp:docPr descr="Meal voucher scan screen with the same token re-entered and a red banner reading &quot;Meal voucher has already been redeemed or is not usable.&quot;" title="" id="86" name="Picture"/>
+            <wp:docPr descr="Meal voucher scan screen with the same token re-entered and a red banner reading &quot;Meal voucher has already been redeemed or is not usable.&quot;" title="" id="88" name="Picture"/>
             <a:graphic>
               <a:graphicData uri="http://schemas.openxmlformats.org/drawingml/2006/picture">
                 <pic:pic>
                   <pic:nvPicPr>
-                    <pic:cNvPr descr="../evidence-scan-duplicate-rejected.png" id="87" name="Picture"/>
+                    <pic:cNvPr descr="../evidence-scan-duplicate-rejected.png" id="89" name="Picture"/>
                     <pic:cNvPicPr>
                       <a:picLocks noChangeArrowheads="1" noChangeAspect="1"/>
                     </pic:cNvPicPr>
                   </pic:nvPicPr>
                   <pic:blipFill>
-                    <a:blip r:embed="rId85"/>
+                    <a:blip r:embed="rId87"/>
                     <a:stretch>
                       <a:fillRect/>
                     </a:stretch>
@@ -15405,18 +15513,18 @@
           <wp:inline>
             <wp:extent cx="2674620" cy="5943600"/>
             <wp:effectExtent b="0" l="0" r="0" t="0"/>
-            <wp:docPr descr="Reports screen listing four exports: Attendance Report, Meal Redemption Report, Session Attendance Report and Notification Report" title="" id="89" name="Picture"/>
+            <wp:docPr descr="Reports screen listing four exports: Attendance Report, Meal Redemption Report, Session Attendance Report and Notification Report" title="" id="91" name="Picture"/>
             <a:graphic>
               <a:graphicData uri="http://schemas.openxmlformats.org/drawingml/2006/picture">
                 <pic:pic>
                   <pic:nvPicPr>
-                    <pic:cNvPr descr="../evidence-ui-reports.png" id="90" name="Picture"/>
+                    <pic:cNvPr descr="../evidence-ui-reports.png" id="92" name="Picture"/>
                     <pic:cNvPicPr>
                       <a:picLocks noChangeArrowheads="1" noChangeAspect="1"/>
                     </pic:cNvPicPr>
                   </pic:nvPicPr>
                   <pic:blipFill>
-                    <a:blip r:embed="rId88"/>
+                    <a:blip r:embed="rId90"/>
                     <a:stretch>
                       <a:fillRect/>
                     </a:stretch>
@@ -15457,7 +15565,7 @@
         <w:t xml:space="preserve">in Section 6.6.</w:t>
       </w:r>
     </w:p>
-    <w:bookmarkStart w:id="91" w:name="e1-what-these-figures-do-and-do-not-show"/>
+    <w:bookmarkStart w:id="93" w:name="e1-what-these-figures-do-and-do-not-show"/>
     <w:p>
       <w:pPr>
         <w:pStyle w:val="Heading2"/>
@@ -15542,9 +15650,9 @@
         <w:t xml:space="preserve">them as it does to the push-delivery timing.</w:t>
       </w:r>
     </w:p>
-    <w:bookmarkEnd w:id="91"/>
-    <w:bookmarkEnd w:id="92"/>
-    <w:bookmarkStart w:id="93" w:name="appendix-f-reference-verification-record"/>
+    <w:bookmarkEnd w:id="93"/>
+    <w:bookmarkEnd w:id="94"/>
+    <w:bookmarkStart w:id="95" w:name="appendix-f-reference-verification-record"/>
     <w:p>
       <w:pPr>
         <w:pStyle w:val="Heading1"/>
@@ -15604,9 +15712,9 @@
         <w:tblLook w:firstRow="1" w:lastRow="0" w:firstColumn="0" w:lastColumn="0" w:noHBand="0" w:noVBand="0" w:val="0020"/>
       </w:tblPr>
       <w:tblGrid>
+        <w:gridCol w:w="2080"/>
         <w:gridCol w:w="1950"/>
-        <w:gridCol w:w="1950"/>
-        <w:gridCol w:w="5460"/>
+        <w:gridCol w:w="5330"/>
       </w:tblGrid>
       <w:tr>
         <w:trPr>
@@ -15614,6 +15722,20 @@
         </w:trPr>
         <w:tc>
           <w:tcPr>
+            <w:tcW w:type="dxa" w:w="2080"/>
+          </w:tcPr>
+          <w:p>
+            <w:pPr>
+              <w:pStyle w:val="Compact"/>
+              <w:jc w:val="left"/>
+            </w:pPr>
+            <w:r>
+              <w:t xml:space="preserve">Ref</w:t>
+            </w:r>
+          </w:p>
+        </w:tc>
+        <w:tc>
+          <w:tcPr>
             <w:tcW w:type="dxa" w:w="1950"/>
           </w:tcPr>
           <w:p>
@@ -15622,27 +15744,13 @@
               <w:jc w:val="left"/>
             </w:pPr>
             <w:r>
-              <w:t xml:space="preserve">Ref</w:t>
-            </w:r>
-          </w:p>
-        </w:tc>
-        <w:tc>
-          <w:tcPr>
-            <w:tcW w:type="dxa" w:w="1950"/>
-          </w:tcPr>
-          <w:p>
-            <w:pPr>
-              <w:pStyle w:val="Compact"/>
-              <w:jc w:val="left"/>
-            </w:pPr>
-            <w:r>
               <w:t xml:space="preserve">Bibliographic check</w:t>
             </w:r>
           </w:p>
         </w:tc>
         <w:tc>
           <w:tcPr>
-            <w:tcW w:type="dxa" w:w="5460"/>
+            <w:tcW w:type="dxa" w:w="5330"/>
           </w:tcPr>
           <w:p>
             <w:pPr>
@@ -15658,6 +15766,20 @@
       <w:tr>
         <w:tc>
           <w:tcPr>
+            <w:tcW w:type="dxa" w:w="2080"/>
+          </w:tcPr>
+          <w:p>
+            <w:pPr>
+              <w:pStyle w:val="Compact"/>
+              <w:jc w:val="left"/>
+            </w:pPr>
+            <w:r>
+              <w:t xml:space="preserve">[1] ISO/IEC 18004:2015</w:t>
+            </w:r>
+          </w:p>
+        </w:tc>
+        <w:tc>
+          <w:tcPr>
             <w:tcW w:type="dxa" w:w="1950"/>
           </w:tcPr>
           <w:p>
@@ -15666,27 +15788,13 @@
               <w:jc w:val="left"/>
             </w:pPr>
             <w:r>
-              <w:t xml:space="preserve">[1] ISO/IEC 18004:2015</w:t>
-            </w:r>
-          </w:p>
-        </w:tc>
-        <w:tc>
-          <w:tcPr>
-            <w:tcW w:type="dxa" w:w="1950"/>
-          </w:tcPr>
-          <w:p>
-            <w:pPr>
-              <w:pStyle w:val="Compact"/>
-              <w:jc w:val="left"/>
-            </w:pPr>
-            <w:r>
               <w:t xml:space="preserve">Correct; title and year match the ISO record exactly</w:t>
             </w:r>
           </w:p>
         </w:tc>
         <w:tc>
           <w:tcPr>
-            <w:tcW w:type="dxa" w:w="5460"/>
+            <w:tcW w:type="dxa" w:w="5330"/>
           </w:tcPr>
           <w:p>
             <w:pPr>
@@ -15702,6 +15810,20 @@
       <w:tr>
         <w:tc>
           <w:tcPr>
+            <w:tcW w:type="dxa" w:w="2080"/>
+          </w:tcPr>
+          <w:p>
+            <w:pPr>
+              <w:pStyle w:val="Compact"/>
+              <w:jc w:val="left"/>
+            </w:pPr>
+            <w:r>
+              <w:t xml:space="preserve">[2] Tiwari, ICIT 2016, pp. 39-44</w:t>
+            </w:r>
+          </w:p>
+        </w:tc>
+        <w:tc>
+          <w:tcPr>
             <w:tcW w:type="dxa" w:w="1950"/>
           </w:tcPr>
           <w:p>
@@ -15710,27 +15832,13 @@
               <w:jc w:val="left"/>
             </w:pPr>
             <w:r>
-              <w:t xml:space="preserve">[2] Tiwari, ICIT 2016, pp. 39-44</w:t>
-            </w:r>
-          </w:p>
-        </w:tc>
-        <w:tc>
-          <w:tcPr>
-            <w:tcW w:type="dxa" w:w="1950"/>
-          </w:tcPr>
-          <w:p>
-            <w:pPr>
-              <w:pStyle w:val="Compact"/>
-              <w:jc w:val="left"/>
-            </w:pPr>
-            <w:r>
               <w:t xml:space="preserve">Correct; venue, year and pages match</w:t>
             </w:r>
           </w:p>
         </w:tc>
         <w:tc>
           <w:tcPr>
-            <w:tcW w:type="dxa" w:w="5460"/>
+            <w:tcW w:type="dxa" w:w="5330"/>
           </w:tcPr>
           <w:p>
             <w:pPr>
@@ -15746,6 +15854,20 @@
       <w:tr>
         <w:tc>
           <w:tcPr>
+            <w:tcW w:type="dxa" w:w="2080"/>
+          </w:tcPr>
+          <w:p>
+            <w:pPr>
+              <w:pStyle w:val="Compact"/>
+              <w:jc w:val="left"/>
+            </w:pPr>
+            <w:r>
+              <w:t xml:space="preserve">[3] Masalha and Hirzallah, IJACSA 5(3), pp. 75-79, 2014</w:t>
+            </w:r>
+          </w:p>
+        </w:tc>
+        <w:tc>
+          <w:tcPr>
             <w:tcW w:type="dxa" w:w="1950"/>
           </w:tcPr>
           <w:p>
@@ -15754,27 +15876,13 @@
               <w:jc w:val="left"/>
             </w:pPr>
             <w:r>
-              <w:t xml:space="preserve">[3] Masalha and Hirzallah, IJACSA 5(3), pp. 75-79, 2014</w:t>
-            </w:r>
-          </w:p>
-        </w:tc>
-        <w:tc>
-          <w:tcPr>
-            <w:tcW w:type="dxa" w:w="1950"/>
-          </w:tcPr>
-          <w:p>
-            <w:pPr>
-              <w:pStyle w:val="Compact"/>
-              <w:jc w:val="left"/>
-            </w:pPr>
-            <w:r>
               <w:t xml:space="preserve">Correct; volume, issue, pages and year all match</w:t>
             </w:r>
           </w:p>
         </w:tc>
         <w:tc>
           <w:tcPr>
-            <w:tcW w:type="dxa" w:w="5460"/>
+            <w:tcW w:type="dxa" w:w="5330"/>
           </w:tcPr>
           <w:p>
             <w:pPr>
@@ -15800,6 +15908,20 @@
       <w:tr>
         <w:tc>
           <w:tcPr>
+            <w:tcW w:type="dxa" w:w="2080"/>
+          </w:tcPr>
+          <w:p>
+            <w:pPr>
+              <w:pStyle w:val="Compact"/>
+              <w:jc w:val="left"/>
+            </w:pPr>
+            <w:r>
+              <w:t xml:space="preserve">[4] Few, O'Reilly Media, 2006</w:t>
+            </w:r>
+          </w:p>
+        </w:tc>
+        <w:tc>
+          <w:tcPr>
             <w:tcW w:type="dxa" w:w="1950"/>
           </w:tcPr>
           <w:p>
@@ -15808,27 +15930,13 @@
               <w:jc w:val="left"/>
             </w:pPr>
             <w:r>
-              <w:t xml:space="preserve">[4] Few, O'Reilly Media, 2006</w:t>
-            </w:r>
-          </w:p>
-        </w:tc>
-        <w:tc>
-          <w:tcPr>
-            <w:tcW w:type="dxa" w:w="1950"/>
-          </w:tcPr>
-          <w:p>
-            <w:pPr>
-              <w:pStyle w:val="Compact"/>
-              <w:jc w:val="left"/>
-            </w:pPr>
-            <w:r>
               <w:t xml:space="preserve">Correct; first edition, publisher and year match</w:t>
             </w:r>
           </w:p>
         </w:tc>
         <w:tc>
           <w:tcPr>
-            <w:tcW w:type="dxa" w:w="5460"/>
+            <w:tcW w:type="dxa" w:w="5330"/>
           </w:tcPr>
           <w:p>
             <w:pPr>
@@ -15844,6 +15952,20 @@
       <w:tr>
         <w:tc>
           <w:tcPr>
+            <w:tcW w:type="dxa" w:w="2080"/>
+          </w:tcPr>
+          <w:p>
+            <w:pPr>
+              <w:pStyle w:val="Compact"/>
+              <w:jc w:val="left"/>
+            </w:pPr>
+            <w:r>
+              <w:t xml:space="preserve">[5] Nielsen, Morgan Kaufmann, 1993</w:t>
+            </w:r>
+          </w:p>
+        </w:tc>
+        <w:tc>
+          <w:tcPr>
             <w:tcW w:type="dxa" w:w="1950"/>
           </w:tcPr>
           <w:p>
@@ -15852,27 +15974,13 @@
               <w:jc w:val="left"/>
             </w:pPr>
             <w:r>
-              <w:t xml:space="preserve">[5] Nielsen, Morgan Kaufmann, 1993</w:t>
-            </w:r>
-          </w:p>
-        </w:tc>
-        <w:tc>
-          <w:tcPr>
-            <w:tcW w:type="dxa" w:w="1950"/>
-          </w:tcPr>
-          <w:p>
-            <w:pPr>
-              <w:pStyle w:val="Compact"/>
-              <w:jc w:val="left"/>
-            </w:pPr>
-            <w:r>
               <w:t xml:space="preserve">Correct as a real 1993 edition. The original hardcover was Academic Press; Morgan Kaufmann published the 1993 paperback, which is the form cited</w:t>
             </w:r>
           </w:p>
         </w:tc>
         <w:tc>
           <w:tcPr>
-            <w:tcW w:type="dxa" w:w="5460"/>
+            <w:tcW w:type="dxa" w:w="5330"/>
           </w:tcPr>
           <w:p>
             <w:pPr>
@@ -15888,6 +15996,20 @@
       <w:tr>
         <w:tc>
           <w:tcPr>
+            <w:tcW w:type="dxa" w:w="2080"/>
+          </w:tcPr>
+          <w:p>
+            <w:pPr>
+              <w:pStyle w:val="Compact"/>
+              <w:jc w:val="left"/>
+            </w:pPr>
+            <w:r>
+              <w:t xml:space="preserve">[6] Firebase Cloud Messaging documentation, landing page</w:t>
+            </w:r>
+          </w:p>
+        </w:tc>
+        <w:tc>
+          <w:tcPr>
             <w:tcW w:type="dxa" w:w="1950"/>
           </w:tcPr>
           <w:p>
@@ -15896,35 +16018,31 @@
               <w:jc w:val="left"/>
             </w:pPr>
             <w:r>
-              <w:t xml:space="preserve">[6] Firebase Cloud Messaging documentation</w:t>
-            </w:r>
-          </w:p>
-        </w:tc>
-        <w:tc>
-          <w:tcPr>
-            <w:tcW w:type="dxa" w:w="1950"/>
-          </w:tcPr>
-          <w:p>
-            <w:pPr>
-              <w:pStyle w:val="Compact"/>
-              <w:jc w:val="left"/>
-            </w:pPr>
-            <w:r>
               <w:t xml:space="preserve">Live and official</w:t>
             </w:r>
           </w:p>
         </w:tc>
         <w:tc>
           <w:tcPr>
-            <w:tcW w:type="dxa" w:w="5460"/>
-          </w:tcPr>
-          <w:p>
-            <w:pPr>
-              <w:pStyle w:val="Compact"/>
-              <w:jc w:val="left"/>
-            </w:pPr>
-            <w:r>
-              <w:t xml:space="preserve">Supported, but by pages below the URL cited: per-device registration tokens appear in the architecture page, and store-and-forward behaviour and non-guaranteed delivery in the delivery pages. The specific pages should be cited rather than the documentation root</w:t>
+            <w:tcW w:type="dxa" w:w="5330"/>
+          </w:tcPr>
+          <w:p>
+            <w:pPr>
+              <w:pStyle w:val="Compact"/>
+              <w:jc w:val="left"/>
+            </w:pPr>
+            <w:r>
+              <w:rPr>
+                <w:b/>
+                <w:bCs/>
+              </w:rPr>
+              <w:t xml:space="preserve">Narrowed.</w:t>
+            </w:r>
+            <w:r>
+              <w:t xml:space="preserve"> </w:t>
+            </w:r>
+            <w:r>
+              <w:t xml:space="preserve">The page describes FCM as a solution that "lets you reliably send messages"; it does not mention latency or cost. Section 1 had cited it for "reliable, low-latency delivery... at no marginal cost", so the latency and cost claims were dropped. What remains is what the page states</w:t>
             </w:r>
           </w:p>
         </w:tc>
@@ -15932,6 +16050,20 @@
       <w:tr>
         <w:tc>
           <w:tcPr>
+            <w:tcW w:type="dxa" w:w="2080"/>
+          </w:tcPr>
+          <w:p>
+            <w:pPr>
+              <w:pStyle w:val="Compact"/>
+              <w:jc w:val="left"/>
+            </w:pPr>
+            <w:r>
+              <w:t xml:space="preserve">[7] Google, "FCM architectural overview"</w:t>
+            </w:r>
+          </w:p>
+        </w:tc>
+        <w:tc>
+          <w:tcPr>
             <w:tcW w:type="dxa" w:w="1950"/>
           </w:tcPr>
           <w:p>
@@ -15940,35 +16072,31 @@
               <w:jc w:val="left"/>
             </w:pPr>
             <w:r>
-              <w:t xml:space="preserve">[7] Fielding, PhD dissertation, UC Irvine, 2000</w:t>
-            </w:r>
-          </w:p>
-        </w:tc>
-        <w:tc>
-          <w:tcPr>
-            <w:tcW w:type="dxa" w:w="1950"/>
-          </w:tcPr>
-          <w:p>
-            <w:pPr>
-              <w:pStyle w:val="Compact"/>
-              <w:jc w:val="left"/>
-            </w:pPr>
-            <w:r>
-              <w:t xml:space="preserve">Correct; institution and year match</w:t>
-            </w:r>
-          </w:p>
-        </w:tc>
-        <w:tc>
-          <w:tcPr>
-            <w:tcW w:type="dxa" w:w="5460"/>
-          </w:tcPr>
-          <w:p>
-            <w:pPr>
-              <w:pStyle w:val="Compact"/>
-              <w:jc w:val="left"/>
-            </w:pPr>
-            <w:r>
-              <w:t xml:space="preserve">Cited for the REST architectural style, which the dissertation introduces</w:t>
+              <w:t xml:space="preserve">Live and official</w:t>
+            </w:r>
+          </w:p>
+        </w:tc>
+        <w:tc>
+          <w:tcPr>
+            <w:tcW w:type="dxa" w:w="5330"/>
+          </w:tcPr>
+          <w:p>
+            <w:pPr>
+              <w:pStyle w:val="Compact"/>
+              <w:jc w:val="left"/>
+            </w:pPr>
+            <w:r>
+              <w:rPr>
+                <w:b/>
+                <w:bCs/>
+              </w:rPr>
+              <w:t xml:space="preserve">Added</w:t>
+            </w:r>
+            <w:r>
+              <w:t xml:space="preserve"> </w:t>
+            </w:r>
+            <w:r>
+              <w:t xml:space="preserve">so that the registration-token claim cites the page that makes it: "An instance of a client app registers to receive messages, obtaining a registration token that uniquely identifies the app instance"</w:t>
             </w:r>
           </w:p>
         </w:tc>
@@ -15976,6 +16104,20 @@
       <w:tr>
         <w:tc>
           <w:tcPr>
+            <w:tcW w:type="dxa" w:w="2080"/>
+          </w:tcPr>
+          <w:p>
+            <w:pPr>
+              <w:pStyle w:val="Compact"/>
+              <w:jc w:val="left"/>
+            </w:pPr>
+            <w:r>
+              <w:t xml:space="preserve">[8] Google, "Understanding message delivery"</w:t>
+            </w:r>
+          </w:p>
+        </w:tc>
+        <w:tc>
+          <w:tcPr>
             <w:tcW w:type="dxa" w:w="1950"/>
           </w:tcPr>
           <w:p>
@@ -15984,35 +16126,31 @@
               <w:jc w:val="left"/>
             </w:pPr>
             <w:r>
-              <w:t xml:space="preserve">[8] RFC 6750, Jones and Hardt, Oct. 2012</w:t>
-            </w:r>
-          </w:p>
-        </w:tc>
-        <w:tc>
-          <w:tcPr>
-            <w:tcW w:type="dxa" w:w="1950"/>
-          </w:tcPr>
-          <w:p>
-            <w:pPr>
-              <w:pStyle w:val="Compact"/>
-              <w:jc w:val="left"/>
-            </w:pPr>
-            <w:r>
-              <w:t xml:space="preserve">Correct; authors, number, title and date match the RFC Editor record</w:t>
-            </w:r>
-          </w:p>
-        </w:tc>
-        <w:tc>
-          <w:tcPr>
-            <w:tcW w:type="dxa" w:w="5460"/>
-          </w:tcPr>
-          <w:p>
-            <w:pPr>
-              <w:pStyle w:val="Compact"/>
-              <w:jc w:val="left"/>
-            </w:pPr>
-            <w:r>
-              <w:t xml:space="preserve">Cited for bearer-token usage, which is the RFC's subject</w:t>
+              <w:t xml:space="preserve">Live and official</w:t>
+            </w:r>
+          </w:p>
+        </w:tc>
+        <w:tc>
+          <w:tcPr>
+            <w:tcW w:type="dxa" w:w="5330"/>
+          </w:tcPr>
+          <w:p>
+            <w:pPr>
+              <w:pStyle w:val="Compact"/>
+              <w:jc w:val="left"/>
+            </w:pPr>
+            <w:r>
+              <w:rPr>
+                <w:b/>
+                <w:bCs/>
+              </w:rPr>
+              <w:t xml:space="preserve">Added</w:t>
+            </w:r>
+            <w:r>
+              <w:t xml:space="preserve"> </w:t>
+            </w:r>
+            <w:r>
+              <w:t xml:space="preserve">so that the best-effort claim cites the page that makes it. The page states that a message ID returned to the sender means the message "was accepted for delivery", not delivered, that a message for an offline device is stored until the device reconnects, and that delivery may be delayed</w:t>
             </w:r>
           </w:p>
         </w:tc>
@@ -16020,6 +16158,20 @@
       <w:tr>
         <w:tc>
           <w:tcPr>
+            <w:tcW w:type="dxa" w:w="2080"/>
+          </w:tcPr>
+          <w:p>
+            <w:pPr>
+              <w:pStyle w:val="Compact"/>
+              <w:jc w:val="left"/>
+            </w:pPr>
+            <w:r>
+              <w:t xml:space="preserve">[9] Fielding, PhD dissertation, UC Irvine, 2000</w:t>
+            </w:r>
+          </w:p>
+        </w:tc>
+        <w:tc>
+          <w:tcPr>
             <w:tcW w:type="dxa" w:w="1950"/>
           </w:tcPr>
           <w:p>
@@ -16028,35 +16180,21 @@
               <w:jc w:val="left"/>
             </w:pPr>
             <w:r>
-              <w:t xml:space="preserve">[9] Laravel Sanctum documentation</w:t>
-            </w:r>
-          </w:p>
-        </w:tc>
-        <w:tc>
-          <w:tcPr>
-            <w:tcW w:type="dxa" w:w="1950"/>
-          </w:tcPr>
-          <w:p>
-            <w:pPr>
-              <w:pStyle w:val="Compact"/>
-              <w:jc w:val="left"/>
-            </w:pPr>
-            <w:r>
-              <w:t xml:space="preserve">Live and official</w:t>
-            </w:r>
-          </w:p>
-        </w:tc>
-        <w:tc>
-          <w:tcPr>
-            <w:tcW w:type="dxa" w:w="5460"/>
-          </w:tcPr>
-          <w:p>
-            <w:pPr>
-              <w:pStyle w:val="Compact"/>
-              <w:jc w:val="left"/>
-            </w:pPr>
-            <w:r>
-              <w:t xml:space="preserve">Cited for token authentication, which it documents</w:t>
+              <w:t xml:space="preserve">Correct; institution and year match</w:t>
+            </w:r>
+          </w:p>
+        </w:tc>
+        <w:tc>
+          <w:tcPr>
+            <w:tcW w:type="dxa" w:w="5330"/>
+          </w:tcPr>
+          <w:p>
+            <w:pPr>
+              <w:pStyle w:val="Compact"/>
+              <w:jc w:val="left"/>
+            </w:pPr>
+            <w:r>
+              <w:t xml:space="preserve">Cited for the REST architectural style, which the dissertation introduces</w:t>
             </w:r>
           </w:p>
         </w:tc>
@@ -16064,6 +16202,20 @@
       <w:tr>
         <w:tc>
           <w:tcPr>
+            <w:tcW w:type="dxa" w:w="2080"/>
+          </w:tcPr>
+          <w:p>
+            <w:pPr>
+              <w:pStyle w:val="Compact"/>
+              <w:jc w:val="left"/>
+            </w:pPr>
+            <w:r>
+              <w:t xml:space="preserve">[10] RFC 6750, Jones and Hardt, Oct. 2012</w:t>
+            </w:r>
+          </w:p>
+        </w:tc>
+        <w:tc>
+          <w:tcPr>
             <w:tcW w:type="dxa" w:w="1950"/>
           </w:tcPr>
           <w:p>
@@ -16072,35 +16224,21 @@
               <w:jc w:val="left"/>
             </w:pPr>
             <w:r>
-              <w:t xml:space="preserve">[10] OWASP MASVS v2.0, 2023</w:t>
-            </w:r>
-          </w:p>
-        </w:tc>
-        <w:tc>
-          <w:tcPr>
-            <w:tcW w:type="dxa" w:w="1950"/>
-          </w:tcPr>
-          <w:p>
-            <w:pPr>
-              <w:pStyle w:val="Compact"/>
-              <w:jc w:val="left"/>
-            </w:pPr>
-            <w:r>
-              <w:t xml:space="preserve">Correct; v2.0.0 was released in April 2023</w:t>
-            </w:r>
-          </w:p>
-        </w:tc>
-        <w:tc>
-          <w:tcPr>
-            <w:tcW w:type="dxa" w:w="5460"/>
-          </w:tcPr>
-          <w:p>
-            <w:pPr>
-              <w:pStyle w:val="Compact"/>
-              <w:jc w:val="left"/>
-            </w:pPr>
-            <w:r>
-              <w:t xml:space="preserve">Cited for mobile hardening guidance, which it provides</w:t>
+              <w:t xml:space="preserve">Correct; authors, number, title and date match the RFC Editor record</w:t>
+            </w:r>
+          </w:p>
+        </w:tc>
+        <w:tc>
+          <w:tcPr>
+            <w:tcW w:type="dxa" w:w="5330"/>
+          </w:tcPr>
+          <w:p>
+            <w:pPr>
+              <w:pStyle w:val="Compact"/>
+              <w:jc w:val="left"/>
+            </w:pPr>
+            <w:r>
+              <w:t xml:space="preserve">Cited for bearer-token usage, which is the RFC's subject</w:t>
             </w:r>
           </w:p>
         </w:tc>
@@ -16108,6 +16246,20 @@
       <w:tr>
         <w:tc>
           <w:tcPr>
+            <w:tcW w:type="dxa" w:w="2080"/>
+          </w:tcPr>
+          <w:p>
+            <w:pPr>
+              <w:pStyle w:val="Compact"/>
+              <w:jc w:val="left"/>
+            </w:pPr>
+            <w:r>
+              <w:t xml:space="preserve">[11] Laravel Sanctum documentation</w:t>
+            </w:r>
+          </w:p>
+        </w:tc>
+        <w:tc>
+          <w:tcPr>
             <w:tcW w:type="dxa" w:w="1950"/>
           </w:tcPr>
           <w:p>
@@ -16116,7 +16268,81 @@
               <w:jc w:val="left"/>
             </w:pPr>
             <w:r>
-              <w:t xml:space="preserve">[11] Helland,</w:t>
+              <w:t xml:space="preserve">Live and official</w:t>
+            </w:r>
+          </w:p>
+        </w:tc>
+        <w:tc>
+          <w:tcPr>
+            <w:tcW w:type="dxa" w:w="5330"/>
+          </w:tcPr>
+          <w:p>
+            <w:pPr>
+              <w:pStyle w:val="Compact"/>
+              <w:jc w:val="left"/>
+            </w:pPr>
+            <w:r>
+              <w:t xml:space="preserve">Cited for token authentication, which it documents</w:t>
+            </w:r>
+          </w:p>
+        </w:tc>
+      </w:tr>
+      <w:tr>
+        <w:tc>
+          <w:tcPr>
+            <w:tcW w:type="dxa" w:w="2080"/>
+          </w:tcPr>
+          <w:p>
+            <w:pPr>
+              <w:pStyle w:val="Compact"/>
+              <w:jc w:val="left"/>
+            </w:pPr>
+            <w:r>
+              <w:t xml:space="preserve">[12] OWASP MASVS v2.0, 2023</w:t>
+            </w:r>
+          </w:p>
+        </w:tc>
+        <w:tc>
+          <w:tcPr>
+            <w:tcW w:type="dxa" w:w="1950"/>
+          </w:tcPr>
+          <w:p>
+            <w:pPr>
+              <w:pStyle w:val="Compact"/>
+              <w:jc w:val="left"/>
+            </w:pPr>
+            <w:r>
+              <w:t xml:space="preserve">Correct; v2.0.0 was released in April 2023</w:t>
+            </w:r>
+          </w:p>
+        </w:tc>
+        <w:tc>
+          <w:tcPr>
+            <w:tcW w:type="dxa" w:w="5330"/>
+          </w:tcPr>
+          <w:p>
+            <w:pPr>
+              <w:pStyle w:val="Compact"/>
+              <w:jc w:val="left"/>
+            </w:pPr>
+            <w:r>
+              <w:t xml:space="preserve">Cited for mobile hardening guidance, which it provides</w:t>
+            </w:r>
+          </w:p>
+        </w:tc>
+      </w:tr>
+      <w:tr>
+        <w:tc>
+          <w:tcPr>
+            <w:tcW w:type="dxa" w:w="2080"/>
+          </w:tcPr>
+          <w:p>
+            <w:pPr>
+              <w:pStyle w:val="Compact"/>
+              <w:jc w:val="left"/>
+            </w:pPr>
+            <w:r>
+              <w:t xml:space="preserve">[13] Helland,</w:t>
             </w:r>
             <w:r>
               <w:t xml:space="preserve"> </w:t>
@@ -16152,7 +16378,7 @@
         </w:tc>
         <w:tc>
           <w:tcPr>
-            <w:tcW w:type="dxa" w:w="5460"/>
+            <w:tcW w:type="dxa" w:w="5330"/>
           </w:tcPr>
           <w:p>
             <w:pPr>
@@ -16168,15 +16394,15 @@
       <w:tr>
         <w:tc>
           <w:tcPr>
-            <w:tcW w:type="dxa" w:w="1950"/>
-          </w:tcPr>
-          <w:p>
-            <w:pPr>
-              <w:pStyle w:val="Compact"/>
-              <w:jc w:val="left"/>
-            </w:pPr>
-            <w:r>
-              <w:t xml:space="preserve">[12] Krasner and Pope,</w:t>
+            <w:tcW w:type="dxa" w:w="2080"/>
+          </w:tcPr>
+          <w:p>
+            <w:pPr>
+              <w:pStyle w:val="Compact"/>
+              <w:jc w:val="left"/>
+            </w:pPr>
+            <w:r>
+              <w:t xml:space="preserve">[14] Krasner and Pope,</w:t>
             </w:r>
             <w:r>
               <w:t xml:space="preserve"> </w:t>
@@ -16212,7 +16438,7 @@
         </w:tc>
         <w:tc>
           <w:tcPr>
-            <w:tcW w:type="dxa" w:w="5460"/>
+            <w:tcW w:type="dxa" w:w="5330"/>
           </w:tcPr>
           <w:p>
             <w:pPr>
@@ -16228,6 +16454,20 @@
       <w:tr>
         <w:tc>
           <w:tcPr>
+            <w:tcW w:type="dxa" w:w="2080"/>
+          </w:tcPr>
+          <w:p>
+            <w:pPr>
+              <w:pStyle w:val="Compact"/>
+              <w:jc w:val="left"/>
+            </w:pPr>
+            <w:r>
+              <w:t xml:space="preserve">[15] Data Protection Act No. 3 of 2021, Zambia</w:t>
+            </w:r>
+          </w:p>
+        </w:tc>
+        <w:tc>
+          <w:tcPr>
             <w:tcW w:type="dxa" w:w="1950"/>
           </w:tcPr>
           <w:p>
@@ -16236,27 +16476,13 @@
               <w:jc w:val="left"/>
             </w:pPr>
             <w:r>
-              <w:t xml:space="preserve">[13] Data Protection Act No. 3 of 2021, Zambia</w:t>
-            </w:r>
-          </w:p>
-        </w:tc>
-        <w:tc>
-          <w:tcPr>
-            <w:tcW w:type="dxa" w:w="1950"/>
-          </w:tcPr>
-          <w:p>
-            <w:pPr>
-              <w:pStyle w:val="Compact"/>
-              <w:jc w:val="left"/>
-            </w:pPr>
-            <w:r>
               <w:t xml:space="preserve">Correct; the Act exists under that number and year</w:t>
             </w:r>
           </w:p>
         </w:tc>
         <w:tc>
           <w:tcPr>
-            <w:tcW w:type="dxa" w:w="5460"/>
+            <w:tcW w:type="dxa" w:w="5330"/>
           </w:tcPr>
           <w:p>
             <w:pPr>
@@ -16272,6 +16498,20 @@
       <w:tr>
         <w:tc>
           <w:tcPr>
+            <w:tcW w:type="dxa" w:w="2080"/>
+          </w:tcPr>
+          <w:p>
+            <w:pPr>
+              <w:pStyle w:val="Compact"/>
+              <w:jc w:val="left"/>
+            </w:pPr>
+            <w:r>
+              <w:t xml:space="preserve">[16] Flutter documentation</w:t>
+            </w:r>
+          </w:p>
+        </w:tc>
+        <w:tc>
+          <w:tcPr>
             <w:tcW w:type="dxa" w:w="1950"/>
           </w:tcPr>
           <w:p>
@@ -16280,27 +16520,13 @@
               <w:jc w:val="left"/>
             </w:pPr>
             <w:r>
-              <w:t xml:space="preserve">[14] Flutter documentation</w:t>
-            </w:r>
-          </w:p>
-        </w:tc>
-        <w:tc>
-          <w:tcPr>
-            <w:tcW w:type="dxa" w:w="1950"/>
-          </w:tcPr>
-          <w:p>
-            <w:pPr>
-              <w:pStyle w:val="Compact"/>
-              <w:jc w:val="left"/>
-            </w:pPr>
-            <w:r>
               <w:t xml:space="preserve">Live and official</w:t>
             </w:r>
           </w:p>
         </w:tc>
         <w:tc>
           <w:tcPr>
-            <w:tcW w:type="dxa" w:w="5460"/>
+            <w:tcW w:type="dxa" w:w="5330"/>
           </w:tcPr>
           <w:p>
             <w:pPr>
@@ -16316,7 +16542,7 @@
       <w:tr>
         <w:tc>
           <w:tcPr>
-            <w:tcW w:type="dxa" w:w="1950"/>
+            <w:tcW w:type="dxa" w:w="2080"/>
           </w:tcPr>
           <w:p>
             <w:pPr>
@@ -16357,7 +16583,7 @@
         </w:tc>
         <w:tc>
           <w:tcPr>
-            <w:tcW w:type="dxa" w:w="5460"/>
+            <w:tcW w:type="dxa" w:w="5330"/>
           </w:tcPr>
           <w:p>
             <w:pPr>
@@ -16386,28 +16612,34 @@
         <w:pStyle w:val="BodyText"/>
       </w:pPr>
       <w:r>
-        <w:t xml:space="preserve">Two outstanding items follow from this check and are stated rather than</w:t>
-      </w:r>
-      <w:r>
-        <w:t xml:space="preserve"> </w:t>
-      </w:r>
-      <w:r>
-        <w:t xml:space="preserve">quietly left: reference [6] should cite the specific Firebase pages rather than</w:t>
-      </w:r>
-      <w:r>
-        <w:t xml:space="preserve"> </w:t>
-      </w:r>
-      <w:r>
-        <w:t xml:space="preserve">the documentation root, and the related-work base still needs the recent</w:t>
-      </w:r>
-      <w:r>
-        <w:t xml:space="preserve"> </w:t>
-      </w:r>
-      <w:r>
-        <w:t xml:space="preserve">event-technology literature that Section 2 does not yet cover.</w:t>
-      </w:r>
-    </w:p>
-    <w:bookmarkEnd w:id="93"/>
+        <w:t xml:space="preserve">One outstanding item follows from this check and is stated rather than quietly</w:t>
+      </w:r>
+      <w:r>
+        <w:t xml:space="preserve"> </w:t>
+      </w:r>
+      <w:r>
+        <w:t xml:space="preserve">left: the related-work base still needs the recent event-technology literature</w:t>
+      </w:r>
+      <w:r>
+        <w:t xml:space="preserve"> </w:t>
+      </w:r>
+      <w:r>
+        <w:t xml:space="preserve">that Section 2 does not yet cover. The Firebase citation, which this check</w:t>
+      </w:r>
+      <w:r>
+        <w:t xml:space="preserve"> </w:t>
+      </w:r>
+      <w:r>
+        <w:t xml:space="preserve">first recorded as pointing at the documentation root rather than at the pages</w:t>
+      </w:r>
+      <w:r>
+        <w:t xml:space="preserve"> </w:t>
+      </w:r>
+      <w:r>
+        <w:t xml:space="preserve">carrying the claims, has since been split into [6], [7] and [8] above.</w:t>
+      </w:r>
+    </w:p>
+    <w:bookmarkEnd w:id="95"/>
     <w:sectPr>
       <w:footerReference w:type="default" r:id="rId10"/>
       <w:footnotePr>

</xml_diff>

<commit_message>
rebuild word and pdf
</commit_message>
<xml_diff>
--- a/docs/deliverables/ConferenceCheck Final Report.docx
+++ b/docs/deliverables/ConferenceCheck Final Report.docx
@@ -537,7 +537,7 @@
               <w:jc w:val="left"/>
             </w:pPr>
             <w:r>
-              <w:t xml:space="preserve">6</w:t>
+              <w:t xml:space="preserve">5</w:t>
             </w:r>
           </w:p>
         </w:tc>
@@ -713,7 +713,7 @@
               <w:jc w:val="left"/>
             </w:pPr>
             <w:r>
-              <w:t xml:space="preserve">7</w:t>
+              <w:t xml:space="preserve">6</w:t>
             </w:r>
           </w:p>
         </w:tc>
@@ -809,7 +809,7 @@
               <w:jc w:val="left"/>
             </w:pPr>
             <w:r>
-              <w:t xml:space="preserve">10</w:t>
+              <w:t xml:space="preserve">9</w:t>
             </w:r>
           </w:p>
         </w:tc>
@@ -853,7 +853,7 @@
               <w:jc w:val="left"/>
             </w:pPr>
             <w:r>
-              <w:t xml:space="preserve">10</w:t>
+              <w:t xml:space="preserve">9</w:t>
             </w:r>
           </w:p>
         </w:tc>
@@ -897,7 +897,7 @@
               <w:jc w:val="left"/>
             </w:pPr>
             <w:r>
-              <w:t xml:space="preserve">11</w:t>
+              <w:t xml:space="preserve">10</w:t>
             </w:r>
           </w:p>
         </w:tc>
@@ -985,7 +985,7 @@
               <w:jc w:val="left"/>
             </w:pPr>
             <w:r>
-              <w:t xml:space="preserve">12</w:t>
+              <w:t xml:space="preserve">11</w:t>
             </w:r>
           </w:p>
         </w:tc>
@@ -1657,7 +1657,7 @@
               <w:jc w:val="left"/>
             </w:pPr>
             <w:r>
-              <w:t xml:space="preserve">19</w:t>
+              <w:t xml:space="preserve">20</w:t>
             </w:r>
           </w:p>
         </w:tc>
@@ -1789,7 +1789,7 @@
               <w:jc w:val="left"/>
             </w:pPr>
             <w:r>
-              <w:t xml:space="preserve">20</w:t>
+              <w:t xml:space="preserve">21</w:t>
             </w:r>
           </w:p>
         </w:tc>
@@ -1877,7 +1877,7 @@
               <w:jc w:val="left"/>
             </w:pPr>
             <w:r>
-              <w:t xml:space="preserve">21</w:t>
+              <w:t xml:space="preserve">22</w:t>
             </w:r>
           </w:p>
         </w:tc>
@@ -2062,7 +2062,7 @@
               <w:jc w:val="left"/>
             </w:pPr>
             <w:r>
-              <w:t xml:space="preserve">25</w:t>
+              <w:t xml:space="preserve">26</w:t>
             </w:r>
           </w:p>
         </w:tc>
@@ -2140,7 +2140,7 @@
               <w:jc w:val="left"/>
             </w:pPr>
             <w:r>
-              <w:t xml:space="preserve">Purpose and scope</w:t>
+              <w:t xml:space="preserve">Tool and scope</w:t>
             </w:r>
           </w:p>
         </w:tc>
@@ -2184,7 +2184,7 @@
               <w:jc w:val="left"/>
             </w:pPr>
             <w:r>
-              <w:t xml:space="preserve">Before the supervisor's comments (to 30 September 2026)</w:t>
+              <w:t xml:space="preserve">To 30 September 2026</w:t>
             </w:r>
           </w:p>
         </w:tc>
@@ -2228,7 +2228,7 @@
               <w:jc w:val="left"/>
             </w:pPr>
             <w:r>
-              <w:t xml:space="preserve">After the supervisor's comments (7 to 10 October 2026)</w:t>
+              <w:t xml:space="preserve">From 7 October 2026</w:t>
             </w:r>
           </w:p>
         </w:tc>
@@ -2272,7 +2272,7 @@
               <w:jc w:val="left"/>
             </w:pPr>
             <w:r>
-              <w:t xml:space="preserve">Validation of AI-assisted output</w:t>
+              <w:t xml:space="preserve">How the output was checked</w:t>
             </w:r>
           </w:p>
         </w:tc>
@@ -2316,7 +2316,7 @@
               <w:jc w:val="left"/>
             </w:pPr>
             <w:r>
-              <w:t xml:space="preserve">Honest statement of disclosure limitations</w:t>
+              <w:t xml:space="preserve">Gap in the record</w:t>
             </w:r>
           </w:p>
         </w:tc>
@@ -2426,7 +2426,7 @@
               <w:jc w:val="left"/>
             </w:pPr>
             <w:r>
-              <w:t xml:space="preserve">29</w:t>
+              <w:t xml:space="preserve">30</w:t>
             </w:r>
           </w:p>
         </w:tc>
@@ -2566,7 +2566,7 @@
               <w:jc w:val="left"/>
             </w:pPr>
             <w:r>
-              <w:t xml:space="preserve">42</w:t>
+              <w:t xml:space="preserve">44</w:t>
             </w:r>
           </w:p>
         </w:tc>
@@ -2614,7 +2614,7 @@
               <w:jc w:val="left"/>
             </w:pPr>
             <w:r>
-              <w:t xml:space="preserve">43</w:t>
+              <w:t xml:space="preserve">45</w:t>
             </w:r>
           </w:p>
         </w:tc>
@@ -2756,7 +2756,7 @@
               <w:jc w:val="left"/>
             </w:pPr>
             <w:r>
-              <w:t xml:space="preserve">11</w:t>
+              <w:t xml:space="preserve">10</w:t>
             </w:r>
           </w:p>
         </w:tc>
@@ -3046,7 +3046,7 @@
               <w:jc w:val="left"/>
             </w:pPr>
             <w:r>
-              <w:t xml:space="preserve">20</w:t>
+              <w:t xml:space="preserve">21</w:t>
             </w:r>
           </w:p>
         </w:tc>
@@ -3104,7 +3104,7 @@
               <w:jc w:val="left"/>
             </w:pPr>
             <w:r>
-              <w:t xml:space="preserve">24</w:t>
+              <w:t xml:space="preserve">25</w:t>
             </w:r>
           </w:p>
         </w:tc>
@@ -3162,7 +3162,7 @@
               <w:jc w:val="left"/>
             </w:pPr>
             <w:r>
-              <w:t xml:space="preserve">28</w:t>
+              <w:t xml:space="preserve">29</w:t>
             </w:r>
           </w:p>
         </w:tc>
@@ -3229,7 +3229,7 @@
               <w:jc w:val="left"/>
             </w:pPr>
             <w:r>
-              <w:t xml:space="preserve">29</w:t>
+              <w:t xml:space="preserve">30</w:t>
             </w:r>
           </w:p>
         </w:tc>
@@ -3287,7 +3287,7 @@
               <w:jc w:val="left"/>
             </w:pPr>
             <w:r>
-              <w:t xml:space="preserve">43</w:t>
+              <w:t xml:space="preserve">45</w:t>
             </w:r>
           </w:p>
         </w:tc>
@@ -3429,7 +3429,7 @@
               <w:jc w:val="left"/>
             </w:pPr>
             <w:r>
-              <w:t xml:space="preserve">10</w:t>
+              <w:t xml:space="preserve">9</w:t>
             </w:r>
           </w:p>
         </w:tc>
@@ -3487,7 +3487,7 @@
               <w:jc w:val="left"/>
             </w:pPr>
             <w:r>
-              <w:t xml:space="preserve">34</w:t>
+              <w:t xml:space="preserve">35</w:t>
             </w:r>
           </w:p>
         </w:tc>
@@ -3545,7 +3545,7 @@
               <w:jc w:val="left"/>
             </w:pPr>
             <w:r>
-              <w:t xml:space="preserve">35</w:t>
+              <w:t xml:space="preserve">36</w:t>
             </w:r>
           </w:p>
         </w:tc>
@@ -3603,7 +3603,7 @@
               <w:jc w:val="left"/>
             </w:pPr>
             <w:r>
-              <w:t xml:space="preserve">36</w:t>
+              <w:t xml:space="preserve">37</w:t>
             </w:r>
           </w:p>
         </w:tc>
@@ -3661,7 +3661,7 @@
               <w:jc w:val="left"/>
             </w:pPr>
             <w:r>
-              <w:t xml:space="preserve">37</w:t>
+              <w:t xml:space="preserve">38</w:t>
             </w:r>
           </w:p>
         </w:tc>
@@ -3691,7 +3691,7 @@
               <w:jc w:val="left"/>
             </w:pPr>
             <w:r>
-              <w:t xml:space="preserve">Attendee pass with a server-issued token</w:t>
+              <w:t xml:space="preserve">Attendee check-in and session pass (not a meal voucher)</w:t>
             </w:r>
           </w:p>
         </w:tc>
@@ -3719,7 +3719,7 @@
               <w:jc w:val="left"/>
             </w:pPr>
             <w:r>
-              <w:t xml:space="preserve">38</w:t>
+              <w:t xml:space="preserve">39</w:t>
             </w:r>
           </w:p>
         </w:tc>
@@ -3749,7 +3749,7 @@
               <w:jc w:val="left"/>
             </w:pPr>
             <w:r>
-              <w:t xml:space="preserve">Meal categories and the per-device redemption trail</w:t>
+              <w:t xml:space="preserve">The attendee's meal vouchers in the app</w:t>
             </w:r>
           </w:p>
         </w:tc>
@@ -3777,7 +3777,7 @@
               <w:jc w:val="left"/>
             </w:pPr>
             <w:r>
-              <w:t xml:space="preserve">39</w:t>
+              <w:t xml:space="preserve">40</w:t>
             </w:r>
           </w:p>
         </w:tc>
@@ -3807,7 +3807,7 @@
               <w:jc w:val="left"/>
             </w:pPr>
             <w:r>
-              <w:t xml:space="preserve">Scanner accepting a voucher</w:t>
+              <w:t xml:space="preserve">Meal categories and the per-device redemption trail</w:t>
             </w:r>
           </w:p>
         </w:tc>
@@ -3835,7 +3835,7 @@
               <w:jc w:val="left"/>
             </w:pPr>
             <w:r>
-              <w:t xml:space="preserve">40</w:t>
+              <w:t xml:space="preserve">41</w:t>
             </w:r>
           </w:p>
         </w:tc>
@@ -3865,7 +3865,7 @@
               <w:jc w:val="left"/>
             </w:pPr>
             <w:r>
-              <w:t xml:space="preserve">The same voucher refused on a second attempt</w:t>
+              <w:t xml:space="preserve">Scanner accepting the voucher from Figure 7</w:t>
             </w:r>
           </w:p>
         </w:tc>
@@ -3893,7 +3893,7 @@
               <w:jc w:val="left"/>
             </w:pPr>
             <w:r>
-              <w:t xml:space="preserve">41</w:t>
+              <w:t xml:space="preserve">42</w:t>
             </w:r>
           </w:p>
         </w:tc>
@@ -3923,6 +3923,64 @@
               <w:jc w:val="left"/>
             </w:pPr>
             <w:r>
+              <w:t xml:space="preserve">The same voucher refused on a second attempt</w:t>
+            </w:r>
+          </w:p>
+        </w:tc>
+        <w:tc>
+          <w:tcPr>
+            <w:tcW w:type="dxa" w:w="1170"/>
+          </w:tcPr>
+          <w:p>
+            <w:pPr>
+              <w:pStyle w:val="Compact"/>
+              <w:jc w:val="left"/>
+            </w:pPr>
+            <w:r>
+              <w:t xml:space="preserve">E</w:t>
+            </w:r>
+          </w:p>
+        </w:tc>
+        <w:tc>
+          <w:tcPr>
+            <w:tcW w:type="dxa" w:w="780"/>
+          </w:tcPr>
+          <w:p>
+            <w:pPr>
+              <w:pStyle w:val="Compact"/>
+              <w:jc w:val="left"/>
+            </w:pPr>
+            <w:r>
+              <w:t xml:space="preserve">43</w:t>
+            </w:r>
+          </w:p>
+        </w:tc>
+      </w:tr>
+      <w:tr>
+        <w:tc>
+          <w:tcPr>
+            <w:tcW w:type="dxa" w:w="1040"/>
+          </w:tcPr>
+          <w:p>
+            <w:pPr>
+              <w:pStyle w:val="Compact"/>
+              <w:jc w:val="left"/>
+            </w:pPr>
+            <w:r>
+              <w:t xml:space="preserve">11</w:t>
+            </w:r>
+          </w:p>
+        </w:tc>
+        <w:tc>
+          <w:tcPr>
+            <w:tcW w:type="dxa" w:w="6370"/>
+          </w:tcPr>
+          <w:p>
+            <w:pPr>
+              <w:pStyle w:val="Compact"/>
+              <w:jc w:val="left"/>
+            </w:pPr>
+            <w:r>
               <w:t xml:space="preserve">Report exports available to an organiser</w:t>
             </w:r>
           </w:p>
@@ -3951,7 +4009,7 @@
               <w:jc w:val="left"/>
             </w:pPr>
             <w:r>
-              <w:t xml:space="preserve">42</w:t>
+              <w:t xml:space="preserve">44</w:t>
             </w:r>
           </w:p>
         </w:tc>
@@ -3972,265 +4030,157 @@
         <w:pStyle w:val="FirstParagraph"/>
       </w:pPr>
       <w:r>
-        <w:t xml:space="preserve">On-site conference operations, meal service, session seating and attendee</w:t>
-      </w:r>
-      <w:r>
-        <w:t xml:space="preserve"> </w:t>
-      </w:r>
-      <w:r>
-        <w:t xml:space="preserve">communication, are still widely managed with paper registers and printed</w:t>
-      </w:r>
-      <w:r>
-        <w:t xml:space="preserve"> </w:t>
-      </w:r>
-      <w:r>
-        <w:t xml:space="preserve">vouchers, processes that scale poorly and are vulnerable to</w:t>
-      </w:r>
-      <w:r>
-        <w:t xml:space="preserve"> </w:t>
-      </w:r>
-      <w:r>
-        <w:t xml:space="preserve">duplicate-collection fraud. This report presents the design, implementation</w:t>
-      </w:r>
-      <w:r>
-        <w:t xml:space="preserve"> </w:t>
-      </w:r>
-      <w:r>
-        <w:t xml:space="preserve">and evaluation of ConferenceCheck Mobile: Analytics, Meals and Notifications,</w:t>
-      </w:r>
-      <w:r>
-        <w:t xml:space="preserve"> </w:t>
-      </w:r>
-      <w:r>
-        <w:t xml:space="preserve">component 4.3b of a two-part conference management companion application</w:t>
-      </w:r>
-      <w:r>
-        <w:t xml:space="preserve"> </w:t>
-      </w:r>
-      <w:r>
-        <w:t xml:space="preserve">whose sibling component, 4.3a, delivers attendee check-in capture and</w:t>
-      </w:r>
-      <w:r>
-        <w:t xml:space="preserve"> </w:t>
-      </w:r>
-      <w:r>
-        <w:t xml:space="preserve">offline synchronisation separately. This project consumes check-in data</w:t>
-      </w:r>
-      <w:r>
-        <w:t xml:space="preserve"> </w:t>
-      </w:r>
-      <w:r>
-        <w:t xml:space="preserve">through the REST API contract agreed with 4.3a, with a minimal check-in stub</w:t>
-      </w:r>
-      <w:r>
-        <w:t xml:space="preserve"> </w:t>
-      </w:r>
-      <w:r>
-        <w:t xml:space="preserve">standing in for 4.3a during development, and contributes four capabilities that</w:t>
-      </w:r>
-      <w:r>
-        <w:t xml:space="preserve"> </w:t>
-      </w:r>
-      <w:r>
-        <w:t xml:space="preserve">carry equal weight in its evaluation: a QR-code based meal voucher protocol</w:t>
-      </w:r>
-      <w:r>
-        <w:t xml:space="preserve"> </w:t>
-      </w:r>
-      <w:r>
-        <w:t xml:space="preserve">in which single-use redemption is enforced in the database, by a row lock</w:t>
-      </w:r>
-      <w:r>
-        <w:t xml:space="preserve"> </w:t>
-      </w:r>
-      <w:r>
-        <w:t xml:space="preserve">and a per-voucher uniqueness constraint on an append-only redemption</w:t>
-      </w:r>
-      <w:r>
-        <w:t xml:space="preserve"> </w:t>
-      </w:r>
-      <w:r>
-        <w:t xml:space="preserve">relation, either of which alone prevents a second redemption; a</w:t>
-      </w:r>
-      <w:r>
-        <w:t xml:space="preserve"> </w:t>
-      </w:r>
-      <w:r>
-        <w:t xml:space="preserve">near-real-time analytics dashboard refreshed every 30 seconds; session attendance tracking with configurable capacity</w:t>
-      </w:r>
-      <w:r>
-        <w:t xml:space="preserve"> </w:t>
-      </w:r>
-      <w:r>
-        <w:t xml:space="preserve">thresholds and automatic overcrowding alerts; and dual-channel attendee</w:t>
-      </w:r>
-      <w:r>
-        <w:t xml:space="preserve"> </w:t>
-      </w:r>
-      <w:r>
-        <w:t xml:space="preserve">notifications, combining Firebase Cloud Messaging push with an authenticated</w:t>
-      </w:r>
-      <w:r>
-        <w:t xml:space="preserve"> </w:t>
-      </w:r>
-      <w:r>
-        <w:t xml:space="preserve">in-app feed carrying per-recipient delivery records. An offline scan queue,</w:t>
-      </w:r>
-      <w:r>
-        <w:t xml:space="preserve"> </w:t>
-      </w:r>
-      <w:r>
-        <w:t xml:space="preserve">whose safe replay follows from the server's idempotent scan semantics and</w:t>
-      </w:r>
-      <w:r>
-        <w:t xml:space="preserve"> </w:t>
-      </w:r>
-      <w:r>
-        <w:t xml:space="preserve">which keeps any scan the server has not definitively answered, extends the</w:t>
-      </w:r>
-      <w:r>
-        <w:t xml:space="preserve"> </w:t>
-      </w:r>
-      <w:r>
-        <w:t xml:space="preserve">design to intermittent venue connectivity. The system was</w:t>
-      </w:r>
-      <w:r>
-        <w:t xml:space="preserve"> </w:t>
-      </w:r>
-      <w:r>
-        <w:t xml:space="preserve">evaluated against a seeded 500-attendee event with three meal categories and a</w:t>
-      </w:r>
-      <w:r>
-        <w:t xml:space="preserve"> </w:t>
-      </w:r>
-      <w:r>
-        <w:t xml:space="preserve">voucher per attendee per category, ten sessions and scripted concurrent-fraud</w:t>
-      </w:r>
-      <w:r>
-        <w:t xml:space="preserve"> </w:t>
-      </w:r>
-      <w:r>
-        <w:t xml:space="preserve">scenarios, driven through the live API rather than through unit-level mocks.</w:t>
-      </w:r>
-      <w:r>
-        <w:t xml:space="preserve"> </w:t>
-      </w:r>
-      <w:r>
-        <w:t xml:space="preserve">Not every criterion in the proposal's Table 3 was met, and Table 2 of this</w:t>
-      </w:r>
-      <w:r>
-        <w:t xml:space="preserve"> </w:t>
-      </w:r>
-      <w:r>
-        <w:t xml:space="preserve">report gives the status of each. Duplicate redemption was refused in 100 of 100 sequential</w:t>
-      </w:r>
-      <w:r>
-        <w:t xml:space="preserve"> </w:t>
-      </w:r>
-      <w:r>
-        <w:t xml:space="preserve">re-scans. In a concurrency experiment on PostgreSQL behind five server</w:t>
-      </w:r>
-      <w:r>
-        <w:t xml:space="preserve"> </w:t>
-      </w:r>
-      <w:r>
-        <w:t xml:space="preserve">processes, every one of 50 five-way races produced exactly one redemption</w:t>
-      </w:r>
-      <w:r>
-        <w:t xml:space="preserve"> </w:t>
-      </w:r>
-      <w:r>
-        <w:t xml:space="preserve">whenever the row lock or the unique constraint was in place, while a plain</w:t>
-      </w:r>
-      <w:r>
-        <w:t xml:space="preserve"> </w:t>
-      </w:r>
-      <w:r>
-        <w:t xml:space="preserve">check-then-insert with both removed redeemed 48 of 50 vouchers more than once.</w:t>
-      </w:r>
-      <w:r>
-        <w:t xml:space="preserve"> </w:t>
-      </w:r>
-      <w:r>
-        <w:t xml:space="preserve">All three categories were redeemable independently for each of twenty</w:t>
-      </w:r>
-      <w:r>
-        <w:t xml:space="preserve"> </w:t>
-      </w:r>
-      <w:r>
-        <w:t xml:space="preserve">attendees. Median voucher-scan latency was 145.3 ms (95th percentile</w:t>
-      </w:r>
-      <w:r>
-        <w:t xml:space="preserve"> </w:t>
-      </w:r>
-      <w:r>
-        <w:t xml:space="preserve">261.0 ms), measured over loopback. Twenty check-ins injected at random</w:t>
-      </w:r>
-      <w:r>
-        <w:t xml:space="preserve"> </w:t>
-      </w:r>
-      <w:r>
-        <w:t xml:space="preserve">moments appeared on the dashboard after a median of 18.1 s and at most</w:t>
-      </w:r>
-      <w:r>
-        <w:t xml:space="preserve"> </w:t>
-      </w:r>
-      <w:r>
-        <w:t xml:space="preserve">28.5 s. All four CSV exports matched direct SQL queries on row counts and</w:t>
-      </w:r>
-      <w:r>
-        <w:t xml:space="preserve"> </w:t>
-      </w:r>
-      <w:r>
-        <w:t xml:space="preserve">totals. Capacity alerting was shown working but not timed, push delivery</w:t>
-      </w:r>
-      <w:r>
-        <w:t xml:space="preserve"> </w:t>
-      </w:r>
-      <w:r>
-        <w:t xml:space="preserve">across a fleet of devices was not measured, and a live, human-staffed manual</w:t>
-      </w:r>
-      <w:r>
-        <w:t xml:space="preserve"> </w:t>
-      </w:r>
-      <w:r>
-        <w:t xml:space="preserve">baseline was not run; these are stated as gaps rather than approximated with</w:t>
-      </w:r>
-      <w:r>
-        <w:t xml:space="preserve"> </w:t>
-      </w:r>
-      <w:r>
-        <w:t xml:space="preserve">fabricated figures, and the qualitative argument for the baseline rests on</w:t>
-      </w:r>
-      <w:r>
-        <w:t xml:space="preserve"> </w:t>
-      </w:r>
-      <w:r>
-        <w:t xml:space="preserve">the system's measured 145 ms scan-to-decision time and the fact that a paper</w:t>
-      </w:r>
-      <w:r>
-        <w:t xml:space="preserve"> </w:t>
-      </w:r>
-      <w:r>
-        <w:t xml:space="preserve">voucher has no server-side check to fail. The results indicate that a row lock and a</w:t>
-      </w:r>
-      <w:r>
-        <w:t xml:space="preserve"> </w:t>
-      </w:r>
-      <w:r>
-        <w:t xml:space="preserve">unique constraint each prevent double redemption under real parallel load,</w:t>
-      </w:r>
-      <w:r>
-        <w:t xml:space="preserve"> </w:t>
-      </w:r>
-      <w:r>
-        <w:t xml:space="preserve">where a plain check-then-insert does not, while keeping scan-point latency</w:t>
-      </w:r>
-      <w:r>
-        <w:t xml:space="preserve"> </w:t>
-      </w:r>
-      <w:r>
-        <w:t xml:space="preserve">well within interactive bounds.</w:t>
+        <w:t xml:space="preserve">Conference meal service is still often run on paper vouchers, which can be</w:t>
+      </w:r>
+      <w:r>
+        <w:t xml:space="preserve"> </w:t>
+      </w:r>
+      <w:r>
+        <w:t xml:space="preserve">photographed, copied or presented twice. This report presents ConferenceCheck</w:t>
+      </w:r>
+      <w:r>
+        <w:t xml:space="preserve"> </w:t>
+      </w:r>
+      <w:r>
+        <w:t xml:space="preserve">Mobile: Analytics, Meals and Notifications, component 4.3b of a two-part</w:t>
+      </w:r>
+      <w:r>
+        <w:t xml:space="preserve"> </w:t>
+      </w:r>
+      <w:r>
+        <w:t xml:space="preserve">conference application whose sibling, 4.3a, handles check-in. It contributes a</w:t>
+      </w:r>
+      <w:r>
+        <w:t xml:space="preserve"> </w:t>
+      </w:r>
+      <w:r>
+        <w:t xml:space="preserve">QR meal voucher protocol in which single use is enforced by the database, through</w:t>
+      </w:r>
+      <w:r>
+        <w:t xml:space="preserve"> </w:t>
+      </w:r>
+      <w:r>
+        <w:t xml:space="preserve">a row lock and a unique constraint on the redemption record; an analytics</w:t>
+      </w:r>
+      <w:r>
+        <w:t xml:space="preserve"> </w:t>
+      </w:r>
+      <w:r>
+        <w:t xml:space="preserve">dashboard refreshed every 30 seconds; session attendance with capacity alerts;</w:t>
+      </w:r>
+      <w:r>
+        <w:t xml:space="preserve"> </w:t>
+      </w:r>
+      <w:r>
+        <w:t xml:space="preserve">and push notifications backed by an in-app inbox. The system is a Flutter app</w:t>
+      </w:r>
+      <w:r>
+        <w:t xml:space="preserve"> </w:t>
+      </w:r>
+      <w:r>
+        <w:t xml:space="preserve">and a standalone Laravel API on PostgreSQL. It was evaluated on a seeded</w:t>
+      </w:r>
+      <w:r>
+        <w:t xml:space="preserve"> </w:t>
+      </w:r>
+      <w:r>
+        <w:t xml:space="preserve">500-attendee event driven through the live API. All 100 sequential re-scans of</w:t>
+      </w:r>
+      <w:r>
+        <w:t xml:space="preserve"> </w:t>
+      </w:r>
+      <w:r>
+        <w:t xml:space="preserve">a redeemed voucher were refused. In a concurrency experiment behind five server</w:t>
+      </w:r>
+      <w:r>
+        <w:t xml:space="preserve"> </w:t>
+      </w:r>
+      <w:r>
+        <w:t xml:space="preserve">processes, every one of 50 five-way races gave exactly one redemption whenever</w:t>
+      </w:r>
+      <w:r>
+        <w:t xml:space="preserve"> </w:t>
+      </w:r>
+      <w:r>
+        <w:t xml:space="preserve">the lock or the constraint was in place, while a plain check-then-insert</w:t>
+      </w:r>
+      <w:r>
+        <w:t xml:space="preserve"> </w:t>
+      </w:r>
+      <w:r>
+        <w:t xml:space="preserve">redeemed 48 of 50 vouchers more than once. Median scan latency was 145.3 ms</w:t>
+      </w:r>
+      <w:r>
+        <w:t xml:space="preserve"> </w:t>
+      </w:r>
+      <w:r>
+        <w:t xml:space="preserve">over loopback. Twenty injected check-ins all reached the dashboard within 30 s</w:t>
+      </w:r>
+      <w:r>
+        <w:t xml:space="preserve"> </w:t>
+      </w:r>
+      <w:r>
+        <w:t xml:space="preserve">in the recorded run, though the design does not guarantee it. All four CSV</w:t>
+      </w:r>
+      <w:r>
+        <w:t xml:space="preserve"> </w:t>
+      </w:r>
+      <w:r>
+        <w:t xml:space="preserve">exports matched direct SQL. In the app, one end-to-end trial on an emulator</w:t>
+      </w:r>
+      <w:r>
+        <w:t xml:space="preserve"> </w:t>
+      </w:r>
+      <w:r>
+        <w:t xml:space="preserve">showed a voucher accepted once and refused on its second presentation. Capacity</w:t>
+      </w:r>
+      <w:r>
+        <w:t xml:space="preserve"> </w:t>
+      </w:r>
+      <w:r>
+        <w:t xml:space="preserve">alerts were shown but not timed, push delivery across many devices was not</w:t>
+      </w:r>
+      <w:r>
+        <w:t xml:space="preserve"> </w:t>
+      </w:r>
+      <w:r>
+        <w:t xml:space="preserve">measured, and the manual baseline was not run. The results show that a database</w:t>
+      </w:r>
+      <w:r>
+        <w:t xml:space="preserve"> </w:t>
+      </w:r>
+      <w:r>
+        <w:t xml:space="preserve">lock or constraint, and not an application check, is what prevents double</w:t>
+      </w:r>
+      <w:r>
+        <w:t xml:space="preserve"> </w:t>
+      </w:r>
+      <w:r>
+        <w:t xml:space="preserve">redemption under parallel load.</w:t>
+      </w:r>
+    </w:p>
+    <w:p>
+      <w:pPr>
+        <w:pStyle w:val="BodyText"/>
+      </w:pPr>
+      <w:r>
+        <w:rPr>
+          <w:b/>
+          <w:bCs/>
+        </w:rPr>
+        <w:t xml:space="preserve">Keywords:</w:t>
+      </w:r>
+      <w:r>
+        <w:t xml:space="preserve"> </w:t>
+      </w:r>
+      <w:r>
+        <w:t xml:space="preserve">meal voucher, QR code, double redemption, concurrency control,</w:t>
+      </w:r>
+      <w:r>
+        <w:t xml:space="preserve"> </w:t>
+      </w:r>
+      <w:r>
+        <w:t xml:space="preserve">conference management, Flutter, Laravel</w:t>
       </w:r>
     </w:p>
     <w:bookmarkEnd w:id="15"/>
@@ -6946,6 +6896,90 @@
         <w:t xml:space="preserve">running is kept. The replay tests are listed in Section 6.1.</w:t>
       </w:r>
     </w:p>
+    <w:p>
+      <w:pPr>
+        <w:pStyle w:val="BodyText"/>
+      </w:pPr>
+      <w:r>
+        <w:rPr>
+          <w:b/>
+          <w:bCs/>
+        </w:rPr>
+        <w:t xml:space="preserve">Service rule for meal scans made offline.</w:t>
+      </w:r>
+      <w:r>
+        <w:t xml:space="preserve"> </w:t>
+      </w:r>
+      <w:r>
+        <w:t xml:space="preserve">A queued meal scan is not a</w:t>
+      </w:r>
+      <w:r>
+        <w:t xml:space="preserve"> </w:t>
+      </w:r>
+      <w:r>
+        <w:t xml:space="preserve">redemption. Only the server decides whether a voucher is valid and unused, so</w:t>
+      </w:r>
+      <w:r>
+        <w:t xml:space="preserve"> </w:t>
+      </w:r>
+      <w:r>
+        <w:t xml:space="preserve">while a scan sits in the queue nothing has been checked, and the meal is not</w:t>
+      </w:r>
+      <w:r>
+        <w:t xml:space="preserve"> </w:t>
+      </w:r>
+      <w:r>
+        <w:t xml:space="preserve">served until the server has answered 200. This is consistent with the</w:t>
+      </w:r>
+      <w:r>
+        <w:t xml:space="preserve"> </w:t>
+      </w:r>
+      <w:r>
+        <w:t xml:space="preserve">proposal's statement that voucher redemption needs connectivity: the queue</w:t>
+      </w:r>
+      <w:r>
+        <w:t xml:space="preserve"> </w:t>
+      </w:r>
+      <w:r>
+        <w:t xml:space="preserve">exists so that a scan is not lost, not so that a meal can be served without</w:t>
+      </w:r>
+      <w:r>
+        <w:t xml:space="preserve"> </w:t>
+      </w:r>
+      <w:r>
+        <w:t xml:space="preserve">the check. The scanner says so on screen. When a meal scan is queued it shows</w:t>
+      </w:r>
+      <w:r>
+        <w:t xml:space="preserve"> </w:t>
+      </w:r>
+      <w:r>
+        <w:t xml:space="preserve">"No connection — voucher NOT redeemed. Do not serve this meal; the scan is</w:t>
+      </w:r>
+      <w:r>
+        <w:t xml:space="preserve"> </w:t>
+      </w:r>
+      <w:r>
+        <w:t xml:space="preserve">saved and will be checked when back online." The earlier message, "scan saved</w:t>
+      </w:r>
+      <w:r>
+        <w:t xml:space="preserve"> </w:t>
+      </w:r>
+      <w:r>
+        <w:t xml:space="preserve">and will sync", read as though the meal could be served, and was changed for</w:t>
+      </w:r>
+      <w:r>
+        <w:t xml:space="preserve"> </w:t>
+      </w:r>
+      <w:r>
+        <w:t xml:space="preserve">that reason. Session scans are different, because a queued session entry only</w:t>
+      </w:r>
+      <w:r>
+        <w:t xml:space="preserve"> </w:t>
+      </w:r>
+      <w:r>
+        <w:t xml:space="preserve">delays a count and does not hand anything over.</w:t>
+      </w:r>
+    </w:p>
     <w:bookmarkEnd w:id="27"/>
     <w:bookmarkStart w:id="28" w:name="X13e948a7bb1723223f5c097942673cc9957f02a"/>
     <w:p>
@@ -7377,13 +7411,7 @@
         <w:t xml:space="preserve"> </w:t>
       </w:r>
       <w:r>
-        <w:t xml:space="preserve">set out in Section 9 of the project proposal (v3, resubmitted on 23 September</w:t>
-      </w:r>
-      <w:r>
-        <w:t xml:space="preserve"> </w:t>
-      </w:r>
-      <w:r>
-        <w:t xml:space="preserve">2026 and under review).</w:t>
+        <w:t xml:space="preserve">set out in Section 9 of the project proposal (v4, submission 144, approved).</w:t>
       </w:r>
     </w:p>
     <w:bookmarkEnd w:id="30"/>
@@ -8823,8 +8851,8 @@
       <w:tblGrid>
         <w:gridCol w:w="1690"/>
         <w:gridCol w:w="1560"/>
-        <w:gridCol w:w="3780"/>
-        <w:gridCol w:w="2330"/>
+        <w:gridCol w:w="3751"/>
+        <w:gridCol w:w="2359"/>
       </w:tblGrid>
       <w:tr>
         <w:trPr>
@@ -8860,7 +8888,7 @@
         </w:tc>
         <w:tc>
           <w:tcPr>
-            <w:tcW w:type="dxa" w:w="3780"/>
+            <w:tcW w:type="dxa" w:w="3751"/>
           </w:tcPr>
           <w:p>
             <w:pPr>
@@ -8874,7 +8902,7 @@
         </w:tc>
         <w:tc>
           <w:tcPr>
-            <w:tcW w:type="dxa" w:w="2330"/>
+            <w:tcW w:type="dxa" w:w="2359"/>
           </w:tcPr>
           <w:p>
             <w:pPr>
@@ -8918,7 +8946,7 @@
         </w:tc>
         <w:tc>
           <w:tcPr>
-            <w:tcW w:type="dxa" w:w="3780"/>
+            <w:tcW w:type="dxa" w:w="3751"/>
           </w:tcPr>
           <w:p>
             <w:pPr>
@@ -8932,7 +8960,7 @@
         </w:tc>
         <w:tc>
           <w:tcPr>
-            <w:tcW w:type="dxa" w:w="2330"/>
+            <w:tcW w:type="dxa" w:w="2359"/>
           </w:tcPr>
           <w:p>
             <w:pPr>
@@ -8976,7 +9004,7 @@
         </w:tc>
         <w:tc>
           <w:tcPr>
-            <w:tcW w:type="dxa" w:w="3780"/>
+            <w:tcW w:type="dxa" w:w="3751"/>
           </w:tcPr>
           <w:p>
             <w:pPr>
@@ -8990,7 +9018,7 @@
         </w:tc>
         <w:tc>
           <w:tcPr>
-            <w:tcW w:type="dxa" w:w="2330"/>
+            <w:tcW w:type="dxa" w:w="2359"/>
           </w:tcPr>
           <w:p>
             <w:pPr>
@@ -9034,29 +9062,29 @@
         </w:tc>
         <w:tc>
           <w:tcPr>
-            <w:tcW w:type="dxa" w:w="3780"/>
-          </w:tcPr>
-          <w:p>
-            <w:pPr>
-              <w:pStyle w:val="Compact"/>
-              <w:jc w:val="left"/>
-            </w:pPr>
-            <w:r>
-              <w:t xml:space="preserve">20 injected check-ins: median 18.1 s, p95 28.4 s, max 28.5 s, 20/20 within 30 s</w:t>
-            </w:r>
-          </w:p>
-        </w:tc>
-        <w:tc>
-          <w:tcPr>
-            <w:tcW w:type="dxa" w:w="2330"/>
-          </w:tcPr>
-          <w:p>
-            <w:pPr>
-              <w:pStyle w:val="Compact"/>
-              <w:jc w:val="left"/>
-            </w:pPr>
-            <w:r>
-              <w:t xml:space="preserve">Met in the measured run; by design the worst case is one 30 s cycle plus a fetch, fractionally over 30 s (Section 6.5)</w:t>
+            <w:tcW w:type="dxa" w:w="3751"/>
+          </w:tcPr>
+          <w:p>
+            <w:pPr>
+              <w:pStyle w:val="Compact"/>
+              <w:jc w:val="left"/>
+            </w:pPr>
+            <w:r>
+              <w:t xml:space="preserve">20 injected check-ins, measured with a poller that reproduces the app's refresh, not the app on a device: median 18.1 s, p95 28.4 s, max 28.5 s</w:t>
+            </w:r>
+          </w:p>
+        </w:tc>
+        <w:tc>
+          <w:tcPr>
+            <w:tcW w:type="dxa" w:w="2359"/>
+          </w:tcPr>
+          <w:p>
+            <w:pPr>
+              <w:pStyle w:val="Compact"/>
+              <w:jc w:val="left"/>
+            </w:pPr>
+            <w:r>
+              <w:t xml:space="preserve">20 of 20 within 30 s in the recorded run; not guaranteed by design (a rerun gave 19 of 20, one at 30.02 s) (Section 6.5)</w:t>
             </w:r>
           </w:p>
         </w:tc>
@@ -9092,7 +9120,7 @@
         </w:tc>
         <w:tc>
           <w:tcPr>
-            <w:tcW w:type="dxa" w:w="3780"/>
+            <w:tcW w:type="dxa" w:w="3751"/>
           </w:tcPr>
           <w:p>
             <w:pPr>
@@ -9106,7 +9134,7 @@
         </w:tc>
         <w:tc>
           <w:tcPr>
-            <w:tcW w:type="dxa" w:w="2330"/>
+            <w:tcW w:type="dxa" w:w="2359"/>
           </w:tcPr>
           <w:p>
             <w:pPr>
@@ -9150,7 +9178,7 @@
         </w:tc>
         <w:tc>
           <w:tcPr>
-            <w:tcW w:type="dxa" w:w="3780"/>
+            <w:tcW w:type="dxa" w:w="3751"/>
           </w:tcPr>
           <w:p>
             <w:pPr>
@@ -9164,7 +9192,7 @@
         </w:tc>
         <w:tc>
           <w:tcPr>
-            <w:tcW w:type="dxa" w:w="2330"/>
+            <w:tcW w:type="dxa" w:w="2359"/>
           </w:tcPr>
           <w:p>
             <w:pPr>
@@ -9208,7 +9236,7 @@
         </w:tc>
         <w:tc>
           <w:tcPr>
-            <w:tcW w:type="dxa" w:w="3780"/>
+            <w:tcW w:type="dxa" w:w="3751"/>
           </w:tcPr>
           <w:p>
             <w:pPr>
@@ -9222,7 +9250,7 @@
         </w:tc>
         <w:tc>
           <w:tcPr>
-            <w:tcW w:type="dxa" w:w="2330"/>
+            <w:tcW w:type="dxa" w:w="2359"/>
           </w:tcPr>
           <w:p>
             <w:pPr>
@@ -9266,29 +9294,44 @@
         </w:tc>
         <w:tc>
           <w:tcPr>
-            <w:tcW w:type="dxa" w:w="3780"/>
-          </w:tcPr>
-          <w:p>
-            <w:pPr>
-              <w:pStyle w:val="Compact"/>
-              <w:jc w:val="left"/>
-            </w:pPr>
-            <w:r>
-              <w:t xml:space="preserve">all four exports equal to direct SQL on row counts and on a total each (Section 6.6)</w:t>
-            </w:r>
-          </w:p>
-        </w:tc>
-        <w:tc>
-          <w:tcPr>
-            <w:tcW w:type="dxa" w:w="2330"/>
-          </w:tcPr>
-          <w:p>
-            <w:pPr>
-              <w:pStyle w:val="Compact"/>
-              <w:jc w:val="left"/>
-            </w:pPr>
-            <w:r>
-              <w:t xml:space="preserve">Met</w:t>
+            <w:tcW w:type="dxa" w:w="3751"/>
+          </w:tcPr>
+          <w:p>
+            <w:pPr>
+              <w:pStyle w:val="Compact"/>
+              <w:jc w:val="left"/>
+            </w:pPr>
+            <w:r>
+              <w:t xml:space="preserve">all four exports equal to direct SQL on row counts and on a total each;</w:t>
+            </w:r>
+            <w:r>
+              <w:t xml:space="preserve"> </w:t>
+            </w:r>
+            <w:r>
+              <w:rPr>
+                <w:rStyle w:val="VerbatimChar"/>
+              </w:rPr>
+              <w:t xml:space="preserve">notifications.csv</w:t>
+            </w:r>
+            <w:r>
+              <w:t xml:space="preserve"> </w:t>
+            </w:r>
+            <w:r>
+              <w:t xml:space="preserve">checked as 0 against 0, its real check being a unit test; the sessions total has one non-zero session of ten (Section 6.6)</w:t>
+            </w:r>
+          </w:p>
+        </w:tc>
+        <w:tc>
+          <w:tcPr>
+            <w:tcW w:type="dxa" w:w="2359"/>
+          </w:tcPr>
+          <w:p>
+            <w:pPr>
+              <w:pStyle w:val="Compact"/>
+              <w:jc w:val="left"/>
+            </w:pPr>
+            <w:r>
+              <w:t xml:space="preserve">Met, with those two limits</w:t>
             </w:r>
           </w:p>
         </w:tc>
@@ -9324,7 +9367,7 @@
         </w:tc>
         <w:tc>
           <w:tcPr>
-            <w:tcW w:type="dxa" w:w="3780"/>
+            <w:tcW w:type="dxa" w:w="3751"/>
           </w:tcPr>
           <w:p>
             <w:pPr>
@@ -9338,7 +9381,7 @@
         </w:tc>
         <w:tc>
           <w:tcPr>
-            <w:tcW w:type="dxa" w:w="2330"/>
+            <w:tcW w:type="dxa" w:w="2359"/>
           </w:tcPr>
           <w:p>
             <w:pPr>
@@ -9375,19 +9418,25 @@
         <w:t xml:space="preserve"> </w:t>
       </w:r>
       <w:r>
-        <w:t xml:space="preserve">Four criteria are met, one of them on loopback only; two are partly met; push</w:t>
-      </w:r>
-      <w:r>
-        <w:t xml:space="preserve"> </w:t>
-      </w:r>
-      <w:r>
-        <w:t xml:space="preserve">delivery across a fleet was not measured; and the manual baseline was not</w:t>
-      </w:r>
-      <w:r>
-        <w:t xml:space="preserve"> </w:t>
-      </w:r>
-      <w:r>
-        <w:t xml:space="preserve">run.</w:t>
+        <w:t xml:space="preserve">Two criteria are met, one of them on loopback only, and export correctness is</w:t>
+      </w:r>
+      <w:r>
+        <w:t xml:space="preserve"> </w:t>
+      </w:r>
+      <w:r>
+        <w:t xml:space="preserve">met with the two limits stated in its row; dashboard freshness held in the</w:t>
+      </w:r>
+      <w:r>
+        <w:t xml:space="preserve"> </w:t>
+      </w:r>
+      <w:r>
+        <w:t xml:space="preserve">recorded run but is not guaranteed by design; two criteria are partly met; push</w:t>
+      </w:r>
+      <w:r>
+        <w:t xml:space="preserve"> </w:t>
+      </w:r>
+      <w:r>
+        <w:t xml:space="preserve">delivery across a fleet was not measured; and the manual baseline was not run.</w:t>
       </w:r>
     </w:p>
     <w:bookmarkStart w:id="39" w:name="X853aa5ce97630ec4d1d0a648f45ee2d7b293fe6"/>
@@ -9449,7 +9498,28 @@
         <w:t xml:space="preserve"> </w:t>
       </w:r>
       <w:r>
-        <w:t xml:space="preserve">Flutter client is analyzer-clean with 27 of 27 tests passing.</w:t>
+        <w:t xml:space="preserve">Flutter client is analyzer-clean with 30 of 30 tests passing. The twelve</w:t>
+      </w:r>
+      <w:r>
+        <w:t xml:space="preserve"> </w:t>
+      </w:r>
+      <w:r>
+        <w:t xml:space="preserve">starter-kit tests that render pages need the frontend built first</w:t>
+      </w:r>
+      <w:r>
+        <w:t xml:space="preserve"> </w:t>
+      </w:r>
+      <w:r>
+        <w:t xml:space="preserve">(</w:t>
+      </w:r>
+      <w:r>
+        <w:rPr>
+          <w:rStyle w:val="VerbatimChar"/>
+        </w:rPr>
+        <w:t xml:space="preserve">npm run build</w:t>
+      </w:r>
+      <w:r>
+        <w:t xml:space="preserve">); without it they fail on the missing Vite manifest.</w:t>
       </w:r>
     </w:p>
     <w:p>
@@ -9627,6 +9697,20 @@
       </w:r>
       <w:r>
         <w:t xml:space="preserve">trimming of a manually entered token.</w:t>
+      </w:r>
+    </w:p>
+    <w:p>
+      <w:pPr>
+        <w:pStyle w:val="BodyText"/>
+      </w:pPr>
+      <w:r>
+        <w:t xml:space="preserve">Every test case, with its expected and actual result, is listed in one table,</w:t>
+      </w:r>
+      <w:r>
+        <w:t xml:space="preserve"> </w:t>
+      </w:r>
+      <w:r>
+        <w:t xml:space="preserve">TC-01 to TC-55, in Section 12 of the validation document.</w:t>
       </w:r>
     </w:p>
     <w:p>
@@ -10535,6 +10619,84 @@
       </w:r>
       <w:r>
         <w:t xml:space="preserve">equal to a direct SQL count.</w:t>
+      </w:r>
+    </w:p>
+    <w:p>
+      <w:pPr>
+        <w:pStyle w:val="BodyText"/>
+      </w:pPr>
+      <w:r>
+        <w:rPr>
+          <w:b/>
+          <w:bCs/>
+        </w:rPr>
+        <w:t xml:space="preserve">In the app, end to end.</w:t>
+      </w:r>
+      <w:r>
+        <w:t xml:space="preserve"> </w:t>
+      </w:r>
+      <w:r>
+        <w:t xml:space="preserve">Until 14 October 2026 the attendee app showed only</w:t>
+      </w:r>
+      <w:r>
+        <w:t xml:space="preserve"> </w:t>
+      </w:r>
+      <w:r>
+        <w:t xml:space="preserve">the check-in and session pass, which the meal scanner rightly answers with 404,</w:t>
+      </w:r>
+      <w:r>
+        <w:t xml:space="preserve"> </w:t>
+      </w:r>
+      <w:r>
+        <w:t xml:space="preserve">so the voucher flow worked at the API but not in the app. The My meals screen</w:t>
+      </w:r>
+      <w:r>
+        <w:t xml:space="preserve"> </w:t>
+      </w:r>
+      <w:r>
+        <w:t xml:space="preserve">now shows each of the attendee's vouchers as a QR code (Figure 7). One trial was</w:t>
+      </w:r>
+      <w:r>
+        <w:t xml:space="preserve"> </w:t>
+      </w:r>
+      <w:r>
+        <w:t xml:space="preserve">then run on an Android emulator: the seeded attendee's unused Supper voucher,</w:t>
+      </w:r>
+      <w:r>
+        <w:t xml:space="preserve"> </w:t>
+      </w:r>
+      <w:r>
+        <w:rPr>
+          <w:rStyle w:val="VerbatimChar"/>
+        </w:rPr>
+        <w:t xml:space="preserve">MEAL-DEMO-1-3</w:t>
+      </w:r>
+      <w:r>
+        <w:t xml:space="preserve">, was shown in the attendee app and submitted from the scanner</w:t>
+      </w:r>
+      <w:r>
+        <w:t xml:space="preserve"> </w:t>
+      </w:r>
+      <w:r>
+        <w:t xml:space="preserve">app by manual entry. The server answered 200 and recorded the redemption; the</w:t>
+      </w:r>
+      <w:r>
+        <w:t xml:space="preserve"> </w:t>
+      </w:r>
+      <w:r>
+        <w:t xml:space="preserve">same token submitted again was answered 409 with the time of that redemption</w:t>
+      </w:r>
+      <w:r>
+        <w:t xml:space="preserve"> </w:t>
+      </w:r>
+      <w:r>
+        <w:t xml:space="preserve">(Figures 9 and 10; validation document Section 11). That is one trial on one</w:t>
+      </w:r>
+      <w:r>
+        <w:t xml:space="preserve"> </w:t>
+      </w:r>
+      <w:r>
+        <w:t xml:space="preserve">emulator, without the camera.</w:t>
       </w:r>
     </w:p>
     <w:bookmarkEnd w:id="40"/>
@@ -11167,43 +11329,61 @@
         <w:t xml:space="preserve"> </w:t>
       </w:r>
       <w:r>
-        <w:t xml:space="preserve">end of the first dashboard fetch that showed it. The median was 18.1 s, the</w:t>
-      </w:r>
-      <w:r>
-        <w:t xml:space="preserve"> </w:t>
-      </w:r>
-      <w:r>
-        <w:t xml:space="preserve">95th percentile 28.4 s and the maximum 28.5 s, and all 20 appeared within</w:t>
-      </w:r>
-      <w:r>
-        <w:t xml:space="preserve"> </w:t>
-      </w:r>
-      <w:r>
-        <w:t xml:space="preserve">30 s. This covers the data path to the app, not the time Flutter takes to</w:t>
-      </w:r>
-      <w:r>
-        <w:t xml:space="preserve"> </w:t>
-      </w:r>
-      <w:r>
-        <w:t xml:space="preserve">repaint. By design the worst case is one full 30 s cycle plus the duration of</w:t>
-      </w:r>
-      <w:r>
-        <w:t xml:space="preserve"> </w:t>
-      </w:r>
-      <w:r>
-        <w:t xml:space="preserve">a fetch, so a check-in landing just after a fetch starts can appear</w:t>
-      </w:r>
-      <w:r>
-        <w:t xml:space="preserve"> </w:t>
-      </w:r>
-      <w:r>
-        <w:t xml:space="preserve">fractionally later than 30 s; none of the 20 random trials did, but the design</w:t>
-      </w:r>
-      <w:r>
-        <w:t xml:space="preserve"> </w:t>
-      </w:r>
-      <w:r>
-        <w:t xml:space="preserve">does not guarantee a strict 30 s ceiling.</w:t>
+        <w:t xml:space="preserve">end of the first dashboard fetch that showed it. In the recorded run the</w:t>
+      </w:r>
+      <w:r>
+        <w:t xml:space="preserve"> </w:t>
+      </w:r>
+      <w:r>
+        <w:t xml:space="preserve">median was 18.1 s, the 95th percentile 28.4 s and the maximum 28.5 s, and all</w:t>
+      </w:r>
+      <w:r>
+        <w:t xml:space="preserve"> </w:t>
+      </w:r>
+      <w:r>
+        <w:t xml:space="preserve">20 appeared within 30 s. The measurement is a poller that reproduces the app's</w:t>
+      </w:r>
+      <w:r>
+        <w:t xml:space="preserve"> </w:t>
+      </w:r>
+      <w:r>
+        <w:t xml:space="preserve">refresh, not the app running on a device, so it covers the data path to the</w:t>
+      </w:r>
+      <w:r>
+        <w:t xml:space="preserve"> </w:t>
+      </w:r>
+      <w:r>
+        <w:t xml:space="preserve">app and not the time Flutter takes to repaint. By design the worst case is one</w:t>
+      </w:r>
+      <w:r>
+        <w:t xml:space="preserve"> </w:t>
+      </w:r>
+      <w:r>
+        <w:t xml:space="preserve">full 30 s cycle plus the duration of a fetch, so a check-in landing just after</w:t>
+      </w:r>
+      <w:r>
+        <w:t xml:space="preserve"> </w:t>
+      </w:r>
+      <w:r>
+        <w:t xml:space="preserve">a fetch starts can appear fractionally later than 30 s. That case does happen:</w:t>
+      </w:r>
+      <w:r>
+        <w:t xml:space="preserve"> </w:t>
+      </w:r>
+      <w:r>
+        <w:t xml:space="preserve">when the supervisor reran the same script, 19 of 20 appeared within 30 s and</w:t>
+      </w:r>
+      <w:r>
+        <w:t xml:space="preserve"> </w:t>
+      </w:r>
+      <w:r>
+        <w:t xml:space="preserve">one at 30.02 s, with a median of 11.4 s. The result is therefore 20 of 20</w:t>
+      </w:r>
+      <w:r>
+        <w:t xml:space="preserve"> </w:t>
+      </w:r>
+      <w:r>
+        <w:t xml:space="preserve">within 30 s in the recorded run, not a guaranteed 30 s ceiling.</w:t>
       </w:r>
     </w:p>
     <w:bookmarkEnd w:id="43"/>
@@ -11275,9 +11455,9 @@
       </w:tblPr>
       <w:tblGrid>
         <w:gridCol w:w="2080"/>
-        <w:gridCol w:w="2804"/>
-        <w:gridCol w:w="2238"/>
-        <w:gridCol w:w="2238"/>
+        <w:gridCol w:w="2501"/>
+        <w:gridCol w:w="2743"/>
+        <w:gridCol w:w="2036"/>
       </w:tblGrid>
       <w:tr>
         <w:trPr>
@@ -11299,7 +11479,7 @@
         </w:tc>
         <w:tc>
           <w:tcPr>
-            <w:tcW w:type="dxa" w:w="2804"/>
+            <w:tcW w:type="dxa" w:w="2501"/>
           </w:tcPr>
           <w:p>
             <w:pPr>
@@ -11313,7 +11493,7 @@
         </w:tc>
         <w:tc>
           <w:tcPr>
-            <w:tcW w:type="dxa" w:w="2238"/>
+            <w:tcW w:type="dxa" w:w="2743"/>
           </w:tcPr>
           <w:p>
             <w:pPr>
@@ -11327,7 +11507,7 @@
         </w:tc>
         <w:tc>
           <w:tcPr>
-            <w:tcW w:type="dxa" w:w="2238"/>
+            <w:tcW w:type="dxa" w:w="2036"/>
           </w:tcPr>
           <w:p>
             <w:pPr>
@@ -11360,7 +11540,7 @@
         </w:tc>
         <w:tc>
           <w:tcPr>
-            <w:tcW w:type="dxa" w:w="2804"/>
+            <w:tcW w:type="dxa" w:w="2501"/>
           </w:tcPr>
           <w:p>
             <w:pPr>
@@ -11374,7 +11554,7 @@
         </w:tc>
         <w:tc>
           <w:tcPr>
-            <w:tcW w:type="dxa" w:w="2238"/>
+            <w:tcW w:type="dxa" w:w="2743"/>
           </w:tcPr>
           <w:p>
             <w:pPr>
@@ -11388,7 +11568,7 @@
         </w:tc>
         <w:tc>
           <w:tcPr>
-            <w:tcW w:type="dxa" w:w="2238"/>
+            <w:tcW w:type="dxa" w:w="2036"/>
           </w:tcPr>
           <w:p>
             <w:pPr>
@@ -11421,7 +11601,7 @@
         </w:tc>
         <w:tc>
           <w:tcPr>
-            <w:tcW w:type="dxa" w:w="2804"/>
+            <w:tcW w:type="dxa" w:w="2501"/>
           </w:tcPr>
           <w:p>
             <w:pPr>
@@ -11435,7 +11615,7 @@
         </w:tc>
         <w:tc>
           <w:tcPr>
-            <w:tcW w:type="dxa" w:w="2238"/>
+            <w:tcW w:type="dxa" w:w="2743"/>
           </w:tcPr>
           <w:p>
             <w:pPr>
@@ -11449,7 +11629,7 @@
         </w:tc>
         <w:tc>
           <w:tcPr>
-            <w:tcW w:type="dxa" w:w="2238"/>
+            <w:tcW w:type="dxa" w:w="2036"/>
           </w:tcPr>
           <w:p>
             <w:pPr>
@@ -11482,7 +11662,7 @@
         </w:tc>
         <w:tc>
           <w:tcPr>
-            <w:tcW w:type="dxa" w:w="2804"/>
+            <w:tcW w:type="dxa" w:w="2501"/>
           </w:tcPr>
           <w:p>
             <w:pPr>
@@ -11496,29 +11676,29 @@
         </w:tc>
         <w:tc>
           <w:tcPr>
-            <w:tcW w:type="dxa" w:w="2238"/>
-          </w:tcPr>
-          <w:p>
-            <w:pPr>
-              <w:pStyle w:val="Compact"/>
-              <w:jc w:val="left"/>
-            </w:pPr>
-            <w:r>
-              <w:t xml:space="preserve">10 / equal for all ten</w:t>
-            </w:r>
-          </w:p>
-        </w:tc>
-        <w:tc>
-          <w:tcPr>
-            <w:tcW w:type="dxa" w:w="2238"/>
-          </w:tcPr>
-          <w:p>
-            <w:pPr>
-              <w:pStyle w:val="Compact"/>
-              <w:jc w:val="left"/>
-            </w:pPr>
-            <w:r>
-              <w:t xml:space="preserve">10 / equal for all ten</w:t>
+            <w:tcW w:type="dxa" w:w="2743"/>
+          </w:tcPr>
+          <w:p>
+            <w:pPr>
+              <w:pStyle w:val="Compact"/>
+              <w:jc w:val="left"/>
+            </w:pPr>
+            <w:r>
+              <w:t xml:space="preserve">10 / 40, then 0 for the other nine</w:t>
+            </w:r>
+          </w:p>
+        </w:tc>
+        <w:tc>
+          <w:tcPr>
+            <w:tcW w:type="dxa" w:w="2036"/>
+          </w:tcPr>
+          <w:p>
+            <w:pPr>
+              <w:pStyle w:val="Compact"/>
+              <w:jc w:val="left"/>
+            </w:pPr>
+            <w:r>
+              <w:t xml:space="preserve">10 / 40, then 0 for the other nine</w:t>
             </w:r>
           </w:p>
         </w:tc>
@@ -11543,7 +11723,7 @@
         </w:tc>
         <w:tc>
           <w:tcPr>
-            <w:tcW w:type="dxa" w:w="2804"/>
+            <w:tcW w:type="dxa" w:w="2501"/>
           </w:tcPr>
           <w:p>
             <w:pPr>
@@ -11557,7 +11737,7 @@
         </w:tc>
         <w:tc>
           <w:tcPr>
-            <w:tcW w:type="dxa" w:w="2238"/>
+            <w:tcW w:type="dxa" w:w="2743"/>
           </w:tcPr>
           <w:p>
             <w:pPr>
@@ -11571,7 +11751,7 @@
         </w:tc>
         <w:tc>
           <w:tcPr>
-            <w:tcW w:type="dxa" w:w="2238"/>
+            <w:tcW w:type="dxa" w:w="2036"/>
           </w:tcPr>
           <w:p>
             <w:pPr>
@@ -11590,19 +11770,25 @@
         <w:pStyle w:val="BodyText"/>
       </w:pPr>
       <w:r>
-        <w:t xml:space="preserve">All four exports equal the database on their row count and on one total each.</w:t>
-      </w:r>
-      <w:r>
-        <w:t xml:space="preserve"> </w:t>
-      </w:r>
-      <w:r>
-        <w:t xml:space="preserve">The evaluation event has no notifications, because sending one would have used</w:t>
-      </w:r>
-      <w:r>
-        <w:t xml:space="preserve"> </w:t>
-      </w:r>
-      <w:r>
-        <w:t xml:space="preserve">live Firebase credentials, so the</w:t>
+        <w:t xml:space="preserve">All four exports equal the database on their row count and on one total each,</w:t>
+      </w:r>
+      <w:r>
+        <w:t xml:space="preserve"> </w:t>
+      </w:r>
+      <w:r>
+        <w:t xml:space="preserve">but two of those checks are weaker than they look. The evaluation event has no</w:t>
+      </w:r>
+      <w:r>
+        <w:t xml:space="preserve"> </w:t>
+      </w:r>
+      <w:r>
+        <w:t xml:space="preserve">notifications, because sending one would have used live Firebase credentials,</w:t>
+      </w:r>
+      <w:r>
+        <w:t xml:space="preserve"> </w:t>
+      </w:r>
+      <w:r>
+        <w:t xml:space="preserve">so</w:t>
       </w:r>
       <w:r>
         <w:t xml:space="preserve"> </w:t>
@@ -11617,19 +11803,43 @@
         <w:t xml:space="preserve"> </w:t>
       </w:r>
       <w:r>
-        <w:t xml:space="preserve">check compares zero with</w:t>
-      </w:r>
-      <w:r>
-        <w:t xml:space="preserve"> </w:t>
-      </w:r>
-      <w:r>
-        <w:t xml:space="preserve">zero; that export's row count is tested on seeded data that does contain a</w:t>
-      </w:r>
-      <w:r>
-        <w:t xml:space="preserve"> </w:t>
-      </w:r>
-      <w:r>
-        <w:t xml:space="preserve">notification. An earlier version of this check compared two exports with</w:t>
+        <w:t xml:space="preserve">was checked as 0 against 0 in the run, which shows only</w:t>
+      </w:r>
+      <w:r>
+        <w:t xml:space="preserve"> </w:t>
+      </w:r>
+      <w:r>
+        <w:t xml:space="preserve">that the export is well formed. Its real check is the unit test</w:t>
+      </w:r>
+      <w:r>
+        <w:t xml:space="preserve"> </w:t>
+      </w:r>
+      <w:r>
+        <w:rPr>
+          <w:rStyle w:val="VerbatimChar"/>
+        </w:rPr>
+        <w:t xml:space="preserve">test_every_export_has_one_row_per_database_record</w:t>
+      </w:r>
+      <w:r>
+        <w:t xml:space="preserve">, which runs on seeded data</w:t>
+      </w:r>
+      <w:r>
+        <w:t xml:space="preserve"> </w:t>
+      </w:r>
+      <w:r>
+        <w:t xml:space="preserve">that does contain a notification. The sessions total is also thin: only one</w:t>
+      </w:r>
+      <w:r>
+        <w:t xml:space="preserve"> </w:t>
+      </w:r>
+      <w:r>
+        <w:t xml:space="preserve">of the ten sessions has any attendance, so it compares one non-zero value and</w:t>
+      </w:r>
+      <w:r>
+        <w:t xml:space="preserve"> </w:t>
+      </w:r>
+      <w:r>
+        <w:t xml:space="preserve">nine zeros. An earlier version of this check compared two exports with</w:t>
       </w:r>
       <w:r>
         <w:t xml:space="preserve"> </w:t>
@@ -12683,13 +12893,13 @@
         <w:t xml:space="preserve"> </w:t>
       </w:r>
       <w:r>
-        <w:t xml:space="preserve">by application code, a near-real-time analytics dashboard with a stated and</w:t>
-      </w:r>
-      <w:r>
-        <w:t xml:space="preserve"> </w:t>
-      </w:r>
-      <w:r>
-        <w:t xml:space="preserve">measured staleness bound, session capacity tracking with automatic</w:t>
+        <w:t xml:space="preserve">by application code, a near-real-time analytics dashboard whose staleness was</w:t>
+      </w:r>
+      <w:r>
+        <w:t xml:space="preserve"> </w:t>
+      </w:r>
+      <w:r>
+        <w:t xml:space="preserve">measured but is not guaranteed below 30 s, session capacity tracking with automatic</w:t>
       </w:r>
       <w:r>
         <w:t xml:space="preserve"> </w:t>
@@ -12725,13 +12935,25 @@
         <w:t xml:space="preserve"> </w:t>
       </w:r>
       <w:r>
-        <w:t xml:space="preserve">four are met, one of them on loopback only, two are partly met, fleet-scale</w:t>
-      </w:r>
-      <w:r>
-        <w:t xml:space="preserve"> </w:t>
-      </w:r>
-      <w:r>
-        <w:t xml:space="preserve">push delivery was not measured and the manual baseline was not run. Table 7</w:t>
+        <w:t xml:space="preserve">two are met, one of them on loopback only; export correctness is met with two</w:t>
+      </w:r>
+      <w:r>
+        <w:t xml:space="preserve"> </w:t>
+      </w:r>
+      <w:r>
+        <w:t xml:space="preserve">stated limits; dashboard freshness held in the recorded run but is not</w:t>
+      </w:r>
+      <w:r>
+        <w:t xml:space="preserve"> </w:t>
+      </w:r>
+      <w:r>
+        <w:t xml:space="preserve">guaranteed by design; two are partly met; fleet-scale push delivery was not</w:t>
+      </w:r>
+      <w:r>
+        <w:t xml:space="preserve"> </w:t>
+      </w:r>
+      <w:r>
+        <w:t xml:space="preserve">measured; and the manual baseline was not run. Table 7</w:t>
       </w:r>
       <w:r>
         <w:t xml:space="preserve"> </w:t>
@@ -12762,9 +12984,9 @@
         <w:tblLook w:firstRow="1" w:lastRow="0" w:firstColumn="0" w:lastColumn="0" w:noHBand="0" w:noVBand="0" w:val="0020"/>
       </w:tblPr>
       <w:tblGrid>
-        <w:gridCol w:w="2100"/>
-        <w:gridCol w:w="4422"/>
-        <w:gridCol w:w="2837"/>
+        <w:gridCol w:w="1950"/>
+        <w:gridCol w:w="3781"/>
+        <w:gridCol w:w="3629"/>
       </w:tblGrid>
       <w:tr>
         <w:trPr>
@@ -12772,7 +12994,7 @@
         </w:trPr>
         <w:tc>
           <w:tcPr>
-            <w:tcW w:type="dxa" w:w="2100"/>
+            <w:tcW w:type="dxa" w:w="1950"/>
           </w:tcPr>
           <w:p>
             <w:pPr>
@@ -12786,7 +13008,7 @@
         </w:tc>
         <w:tc>
           <w:tcPr>
-            <w:tcW w:type="dxa" w:w="4422"/>
+            <w:tcW w:type="dxa" w:w="3781"/>
           </w:tcPr>
           <w:p>
             <w:pPr>
@@ -12800,7 +13022,7 @@
         </w:tc>
         <w:tc>
           <w:tcPr>
-            <w:tcW w:type="dxa" w:w="2837"/>
+            <w:tcW w:type="dxa" w:w="3629"/>
           </w:tcPr>
           <w:p>
             <w:pPr>
@@ -12816,7 +13038,7 @@
       <w:tr>
         <w:tc>
           <w:tcPr>
-            <w:tcW w:type="dxa" w:w="2100"/>
+            <w:tcW w:type="dxa" w:w="1950"/>
           </w:tcPr>
           <w:p>
             <w:pPr>
@@ -12830,29 +13052,29 @@
         </w:tc>
         <w:tc>
           <w:tcPr>
-            <w:tcW w:type="dxa" w:w="4422"/>
-          </w:tcPr>
-          <w:p>
-            <w:pPr>
-              <w:pStyle w:val="Compact"/>
-              <w:jc w:val="left"/>
-            </w:pPr>
-            <w:r>
-              <w:t xml:space="preserve">Met, as near-real-time: a 30 s poll by design rather than a live stream</w:t>
-            </w:r>
-          </w:p>
-        </w:tc>
-        <w:tc>
-          <w:tcPr>
-            <w:tcW w:type="dxa" w:w="2837"/>
-          </w:tcPr>
-          <w:p>
-            <w:pPr>
-              <w:pStyle w:val="Compact"/>
-              <w:jc w:val="left"/>
-            </w:pPr>
-            <w:r>
-              <w:t xml:space="preserve">Figures 2 and 3; 20/20 injected check-ins visible within 30 s (Section 6.5)</w:t>
+            <w:tcW w:type="dxa" w:w="3781"/>
+          </w:tcPr>
+          <w:p>
+            <w:pPr>
+              <w:pStyle w:val="Compact"/>
+              <w:jc w:val="left"/>
+            </w:pPr>
+            <w:r>
+              <w:t xml:space="preserve">Built, as near-real-time: a 30 s poll by design rather than a live stream; freshness within 30 s held in the recorded run but is not guaranteed by design</w:t>
+            </w:r>
+          </w:p>
+        </w:tc>
+        <w:tc>
+          <w:tcPr>
+            <w:tcW w:type="dxa" w:w="3629"/>
+          </w:tcPr>
+          <w:p>
+            <w:pPr>
+              <w:pStyle w:val="Compact"/>
+              <w:jc w:val="left"/>
+            </w:pPr>
+            <w:r>
+              <w:t xml:space="preserve">Figures 2 and 3; 20/20 within 30 s in the recorded run, 19/20 in a rerun, measured with a poller rather than the app (Section 6.5)</w:t>
             </w:r>
           </w:p>
         </w:tc>
@@ -12860,7 +13082,7 @@
       <w:tr>
         <w:tc>
           <w:tcPr>
-            <w:tcW w:type="dxa" w:w="2100"/>
+            <w:tcW w:type="dxa" w:w="1950"/>
           </w:tcPr>
           <w:p>
             <w:pPr>
@@ -12874,29 +13096,29 @@
         </w:tc>
         <w:tc>
           <w:tcPr>
-            <w:tcW w:type="dxa" w:w="4422"/>
-          </w:tcPr>
-          <w:p>
-            <w:pPr>
-              <w:pStyle w:val="Compact"/>
-              <w:jc w:val="left"/>
-            </w:pPr>
-            <w:r>
-              <w:t xml:space="preserve">Met</w:t>
-            </w:r>
-          </w:p>
-        </w:tc>
-        <w:tc>
-          <w:tcPr>
-            <w:tcW w:type="dxa" w:w="2837"/>
-          </w:tcPr>
-          <w:p>
-            <w:pPr>
-              <w:pStyle w:val="Compact"/>
-              <w:jc w:val="left"/>
-            </w:pPr>
-            <w:r>
-              <w:t xml:space="preserve">Section 6.2 and the concurrency experiment; cross-category independence 20/20</w:t>
+            <w:tcW w:type="dxa" w:w="3781"/>
+          </w:tcPr>
+          <w:p>
+            <w:pPr>
+              <w:pStyle w:val="Compact"/>
+              <w:jc w:val="left"/>
+            </w:pPr>
+            <w:r>
+              <w:t xml:space="preserve">Met at the API; in the app, shown end to end once on an emulator with manual token entry, camera reading not shown</w:t>
+            </w:r>
+          </w:p>
+        </w:tc>
+        <w:tc>
+          <w:tcPr>
+            <w:tcW w:type="dxa" w:w="3629"/>
+          </w:tcPr>
+          <w:p>
+            <w:pPr>
+              <w:pStyle w:val="Compact"/>
+              <w:jc w:val="left"/>
+            </w:pPr>
+            <w:r>
+              <w:t xml:space="preserve">Section 6.2 and the concurrency experiment; cross-category independence 20/20; Figures 7, 9 and 10 and validation document Section 11</w:t>
             </w:r>
           </w:p>
         </w:tc>
@@ -12904,7 +13126,7 @@
       <w:tr>
         <w:tc>
           <w:tcPr>
-            <w:tcW w:type="dxa" w:w="2100"/>
+            <w:tcW w:type="dxa" w:w="1950"/>
           </w:tcPr>
           <w:p>
             <w:pPr>
@@ -12918,7 +13140,7 @@
         </w:tc>
         <w:tc>
           <w:tcPr>
-            <w:tcW w:type="dxa" w:w="4422"/>
+            <w:tcW w:type="dxa" w:w="3781"/>
           </w:tcPr>
           <w:p>
             <w:pPr>
@@ -12932,7 +13154,7 @@
         </w:tc>
         <w:tc>
           <w:tcPr>
-            <w:tcW w:type="dxa" w:w="2837"/>
+            <w:tcW w:type="dxa" w:w="3629"/>
           </w:tcPr>
           <w:p>
             <w:pPr>
@@ -12948,7 +13170,7 @@
       <w:tr>
         <w:tc>
           <w:tcPr>
-            <w:tcW w:type="dxa" w:w="2100"/>
+            <w:tcW w:type="dxa" w:w="1950"/>
           </w:tcPr>
           <w:p>
             <w:pPr>
@@ -12962,7 +13184,7 @@
         </w:tc>
         <w:tc>
           <w:tcPr>
-            <w:tcW w:type="dxa" w:w="4422"/>
+            <w:tcW w:type="dxa" w:w="3781"/>
           </w:tcPr>
           <w:p>
             <w:pPr>
@@ -12976,7 +13198,7 @@
         </w:tc>
         <w:tc>
           <w:tcPr>
-            <w:tcW w:type="dxa" w:w="2837"/>
+            <w:tcW w:type="dxa" w:w="3629"/>
           </w:tcPr>
           <w:p>
             <w:pPr>
@@ -12992,7 +13214,7 @@
       <w:tr>
         <w:tc>
           <w:tcPr>
-            <w:tcW w:type="dxa" w:w="2100"/>
+            <w:tcW w:type="dxa" w:w="1950"/>
           </w:tcPr>
           <w:p>
             <w:pPr>
@@ -13006,7 +13228,7 @@
         </w:tc>
         <w:tc>
           <w:tcPr>
-            <w:tcW w:type="dxa" w:w="4422"/>
+            <w:tcW w:type="dxa" w:w="3781"/>
           </w:tcPr>
           <w:p>
             <w:pPr>
@@ -13020,15 +13242,30 @@
         </w:tc>
         <w:tc>
           <w:tcPr>
-            <w:tcW w:type="dxa" w:w="2837"/>
-          </w:tcPr>
-          <w:p>
-            <w:pPr>
-              <w:pStyle w:val="Compact"/>
-              <w:jc w:val="left"/>
-            </w:pPr>
-            <w:r>
-              <w:t xml:space="preserve">All four exports equal to direct SQL (Section 6.6)</w:t>
+            <w:tcW w:type="dxa" w:w="3629"/>
+          </w:tcPr>
+          <w:p>
+            <w:pPr>
+              <w:pStyle w:val="Compact"/>
+              <w:jc w:val="left"/>
+            </w:pPr>
+            <w:r>
+              <w:t xml:space="preserve">All four exports equal to direct SQL (Section 6.6);</w:t>
+            </w:r>
+            <w:r>
+              <w:t xml:space="preserve"> </w:t>
+            </w:r>
+            <w:r>
+              <w:rPr>
+                <w:rStyle w:val="VerbatimChar"/>
+              </w:rPr>
+              <w:t xml:space="preserve">notifications.csv</w:t>
+            </w:r>
+            <w:r>
+              <w:t xml:space="preserve"> </w:t>
+            </w:r>
+            <w:r>
+              <w:t xml:space="preserve">was 0 against 0 in the run and is checked by a unit test</w:t>
             </w:r>
           </w:p>
         </w:tc>
@@ -13036,7 +13273,7 @@
       <w:tr>
         <w:tc>
           <w:tcPr>
-            <w:tcW w:type="dxa" w:w="2100"/>
+            <w:tcW w:type="dxa" w:w="1950"/>
           </w:tcPr>
           <w:p>
             <w:pPr>
@@ -13050,7 +13287,7 @@
         </w:tc>
         <w:tc>
           <w:tcPr>
-            <w:tcW w:type="dxa" w:w="4422"/>
+            <w:tcW w:type="dxa" w:w="3781"/>
           </w:tcPr>
           <w:p>
             <w:pPr>
@@ -13064,7 +13301,7 @@
         </w:tc>
         <w:tc>
           <w:tcPr>
-            <w:tcW w:type="dxa" w:w="2837"/>
+            <w:tcW w:type="dxa" w:w="3629"/>
           </w:tcPr>
           <w:p>
             <w:pPr>
@@ -13080,7 +13317,7 @@
       <w:tr>
         <w:tc>
           <w:tcPr>
-            <w:tcW w:type="dxa" w:w="2100"/>
+            <w:tcW w:type="dxa" w:w="1950"/>
           </w:tcPr>
           <w:p>
             <w:pPr>
@@ -13094,7 +13331,7 @@
         </w:tc>
         <w:tc>
           <w:tcPr>
-            <w:tcW w:type="dxa" w:w="4422"/>
+            <w:tcW w:type="dxa" w:w="3781"/>
           </w:tcPr>
           <w:p>
             <w:pPr>
@@ -13108,7 +13345,7 @@
         </w:tc>
         <w:tc>
           <w:tcPr>
-            <w:tcW w:type="dxa" w:w="2837"/>
+            <w:tcW w:type="dxa" w:w="3629"/>
           </w:tcPr>
           <w:p>
             <w:pPr>
@@ -14090,13 +14327,13 @@
         <w:t xml:space="preserve">Appendix A. Artificial intelligence usage disclosure</w:t>
       </w:r>
     </w:p>
-    <w:bookmarkStart w:id="60" w:name="a1-purpose-and-scope"/>
+    <w:bookmarkStart w:id="60" w:name="a1-tool-and-scope"/>
     <w:p>
       <w:pPr>
         <w:pStyle w:val="Heading2"/>
       </w:pPr>
       <w:r>
-        <w:t xml:space="preserve">A.1 Purpose and scope</w:t>
+        <w:t xml:space="preserve">A.1 Tool and scope</w:t>
       </w:r>
     </w:p>
     <w:p>
@@ -14104,47 +14341,35 @@
         <w:pStyle w:val="FirstParagraph"/>
       </w:pPr>
       <w:r>
-        <w:t xml:space="preserve">This appendix discloses the use of artificial intelligence tools during this</w:t>
-      </w:r>
-      <w:r>
-        <w:t xml:space="preserve"> </w:t>
-      </w:r>
-      <w:r>
-        <w:t xml:space="preserve">project, as committed to in Section 9 of the project proposal. The one tool</w:t>
-      </w:r>
-      <w:r>
-        <w:t xml:space="preserve"> </w:t>
-      </w:r>
-      <w:r>
-        <w:t xml:space="preserve">used was Claude (Anthropic), through Claude Code. The proposal limited AI</w:t>
-      </w:r>
-      <w:r>
-        <w:t xml:space="preserve"> </w:t>
-      </w:r>
-      <w:r>
-        <w:t xml:space="preserve">assistance to boilerplate generation, proofreading and questions about</w:t>
-      </w:r>
-      <w:r>
-        <w:t xml:space="preserve"> </w:t>
-      </w:r>
-      <w:r>
-        <w:t xml:space="preserve">library APIs and language syntax. The use described in A.3 went beyond that</w:t>
-      </w:r>
-      <w:r>
-        <w:t xml:space="preserve"> </w:t>
-      </w:r>
-      <w:r>
-        <w:t xml:space="preserve">scope and is disclosed here as such.</w:t>
+        <w:t xml:space="preserve">The one AI tool used was Claude (Anthropic), through Claude Code. The proposal</w:t>
+      </w:r>
+      <w:r>
+        <w:t xml:space="preserve"> </w:t>
+      </w:r>
+      <w:r>
+        <w:t xml:space="preserve">limited AI help to boilerplate, proofreading and questions about library APIs</w:t>
+      </w:r>
+      <w:r>
+        <w:t xml:space="preserve"> </w:t>
+      </w:r>
+      <w:r>
+        <w:t xml:space="preserve">and syntax. That held until 30 September 2026. The work after the</w:t>
+      </w:r>
+      <w:r>
+        <w:t xml:space="preserve"> </w:t>
+      </w:r>
+      <w:r>
+        <w:t xml:space="preserve">supervisor's comments, from 7 October, went beyond it, and is set out in A.3.</w:t>
       </w:r>
     </w:p>
     <w:bookmarkEnd w:id="60"/>
-    <w:bookmarkStart w:id="61" w:name="X887074dc4b10378fb437fb2d3cea2a9398ba86c"/>
+    <w:bookmarkStart w:id="61" w:name="a2-to-30-september-2026"/>
     <w:p>
       <w:pPr>
         <w:pStyle w:val="Heading2"/>
       </w:pPr>
       <w:r>
-        <w:t xml:space="preserve">A.2 Before the supervisor's comments (to 30 September 2026)</w:t>
+        <w:t xml:space="preserve">A.2 To 30 September 2026</w:t>
       </w:r>
     </w:p>
     <w:tbl>
@@ -14154,8 +14379,8 @@
         <w:tblLook w:firstRow="1" w:lastRow="0" w:firstColumn="0" w:lastColumn="0" w:noHBand="0" w:noVBand="0" w:val="0020"/>
       </w:tblPr>
       <w:tblGrid>
-        <w:gridCol w:w="4804"/>
-        <w:gridCol w:w="4555"/>
+        <w:gridCol w:w="5014"/>
+        <w:gridCol w:w="4345"/>
       </w:tblGrid>
       <w:tr>
         <w:trPr>
@@ -14163,21 +14388,21 @@
         </w:trPr>
         <w:tc>
           <w:tcPr>
-            <w:tcW w:type="dxa" w:w="4804"/>
-          </w:tcPr>
-          <w:p>
-            <w:pPr>
-              <w:pStyle w:val="Compact"/>
-              <w:jc w:val="left"/>
-            </w:pPr>
-            <w:r>
-              <w:t xml:space="preserve">Phase</w:t>
-            </w:r>
-          </w:p>
-        </w:tc>
-        <w:tc>
-          <w:tcPr>
-            <w:tcW w:type="dxa" w:w="4555"/>
+            <w:tcW w:type="dxa" w:w="5014"/>
+          </w:tcPr>
+          <w:p>
+            <w:pPr>
+              <w:pStyle w:val="Compact"/>
+              <w:jc w:val="left"/>
+            </w:pPr>
+            <w:r>
+              <w:t xml:space="preserve">Work</w:t>
+            </w:r>
+          </w:p>
+        </w:tc>
+        <w:tc>
+          <w:tcPr>
+            <w:tcW w:type="dxa" w:w="4345"/>
           </w:tcPr>
           <w:p>
             <w:pPr>
@@ -14193,29 +14418,29 @@
       <w:tr>
         <w:tc>
           <w:tcPr>
-            <w:tcW w:type="dxa" w:w="4804"/>
-          </w:tcPr>
-          <w:p>
-            <w:pPr>
-              <w:pStyle w:val="Compact"/>
-              <w:jc w:val="left"/>
-            </w:pPr>
-            <w:r>
-              <w:t xml:space="preserve">Backend (Laravel API)</w:t>
-            </w:r>
-          </w:p>
-        </w:tc>
-        <w:tc>
-          <w:tcPr>
-            <w:tcW w:type="dxa" w:w="4555"/>
-          </w:tcPr>
-          <w:p>
-            <w:pPr>
-              <w:pStyle w:val="Compact"/>
-              <w:jc w:val="left"/>
-            </w:pPr>
-            <w:r>
-              <w:t xml:space="preserve">Within the proposal's scope: boilerplate and questions about library APIs</w:t>
+            <w:tcW w:type="dxa" w:w="5014"/>
+          </w:tcPr>
+          <w:p>
+            <w:pPr>
+              <w:pStyle w:val="Compact"/>
+              <w:jc w:val="left"/>
+            </w:pPr>
+            <w:r>
+              <w:t xml:space="preserve">Backend and Flutter application</w:t>
+            </w:r>
+          </w:p>
+        </w:tc>
+        <w:tc>
+          <w:tcPr>
+            <w:tcW w:type="dxa" w:w="4345"/>
+          </w:tcPr>
+          <w:p>
+            <w:pPr>
+              <w:pStyle w:val="Compact"/>
+              <w:jc w:val="left"/>
+            </w:pPr>
+            <w:r>
+              <w:t xml:space="preserve">Boilerplate and questions about library APIs</w:t>
             </w:r>
           </w:p>
         </w:tc>
@@ -14223,45 +14448,15 @@
       <w:tr>
         <w:tc>
           <w:tcPr>
-            <w:tcW w:type="dxa" w:w="4804"/>
-          </w:tcPr>
-          <w:p>
-            <w:pPr>
-              <w:pStyle w:val="Compact"/>
-              <w:jc w:val="left"/>
-            </w:pPr>
-            <w:r>
-              <w:t xml:space="preserve">Flutter application</w:t>
-            </w:r>
-          </w:p>
-        </w:tc>
-        <w:tc>
-          <w:tcPr>
-            <w:tcW w:type="dxa" w:w="4555"/>
-          </w:tcPr>
-          <w:p>
-            <w:pPr>
-              <w:pStyle w:val="Compact"/>
-              <w:jc w:val="left"/>
-            </w:pPr>
-            <w:r>
-              <w:t xml:space="preserve">Within the proposal's scope: boilerplate and questions about library APIs</w:t>
-            </w:r>
-          </w:p>
-        </w:tc>
-      </w:tr>
-      <w:tr>
-        <w:tc>
-          <w:tcPr>
-            <w:tcW w:type="dxa" w:w="4804"/>
-          </w:tcPr>
-          <w:p>
-            <w:pPr>
-              <w:pStyle w:val="Compact"/>
-              <w:jc w:val="left"/>
-            </w:pPr>
-            <w:r>
-              <w:t xml:space="preserve">Strict review and verification pass (</w:t>
+            <w:tcW w:type="dxa" w:w="5014"/>
+          </w:tcPr>
+          <w:p>
+            <w:pPr>
+              <w:pStyle w:val="Compact"/>
+              <w:jc w:val="left"/>
+            </w:pPr>
+            <w:r>
+              <w:t xml:space="preserve">Strict review (</w:t>
             </w:r>
             <w:r>
               <w:rPr>
@@ -14270,21 +14465,21 @@
               <w:t xml:space="preserve">docs/STRICT-REVIEW.md</w:t>
             </w:r>
             <w:r>
-              <w:t xml:space="preserve">, Appendix B)</w:t>
-            </w:r>
-          </w:p>
-        </w:tc>
-        <w:tc>
-          <w:tcPr>
-            <w:tcW w:type="dxa" w:w="4555"/>
-          </w:tcPr>
-          <w:p>
-            <w:pPr>
-              <w:pStyle w:val="Compact"/>
-              <w:jc w:val="left"/>
-            </w:pPr>
-            <w:r>
-              <w:t xml:space="preserve">Carried out by the student, with assistance from Claude</w:t>
+              <w:t xml:space="preserve">) and evaluation tooling</w:t>
+            </w:r>
+          </w:p>
+        </w:tc>
+        <w:tc>
+          <w:tcPr>
+            <w:tcW w:type="dxa" w:w="4345"/>
+          </w:tcPr>
+          <w:p>
+            <w:pPr>
+              <w:pStyle w:val="Compact"/>
+              <w:jc w:val="left"/>
+            </w:pPr>
+            <w:r>
+              <w:t xml:space="preserve">Written by the student, with help from Claude</w:t>
             </w:r>
           </w:p>
         </w:tc>
@@ -14292,72 +14487,21 @@
       <w:tr>
         <w:tc>
           <w:tcPr>
-            <w:tcW w:type="dxa" w:w="4804"/>
-          </w:tcPr>
-          <w:p>
-            <w:pPr>
-              <w:pStyle w:val="Compact"/>
-              <w:jc w:val="left"/>
-            </w:pPr>
-            <w:r>
-              <w:t xml:space="preserve">Evaluation tooling (</w:t>
-            </w:r>
-            <w:r>
-              <w:rPr>
-                <w:rStyle w:val="VerbatimChar"/>
-              </w:rPr>
-              <w:t xml:space="preserve">tools/run-evaluation.py</w:t>
-            </w:r>
-            <w:r>
-              <w:t xml:space="preserve">,</w:t>
-            </w:r>
-            <w:r>
-              <w:t xml:space="preserve"> </w:t>
-            </w:r>
-            <w:r>
-              <w:rPr>
-                <w:rStyle w:val="VerbatimChar"/>
-              </w:rPr>
-              <w:t xml:space="preserve">tools/seed-evaluation-event.php</w:t>
-            </w:r>
-            <w:r>
-              <w:t xml:space="preserve">)</w:t>
-            </w:r>
-          </w:p>
-        </w:tc>
-        <w:tc>
-          <w:tcPr>
-            <w:tcW w:type="dxa" w:w="4555"/>
-          </w:tcPr>
-          <w:p>
-            <w:pPr>
-              <w:pStyle w:val="Compact"/>
-              <w:jc w:val="left"/>
-            </w:pPr>
-            <w:r>
-              <w:t xml:space="preserve">Written by the student, with assistance from Claude</w:t>
-            </w:r>
-          </w:p>
-        </w:tc>
-      </w:tr>
-      <w:tr>
-        <w:tc>
-          <w:tcPr>
-            <w:tcW w:type="dxa" w:w="4804"/>
-          </w:tcPr>
-          <w:p>
-            <w:pPr>
-              <w:pStyle w:val="Compact"/>
-              <w:jc w:val="left"/>
-            </w:pPr>
-            <w:r>
-              <w:t xml:space="preserve">Report and validation document text</w:t>
-            </w:r>
-          </w:p>
-        </w:tc>
-        <w:tc>
-          <w:tcPr>
-            <w:tcW w:type="dxa" w:w="4555"/>
+            <w:tcW w:type="dxa" w:w="5014"/>
+          </w:tcPr>
+          <w:p>
+            <w:pPr>
+              <w:pStyle w:val="Compact"/>
+              <w:jc w:val="left"/>
+            </w:pPr>
+            <w:r>
+              <w:t xml:space="preserve">Report and validation document</w:t>
+            </w:r>
+          </w:p>
+        </w:tc>
+        <w:tc>
+          <w:tcPr>
+            <w:tcW w:type="dxa" w:w="4345"/>
           </w:tcPr>
           <w:p>
             <w:pPr>
@@ -14372,13 +14516,13 @@
       </w:tr>
     </w:tbl>
     <w:bookmarkEnd w:id="61"/>
-    <w:bookmarkStart w:id="62" w:name="X53458b4faa1b701be95513ac12813663fbb3c73"/>
+    <w:bookmarkStart w:id="62" w:name="a3-from-7-october-2026"/>
     <w:p>
       <w:pPr>
         <w:pStyle w:val="Heading2"/>
       </w:pPr>
       <w:r>
-        <w:t xml:space="preserve">A.3 After the supervisor's comments (7 to 10 October 2026)</w:t>
+        <w:t xml:space="preserve">A.3 From 7 October 2026</w:t>
       </w:r>
     </w:p>
     <w:p>
@@ -14386,19 +14530,7 @@
         <w:pStyle w:val="FirstParagraph"/>
       </w:pPr>
       <w:r>
-        <w:t xml:space="preserve">Claude did substantial work in this round, and it is set out here in full.</w:t>
-      </w:r>
-      <w:r>
-        <w:t xml:space="preserve"> </w:t>
-      </w:r>
-      <w:r>
-        <w:t xml:space="preserve">Working from the supervisor's comments on the report, the validation document</w:t>
-      </w:r>
-      <w:r>
-        <w:t xml:space="preserve"> </w:t>
-      </w:r>
-      <w:r>
-        <w:t xml:space="preserve">and the proposal, it:</w:t>
+        <w:t xml:space="preserve">Working from the supervisor's comments, Claude:</w:t>
       </w:r>
     </w:p>
     <w:p>
@@ -14410,31 +14542,31 @@
         </w:numPr>
       </w:pPr>
       <w:r>
-        <w:t xml:space="preserve">wrote most of the code changes and their tests: the authorisation fixes and</w:t>
-      </w:r>
-      <w:r>
-        <w:t xml:space="preserve"> </w:t>
-      </w:r>
-      <w:r>
-        <w:t xml:space="preserve">their negative tests, the 409 handling and row locks on the meal, session and</w:t>
-      </w:r>
-      <w:r>
-        <w:t xml:space="preserve"> </w:t>
-      </w:r>
-      <w:r>
-        <w:t xml:space="preserve">check-in scan paths, the restrictions on the redemption record, chunked CSV</w:t>
-      </w:r>
-      <w:r>
-        <w:t xml:space="preserve"> </w:t>
-      </w:r>
-      <w:r>
-        <w:t xml:space="preserve">exports, the Firebase demo-mode and dispatch changes, and the two offline</w:t>
-      </w:r>
-      <w:r>
-        <w:t xml:space="preserve"> </w:t>
-      </w:r>
-      <w:r>
-        <w:t xml:space="preserve">replay fixes with their Flutter tests;</w:t>
+        <w:t xml:space="preserve">wrote most of the code changes and their tests: the access-control fixes,</w:t>
+      </w:r>
+      <w:r>
+        <w:t xml:space="preserve"> </w:t>
+      </w:r>
+      <w:r>
+        <w:t xml:space="preserve">the 409 handling and row locks on the scan paths, chunked exports, the</w:t>
+      </w:r>
+      <w:r>
+        <w:t xml:space="preserve"> </w:t>
+      </w:r>
+      <w:r>
+        <w:t xml:space="preserve">Firebase demo-mode and dispatch changes, the offline replay fixes, and,</w:t>
+      </w:r>
+      <w:r>
+        <w:t xml:space="preserve"> </w:t>
+      </w:r>
+      <w:r>
+        <w:t xml:space="preserve">on 14 October, the attendee's My meals screen and the offline meal-scan</w:t>
+      </w:r>
+      <w:r>
+        <w:t xml:space="preserve"> </w:t>
+      </w:r>
+      <w:r>
+        <w:t xml:space="preserve">message;</w:t>
       </w:r>
     </w:p>
     <w:p>
@@ -14446,49 +14578,13 @@
         </w:numPr>
       </w:pPr>
       <w:r>
-        <w:t xml:space="preserve">wrote and ran the concurrency experiment (</w:t>
-      </w:r>
-      <w:r>
-        <w:rPr>
-          <w:rStyle w:val="VerbatimChar"/>
-        </w:rPr>
-        <w:t xml:space="preserve">tools/run-concurrency-experiment.py</w:t>
-      </w:r>
-      <w:r>
-        <w:t xml:space="preserve">),</w:t>
-      </w:r>
-      <w:r>
-        <w:t xml:space="preserve"> </w:t>
-      </w:r>
-      <w:r>
-        <w:t xml:space="preserve">the dashboard freshness measurement (</w:t>
-      </w:r>
-      <w:r>
-        <w:rPr>
-          <w:rStyle w:val="VerbatimChar"/>
-        </w:rPr>
-        <w:t xml:space="preserve">tools/measure-dashboard-freshness.py</w:t>
-      </w:r>
-      <w:r>
-        <w:t xml:space="preserve">)</w:t>
-      </w:r>
-      <w:r>
-        <w:t xml:space="preserve"> </w:t>
-      </w:r>
-      <w:r>
-        <w:t xml:space="preserve">and the SQL export checks added to</w:t>
-      </w:r>
-      <w:r>
-        <w:t xml:space="preserve"> </w:t>
-      </w:r>
-      <w:r>
-        <w:rPr>
-          <w:rStyle w:val="VerbatimChar"/>
-        </w:rPr>
-        <w:t xml:space="preserve">tools/run-evaluation.py</w:t>
-      </w:r>
-      <w:r>
-        <w:t xml:space="preserve">;</w:t>
+        <w:t xml:space="preserve">designed, wrote and ran the concurrency experiment and the freshness</w:t>
+      </w:r>
+      <w:r>
+        <w:t xml:space="preserve"> </w:t>
+      </w:r>
+      <w:r>
+        <w:t xml:space="preserve">measurement, and added the SQL export checks;</w:t>
       </w:r>
     </w:p>
     <w:p>
@@ -14500,13 +14596,7 @@
         </w:numPr>
       </w:pPr>
       <w:r>
-        <w:t xml:space="preserve">drafted the revised text of this report and of the validation document,</w:t>
-      </w:r>
-      <w:r>
-        <w:t xml:space="preserve"> </w:t>
-      </w:r>
-      <w:r>
-        <w:t xml:space="preserve">including this appendix, and</w:t>
+        <w:t xml:space="preserve">wrote</w:t>
       </w:r>
       <w:r>
         <w:t xml:space="preserve"> </w:t>
@@ -14515,10 +14605,28 @@
         <w:rPr>
           <w:rStyle w:val="VerbatimChar"/>
         </w:rPr>
-        <w:t xml:space="preserve">docs/remaining_work.md</w:t>
-      </w:r>
-      <w:r>
-        <w:t xml:space="preserve">.</w:t>
+        <w:t xml:space="preserve">tools/build_proposal_v4.py</w:t>
+      </w:r>
+      <w:r>
+        <w:t xml:space="preserve">, which builds the proposal v4 documents;</w:t>
+      </w:r>
+    </w:p>
+    <w:p>
+      <w:pPr>
+        <w:pStyle w:val="Compact"/>
+        <w:numPr>
+          <w:ilvl w:val="0"/>
+          <w:numId w:val="1003"/>
+        </w:numPr>
+      </w:pPr>
+      <w:r>
+        <w:t xml:space="preserve">drafted the revised text of this report, the validation document and the</w:t>
+      </w:r>
+      <w:r>
+        <w:t xml:space="preserve"> </w:t>
+      </w:r>
+      <w:r>
+        <w:t xml:space="preserve">proposal v4.</w:t>
       </w:r>
     </w:p>
     <w:p>
@@ -14526,25 +14634,163 @@
         <w:pStyle w:val="FirstParagraph"/>
       </w:pPr>
       <w:r>
-        <w:t xml:space="preserve">The student directed the work, decided what was changed and in what order,</w:t>
-      </w:r>
-      <w:r>
-        <w:t xml:space="preserve"> </w:t>
-      </w:r>
-      <w:r>
-        <w:t xml:space="preserve">reviewed each change before it was committed, and checked the test and</w:t>
-      </w:r>
-      <w:r>
-        <w:t xml:space="preserve"> </w:t>
-      </w:r>
-      <w:r>
-        <w:t xml:space="preserve">experiment results. Each commit from 7 October 2026 onwards in the repository</w:t>
-      </w:r>
-      <w:r>
-        <w:t xml:space="preserve"> </w:t>
-      </w:r>
-      <w:r>
-        <w:t xml:space="preserve">history corresponds to one of these changes, and</w:t>
+        <w:t xml:space="preserve">The student decided what to fix and in what order, reviewed each change before</w:t>
+      </w:r>
+      <w:r>
+        <w:t xml:space="preserve"> </w:t>
+      </w:r>
+      <w:r>
+        <w:t xml:space="preserve">committing it, and checked the test and experiment results. Each change is a</w:t>
+      </w:r>
+      <w:r>
+        <w:t xml:space="preserve"> </w:t>
+      </w:r>
+      <w:r>
+        <w:t xml:space="preserve">commit in the repository history.</w:t>
+      </w:r>
+    </w:p>
+    <w:p>
+      <w:pPr>
+        <w:pStyle w:val="BodyText"/>
+      </w:pPr>
+      <w:r>
+        <w:rPr>
+          <w:b/>
+          <w:bCs/>
+        </w:rPr>
+        <w:t xml:space="preserve">Representative prompts.</w:t>
+      </w:r>
+      <w:r>
+        <w:t xml:space="preserve"> </w:t>
+      </w:r>
+      <w:r>
+        <w:t xml:space="preserve">The student's instructions were short and</w:t>
+      </w:r>
+      <w:r>
+        <w:t xml:space="preserve"> </w:t>
+      </w:r>
+      <w:r>
+        <w:t xml:space="preserve">directed the work rather than specifying the code. Typical ones, quoted from</w:t>
+      </w:r>
+      <w:r>
+        <w:t xml:space="preserve"> </w:t>
+      </w:r>
+      <w:r>
+        <w:t xml:space="preserve">the session record:</w:t>
+      </w:r>
+    </w:p>
+    <w:p>
+      <w:pPr>
+        <w:pStyle w:val="Compact"/>
+        <w:numPr>
+          <w:ilvl w:val="0"/>
+          <w:numId w:val="1004"/>
+        </w:numPr>
+      </w:pPr>
+      <w:r>
+        <w:t xml:space="preserve">7 October: the supervisor's comments on the validation document, pasted in</w:t>
+      </w:r>
+      <w:r>
+        <w:t xml:space="preserve"> </w:t>
+      </w:r>
+      <w:r>
+        <w:t xml:space="preserve">full, followed by "what would we start with fixing", asking for small</w:t>
+      </w:r>
+      <w:r>
+        <w:t xml:space="preserve"> </w:t>
+      </w:r>
+      <w:r>
+        <w:t xml:space="preserve">commits.</w:t>
+      </w:r>
+    </w:p>
+    <w:p>
+      <w:pPr>
+        <w:pStyle w:val="Compact"/>
+        <w:numPr>
+          <w:ilvl w:val="0"/>
+          <w:numId w:val="1004"/>
+        </w:numPr>
+      </w:pPr>
+      <w:r>
+        <w:t xml:space="preserve">9 and 10 October: "do the next 6 commits" and "lets do another 6", each</w:t>
+      </w:r>
+      <w:r>
+        <w:t xml:space="preserve"> </w:t>
+      </w:r>
+      <w:r>
+        <w:t xml:space="preserve">working through the next items of the agreed fix list.</w:t>
+      </w:r>
+    </w:p>
+    <w:p>
+      <w:pPr>
+        <w:pStyle w:val="Compact"/>
+        <w:numPr>
+          <w:ilvl w:val="0"/>
+          <w:numId w:val="1004"/>
+        </w:numPr>
+      </w:pPr>
+      <w:r>
+        <w:t xml:space="preserve">10 October: "for the next things if they are things to do with the</w:t>
+      </w:r>
+      <w:r>
+        <w:t xml:space="preserve"> </w:t>
+      </w:r>
+      <w:r>
+        <w:t xml:space="preserve">validation report do them at once then generate word files".</w:t>
+      </w:r>
+    </w:p>
+    <w:p>
+      <w:pPr>
+        <w:pStyle w:val="Compact"/>
+        <w:numPr>
+          <w:ilvl w:val="0"/>
+          <w:numId w:val="1004"/>
+        </w:numPr>
+      </w:pPr>
+      <w:r>
+        <w:t xml:space="preserve">14 October: the supervisor's comments on the proposal, the report and the</w:t>
+      </w:r>
+      <w:r>
+        <w:t xml:space="preserve"> </w:t>
+      </w:r>
+      <w:r>
+        <w:t xml:space="preserve">validation document, pasted in full, followed by "work on everything he</w:t>
+      </w:r>
+      <w:r>
+        <w:t xml:space="preserve"> </w:t>
+      </w:r>
+      <w:r>
+        <w:t xml:space="preserve">wants us to".</w:t>
+      </w:r>
+    </w:p>
+    <w:bookmarkEnd w:id="62"/>
+    <w:bookmarkStart w:id="63" w:name="a4-how-the-output-was-checked"/>
+    <w:p>
+      <w:pPr>
+        <w:pStyle w:val="Heading2"/>
+      </w:pPr>
+      <w:r>
+        <w:t xml:space="preserve">A.4 How the output was checked</w:t>
+      </w:r>
+    </w:p>
+    <w:p>
+      <w:pPr>
+        <w:pStyle w:val="FirstParagraph"/>
+      </w:pPr>
+      <w:r>
+        <w:t xml:space="preserve">Each fix has a test that fails against the earlier code and passes now. The</w:t>
+      </w:r>
+      <w:r>
+        <w:t xml:space="preserve"> </w:t>
+      </w:r>
+      <w:r>
+        <w:t xml:space="preserve">concurrency experiment has a negative control, which failed as expected. The</w:t>
+      </w:r>
+      <w:r>
+        <w:t xml:space="preserve"> </w:t>
+      </w:r>
+      <w:r>
+        <w:t xml:space="preserve">backend tests, PHPStan, Pint,</w:t>
       </w:r>
       <w:r>
         <w:t xml:space="preserve"> </w:t>
@@ -14553,23 +14799,77 @@
         <w:rPr>
           <w:rStyle w:val="VerbatimChar"/>
         </w:rPr>
-        <w:t xml:space="preserve">docs/remaining_work.md</w:t>
-      </w:r>
-      <w:r>
-        <w:t xml:space="preserve"> </w:t>
-      </w:r>
-      <w:r>
-        <w:t xml:space="preserve">lists them with their dates.</w:t>
-      </w:r>
-    </w:p>
-    <w:bookmarkEnd w:id="62"/>
-    <w:bookmarkStart w:id="63" w:name="a4-validation-of-ai-assisted-output"/>
+        <w:t xml:space="preserve">flutter analyze</w:t>
+      </w:r>
+      <w:r>
+        <w:t xml:space="preserve"> </w:t>
+      </w:r>
+      <w:r>
+        <w:t xml:space="preserve">and</w:t>
+      </w:r>
+      <w:r>
+        <w:t xml:space="preserve"> </w:t>
+      </w:r>
+      <w:r>
+        <w:rPr>
+          <w:rStyle w:val="VerbatimChar"/>
+        </w:rPr>
+        <w:t xml:space="preserve">flutter test</w:t>
+      </w:r>
+      <w:r>
+        <w:t xml:space="preserve"> </w:t>
+      </w:r>
+      <w:r>
+        <w:t xml:space="preserve">were run</w:t>
+      </w:r>
+      <w:r>
+        <w:t xml:space="preserve"> </w:t>
+      </w:r>
+      <w:r>
+        <w:t xml:space="preserve">before each commit. The student is prepared to walk through</w:t>
+      </w:r>
+      <w:r>
+        <w:t xml:space="preserve"> </w:t>
+      </w:r>
+      <w:r>
+        <w:rPr>
+          <w:rStyle w:val="VerbatimChar"/>
+        </w:rPr>
+        <w:t xml:space="preserve">MealController::scanVoucher</w:t>
+      </w:r>
+      <w:r>
+        <w:t xml:space="preserve">,</w:t>
+      </w:r>
+      <w:r>
+        <w:t xml:space="preserve"> </w:t>
+      </w:r>
+      <w:r>
+        <w:rPr>
+          <w:rStyle w:val="VerbatimChar"/>
+        </w:rPr>
+        <w:t xml:space="preserve">tools/run-concurrency-experiment.py</w:t>
+      </w:r>
+      <w:r>
+        <w:t xml:space="preserve"> </w:t>
+      </w:r>
+      <w:r>
+        <w:t xml:space="preserve">and the</w:t>
+      </w:r>
+      <w:r>
+        <w:t xml:space="preserve"> </w:t>
+      </w:r>
+      <w:r>
+        <w:t xml:space="preserve">offline replay rules at the presentation.</w:t>
+      </w:r>
+    </w:p>
+    <w:bookmarkEnd w:id="63"/>
+    <w:bookmarkStart w:id="64" w:name="a5-gap-in-the-record"/>
     <w:p>
       <w:pPr>
         <w:pStyle w:val="Heading2"/>
       </w:pPr>
       <w:r>
-        <w:t xml:space="preserve">A.4 Validation of AI-assisted output</w:t>
+        <w:t xml:space="preserve">A.5 Gap in the record</w:t>
       </w:r>
     </w:p>
     <w:p>
@@ -14577,31 +14877,19 @@
         <w:pStyle w:val="FirstParagraph"/>
       </w:pPr>
       <w:r>
-        <w:t xml:space="preserve">AI-assisted code was validated through automated tests. For each defect fixed</w:t>
-      </w:r>
-      <w:r>
-        <w:t xml:space="preserve"> </w:t>
-      </w:r>
-      <w:r>
-        <w:t xml:space="preserve">in A.3, the test was run against the earlier code to confirm that it failed</w:t>
-      </w:r>
-      <w:r>
-        <w:t xml:space="preserve"> </w:t>
-      </w:r>
-      <w:r>
-        <w:t xml:space="preserve">there and passes now, so that it tests the fix rather than merely agreeing</w:t>
-      </w:r>
-      <w:r>
-        <w:t xml:space="preserve"> </w:t>
-      </w:r>
-      <w:r>
-        <w:t xml:space="preserve">with it. The concurrency experiment includes a negative control expected to</w:t>
-      </w:r>
-      <w:r>
-        <w:t xml:space="preserve"> </w:t>
-      </w:r>
-      <w:r>
-        <w:t xml:space="preserve">fail, which it did. The full backend suite, PHPStan at level 7, Pint,</w:t>
+        <w:t xml:space="preserve">The per-use AI log the proposal promised (Section 9.4) was not kept before</w:t>
+      </w:r>
+      <w:r>
+        <w:t xml:space="preserve"> </w:t>
+      </w:r>
+      <w:r>
+        <w:t xml:space="preserve">October. A.2 is the student's own account of that period. From October, the</w:t>
+      </w:r>
+      <w:r>
+        <w:t xml:space="preserve"> </w:t>
+      </w:r>
+      <w:r>
+        <w:t xml:space="preserve">commit history and</w:t>
       </w:r>
       <w:r>
         <w:t xml:space="preserve"> </w:t>
@@ -14610,157 +14898,13 @@
         <w:rPr>
           <w:rStyle w:val="VerbatimChar"/>
         </w:rPr>
-        <w:t xml:space="preserve">flutter analyze</w:t>
-      </w:r>
-      <w:r>
-        <w:t xml:space="preserve"> </w:t>
-      </w:r>
-      <w:r>
-        <w:t xml:space="preserve">and</w:t>
-      </w:r>
-      <w:r>
-        <w:t xml:space="preserve"> </w:t>
-      </w:r>
-      <w:r>
-        <w:rPr>
-          <w:rStyle w:val="VerbatimChar"/>
-        </w:rPr>
-        <w:t xml:space="preserve">flutter test</w:t>
-      </w:r>
-      <w:r>
-        <w:t xml:space="preserve"> </w:t>
-      </w:r>
-      <w:r>
-        <w:t xml:space="preserve">were run before every commit. The student</w:t>
-      </w:r>
-      <w:r>
-        <w:t xml:space="preserve"> </w:t>
-      </w:r>
-      <w:r>
-        <w:t xml:space="preserve">is prepared to walk through</w:t>
-      </w:r>
-      <w:r>
-        <w:t xml:space="preserve"> </w:t>
-      </w:r>
-      <w:r>
-        <w:rPr>
-          <w:rStyle w:val="VerbatimChar"/>
-        </w:rPr>
-        <w:t xml:space="preserve">MealController::scanVoucher</w:t>
-      </w:r>
-      <w:r>
-        <w:t xml:space="preserve">,</w:t>
-      </w:r>
-      <w:r>
-        <w:t xml:space="preserve"> </w:t>
-      </w:r>
-      <w:r>
-        <w:rPr>
-          <w:rStyle w:val="VerbatimChar"/>
-        </w:rPr>
-        <w:t xml:space="preserve">NotificationDispatchService</w:t>
-      </w:r>
-      <w:r>
-        <w:t xml:space="preserve"> </w:t>
-      </w:r>
-      <w:r>
-        <w:t xml:space="preserve">and</w:t>
-      </w:r>
-      <w:r>
-        <w:t xml:space="preserve"> </w:t>
-      </w:r>
-      <w:r>
-        <w:rPr>
-          <w:rStyle w:val="VerbatimChar"/>
-        </w:rPr>
-        <w:t xml:space="preserve">tools/run-evaluation.py</w:t>
-      </w:r>
-      <w:r>
-        <w:t xml:space="preserve"> </w:t>
-      </w:r>
-      <w:r>
-        <w:t xml:space="preserve">in detail.</w:t>
-      </w:r>
-    </w:p>
-    <w:bookmarkEnd w:id="63"/>
-    <w:bookmarkStart w:id="64" w:name="Xf3e668b7ce58a97d6e3858656f09b2214a8128b"/>
-    <w:p>
-      <w:pPr>
-        <w:pStyle w:val="Heading2"/>
-      </w:pPr>
-      <w:r>
-        <w:t xml:space="preserve">A.5 Honest statement of disclosure limitations</w:t>
-      </w:r>
-    </w:p>
-    <w:p>
-      <w:pPr>
-        <w:pStyle w:val="FirstParagraph"/>
-      </w:pPr>
-      <w:r>
-        <w:t xml:space="preserve">The proposal commits, in Section 9.4, to a dedicated AI usage log recording</w:t>
-      </w:r>
-      <w:r>
-        <w:t xml:space="preserve"> </w:t>
-      </w:r>
-      <w:r>
-        <w:t xml:space="preserve">every instance of use, its date, the task posed, and the extent to which the</w:t>
-      </w:r>
-      <w:r>
-        <w:t xml:space="preserve"> </w:t>
-      </w:r>
-      <w:r>
-        <w:t xml:space="preserve">output was used, modified or rejected. That per-episode log was not</w:t>
-      </w:r>
-      <w:r>
-        <w:t xml:space="preserve"> </w:t>
-      </w:r>
-      <w:r>
-        <w:t xml:space="preserve">maintained during the phases in A.2, and A.2 is the student's own account of</w:t>
-      </w:r>
-      <w:r>
-        <w:t xml:space="preserve"> </w:t>
-      </w:r>
-      <w:r>
-        <w:t xml:space="preserve">them rather than a reconstruction of dated entries. For the work in A.3, the</w:t>
-      </w:r>
-      <w:r>
-        <w:t xml:space="preserve"> </w:t>
-      </w:r>
-      <w:r>
-        <w:t xml:space="preserve">commit history and</w:t>
-      </w:r>
-      <w:r>
-        <w:t xml:space="preserve"> </w:t>
-      </w:r>
-      <w:r>
-        <w:rPr>
-          <w:rStyle w:val="VerbatimChar"/>
-        </w:rPr>
-        <w:t xml:space="preserve">docs/remaining_work.md</w:t>
-      </w:r>
-      <w:r>
-        <w:t xml:space="preserve"> </w:t>
-      </w:r>
-      <w:r>
-        <w:t xml:space="preserve">are the record. A repository-level</w:t>
-      </w:r>
-      <w:r>
-        <w:t xml:space="preserve"> </w:t>
-      </w:r>
-      <w:r>
-        <w:t xml:space="preserve">note is kept at</w:t>
-      </w:r>
-      <w:r>
-        <w:t xml:space="preserve"> </w:t>
-      </w:r>
-      <w:r>
-        <w:rPr>
-          <w:rStyle w:val="VerbatimChar"/>
-        </w:rPr>
         <w:t xml:space="preserve">docs/ai_usage_log.md</w:t>
       </w:r>
       <w:r>
-        <w:t xml:space="preserve">.</w:t>
+        <w:t xml:space="preserve"> </w:t>
+      </w:r>
+      <w:r>
+        <w:t xml:space="preserve">are the record.</w:t>
       </w:r>
     </w:p>
     <w:bookmarkEnd w:id="64"/>
@@ -15475,25 +15619,19 @@
         <w:pStyle w:val="BodyText"/>
       </w:pPr>
       <w:r>
-        <w:t xml:space="preserve">Verification after fixes: backend 51/51 tests passing at the time of the strict</w:t>
-      </w:r>
-      <w:r>
-        <w:t xml:space="preserve"> </w:t>
-      </w:r>
-      <w:r>
-        <w:t xml:space="preserve">review (185 assertions), and 55/55 with 213 assertions at the time of this</w:t>
-      </w:r>
-      <w:r>
-        <w:t xml:space="preserve"> </w:t>
-      </w:r>
-      <w:r>
-        <w:t xml:space="preserve">report, the last two tests being the ones added for rows 7 and 8. PHPStan level</w:t>
-      </w:r>
-      <w:r>
-        <w:t xml:space="preserve"> </w:t>
-      </w:r>
-      <w:r>
-        <w:t xml:space="preserve">7 clean, Pint clean,</w:t>
+        <w:t xml:space="preserve">Verification after these fixes, at the time: backend 51/51 tests passing at</w:t>
+      </w:r>
+      <w:r>
+        <w:t xml:space="preserve"> </w:t>
+      </w:r>
+      <w:r>
+        <w:t xml:space="preserve">the strict review (185 assertions), then 55/55 with 213 assertions once the</w:t>
+      </w:r>
+      <w:r>
+        <w:t xml:space="preserve"> </w:t>
+      </w:r>
+      <w:r>
+        <w:t xml:space="preserve">tests for rows 7 and 8 were added; PHPStan level 7 clean, Pint clean,</w:t>
       </w:r>
       <w:r>
         <w:t xml:space="preserve"> </w:t>
@@ -15523,7 +15661,25 @@
         <w:t xml:space="preserve"> </w:t>
       </w:r>
       <w:r>
-        <w:t xml:space="preserve">19/19.</w:t>
+        <w:t xml:space="preserve">19/19. These are historical counts for</w:t>
+      </w:r>
+      <w:r>
+        <w:t xml:space="preserve"> </w:t>
+      </w:r>
+      <w:r>
+        <w:t xml:space="preserve">this table only. The October fixes added more tests since, and the current</w:t>
+      </w:r>
+      <w:r>
+        <w:t xml:space="preserve"> </w:t>
+      </w:r>
+      <w:r>
+        <w:t xml:space="preserve">counts are the ones in Section 6.1: 70 backend tests with 288 assertions, 31</w:t>
+      </w:r>
+      <w:r>
+        <w:t xml:space="preserve"> </w:t>
+      </w:r>
+      <w:r>
+        <w:t xml:space="preserve">of them this component's, and 30 of 30 Flutter tests.</w:t>
       </w:r>
     </w:p>
     <w:bookmarkEnd w:id="66"/>
@@ -20093,7 +20249,37 @@
         <w:pStyle w:val="BodyText"/>
       </w:pPr>
       <w:r>
-        <w:t xml:space="preserve">Backend test suite:</w:t>
+        <w:t xml:space="preserve">Backend test suite. Twelve of the starter kit's page tests need the frontend</w:t>
+      </w:r>
+      <w:r>
+        <w:t xml:space="preserve"> </w:t>
+      </w:r>
+      <w:r>
+        <w:t xml:space="preserve">built first, and the build calls</w:t>
+      </w:r>
+      <w:r>
+        <w:t xml:space="preserve"> </w:t>
+      </w:r>
+      <w:r>
+        <w:rPr>
+          <w:rStyle w:val="VerbatimChar"/>
+        </w:rPr>
+        <w:t xml:space="preserve">php artisan</w:t>
+      </w:r>
+      <w:r>
+        <w:t xml:space="preserve">, so PHP must be on</w:t>
+      </w:r>
+      <w:r>
+        <w:t xml:space="preserve"> </w:t>
+      </w:r>
+      <w:r>
+        <w:rPr>
+          <w:rStyle w:val="VerbatimChar"/>
+        </w:rPr>
+        <w:t xml:space="preserve">PATH</w:t>
+      </w:r>
+      <w:r>
+        <w:t xml:space="preserve">:</w:t>
       </w:r>
     </w:p>
     <w:p>
@@ -20104,6 +20290,24 @@
         <w:rPr>
           <w:rStyle w:val="VerbatimChar"/>
         </w:rPr>
+        <w:t xml:space="preserve">npm install</w:t>
+      </w:r>
+      <w:r>
+        <w:br/>
+      </w:r>
+      <w:r>
+        <w:rPr>
+          <w:rStyle w:val="VerbatimChar"/>
+        </w:rPr>
+        <w:t xml:space="preserve">npm run build</w:t>
+      </w:r>
+      <w:r>
+        <w:br/>
+      </w:r>
+      <w:r>
+        <w:rPr>
+          <w:rStyle w:val="VerbatimChar"/>
+        </w:rPr>
         <w:t xml:space="preserve">php artisan test</w:t>
       </w:r>
     </w:p>
@@ -20302,7 +20506,7 @@
       </w:r>
     </w:p>
     <w:bookmarkEnd w:id="68"/>
-    <w:bookmarkStart w:id="97" w:name="X3904e79689775bc93f65e393b9e8d9a787105b3"/>
+    <w:bookmarkStart w:id="100" w:name="X3904e79689775bc93f65e393b9e8d9a787105b3"/>
     <w:p>
       <w:pPr>
         <w:pStyle w:val="Heading1"/>
@@ -20725,7 +20929,7 @@
           <w:b/>
           <w:bCs/>
         </w:rPr>
-        <w:t xml:space="preserve">Figure 6. Attendee pass with a server-issued token (Objective 2).</w:t>
+        <w:t xml:space="preserve">Figure 6. Attendee check-in and session pass (not a meal voucher).</w:t>
       </w:r>
     </w:p>
     <w:p>
@@ -20780,31 +20984,31 @@
         <w:pStyle w:val="BodyText"/>
       </w:pPr>
       <w:r>
-        <w:t xml:space="preserve">The attendee's own pass, carrying a QR token fetched from the authenticated</w:t>
-      </w:r>
-      <w:r>
-        <w:t xml:space="preserve"> </w:t>
-      </w:r>
-      <w:r>
-        <w:t xml:space="preserve">endpoint rather than constructed on the device. This screen is the fix for the</w:t>
-      </w:r>
-      <w:r>
-        <w:t xml:space="preserve"> </w:t>
-      </w:r>
-      <w:r>
-        <w:t xml:space="preserve">second defect in Appendix B, where the code had previously been fabricated</w:t>
-      </w:r>
-      <w:r>
-        <w:t xml:space="preserve"> </w:t>
-      </w:r>
-      <w:r>
-        <w:t xml:space="preserve">client-side from a naming convention and would have broken for any attendee not</w:t>
-      </w:r>
-      <w:r>
-        <w:t xml:space="preserve"> </w:t>
-      </w:r>
-      <w:r>
-        <w:t xml:space="preserve">present in the seed data.</w:t>
+        <w:t xml:space="preserve">The attendee's own pass for event check-in and session doors, carrying a token</w:t>
+      </w:r>
+      <w:r>
+        <w:t xml:space="preserve"> </w:t>
+      </w:r>
+      <w:r>
+        <w:t xml:space="preserve">fetched from the authenticated endpoint rather than constructed on the device.</w:t>
+      </w:r>
+      <w:r>
+        <w:t xml:space="preserve"> </w:t>
+      </w:r>
+      <w:r>
+        <w:t xml:space="preserve">This screen is the fix for the second defect in Appendix B. It is not evidence</w:t>
+      </w:r>
+      <w:r>
+        <w:t xml:space="preserve"> </w:t>
+      </w:r>
+      <w:r>
+        <w:t xml:space="preserve">for Objective 2: the pass token is not a meal voucher, and the meal scanner</w:t>
+      </w:r>
+      <w:r>
+        <w:t xml:space="preserve"> </w:t>
+      </w:r>
+      <w:r>
+        <w:t xml:space="preserve">answers 404 "Invalid meal voucher QR token." to it, which is correct.</w:t>
       </w:r>
     </w:p>
     <w:p>
@@ -20819,7 +21023,7 @@
           <w:b/>
           <w:bCs/>
         </w:rPr>
-        <w:t xml:space="preserve">Figure 7. Meal categories and the per-device redemption trail (Objective 2).</w:t>
+        <w:t xml:space="preserve">Figure 7. The attendee's meal vouchers in the app (Objective 2).</w:t>
       </w:r>
     </w:p>
     <w:p>
@@ -20831,12 +21035,12 @@
           <wp:inline>
             <wp:extent cx="2674620" cy="5943600"/>
             <wp:effectExtent b="0" l="0" r="0" t="0"/>
-            <wp:docPr descr="Meals screen listing Breakfast, Lunch and Supper as active categories, with recent redemptions each tagged with the device that recorded them" title="" id="85" name="Picture"/>
+            <wp:docPr descr="My meals screen showing Supper as Unused with a QR code above the token MEAL-DEMO-1-3, and Lunch and Breakfast as Redeemed with their redemption times" title="" id="85" name="Picture"/>
             <a:graphic>
               <a:graphicData uri="http://schemas.openxmlformats.org/drawingml/2006/picture">
                 <pic:pic>
                   <pic:nvPicPr>
-                    <pic:cNvPr descr="../evidence-ui-meals.png" id="86" name="Picture"/>
+                    <pic:cNvPr descr="../evidence-ui-my-meals.png" id="86" name="Picture"/>
                     <pic:cNvPicPr>
                       <a:picLocks noChangeArrowheads="1" noChangeAspect="1"/>
                     </pic:cNvPicPr>
@@ -20874,19 +21078,76 @@
         <w:pStyle w:val="BodyText"/>
       </w:pPr>
       <w:r>
-        <w:t xml:space="preserve">Three categories active at once, which is Objective 2's multiple-category</w:t>
-      </w:r>
-      <w:r>
-        <w:t xml:space="preserve"> </w:t>
-      </w:r>
-      <w:r>
-        <w:t xml:space="preserve">requirement in the interface, and a redemption list in which each entry names</w:t>
-      </w:r>
-      <w:r>
-        <w:t xml:space="preserve"> </w:t>
-      </w:r>
-      <w:r>
-        <w:t xml:space="preserve">the device that recorded it, which is the audit trail Section 3.3 describes.</w:t>
+        <w:t xml:space="preserve">The My meals screen added on 14 October 2026. It shows each of the attendee's</w:t>
+      </w:r>
+      <w:r>
+        <w:t xml:space="preserve"> </w:t>
+      </w:r>
+      <w:r>
+        <w:t xml:space="preserve">vouchers from</w:t>
+      </w:r>
+      <w:r>
+        <w:t xml:space="preserve"> </w:t>
+      </w:r>
+      <w:r>
+        <w:rPr>
+          <w:rStyle w:val="VerbatimChar"/>
+        </w:rPr>
+        <w:t xml:space="preserve">GET /events/{event}/attendees/me</w:t>
+      </w:r>
+      <w:r>
+        <w:t xml:space="preserve"> </w:t>
+      </w:r>
+      <w:r>
+        <w:t xml:space="preserve">with its category and status.</w:t>
+      </w:r>
+      <w:r>
+        <w:t xml:space="preserve"> </w:t>
+      </w:r>
+      <w:r>
+        <w:t xml:space="preserve">An unused voucher is shown as a QR code of its</w:t>
+      </w:r>
+      <w:r>
+        <w:t xml:space="preserve"> </w:t>
+      </w:r>
+      <w:r>
+        <w:rPr>
+          <w:rStyle w:val="VerbatimChar"/>
+        </w:rPr>
+        <w:t xml:space="preserve">qr_token</w:t>
+      </w:r>
+      <w:r>
+        <w:t xml:space="preserve">; a redeemed one shows</w:t>
+      </w:r>
+      <w:r>
+        <w:t xml:space="preserve"> </w:t>
+      </w:r>
+      <w:r>
+        <w:t xml:space="preserve">when it was redeemed and no code. The QR code in this screenshot was decoded</w:t>
+      </w:r>
+      <w:r>
+        <w:t xml:space="preserve"> </w:t>
+      </w:r>
+      <w:r>
+        <w:t xml:space="preserve">off the device and reads</w:t>
+      </w:r>
+      <w:r>
+        <w:t xml:space="preserve"> </w:t>
+      </w:r>
+      <w:r>
+        <w:rPr>
+          <w:rStyle w:val="VerbatimChar"/>
+        </w:rPr>
+        <w:t xml:space="preserve">MEAL-DEMO-1-3</w:t>
+      </w:r>
+      <w:r>
+        <w:t xml:space="preserve">, the seeded Supper voucher used in</w:t>
+      </w:r>
+      <w:r>
+        <w:t xml:space="preserve"> </w:t>
+      </w:r>
+      <w:r>
+        <w:t xml:space="preserve">Figures 9 and 10.</w:t>
       </w:r>
     </w:p>
     <w:p>
@@ -20901,7 +21162,7 @@
           <w:b/>
           <w:bCs/>
         </w:rPr>
-        <w:t xml:space="preserve">Figure 8. Scanner accepting a voucher (Objective 2).</w:t>
+        <w:t xml:space="preserve">Figure 8. Meal categories and the per-device redemption trail (Objective 2).</w:t>
       </w:r>
     </w:p>
     <w:p>
@@ -20913,12 +21174,12 @@
           <wp:inline>
             <wp:extent cx="2674620" cy="5943600"/>
             <wp:effectExtent b="0" l="0" r="0" t="0"/>
-            <wp:docPr descr="Meal voucher scan screen with the token EVAL-SCAN-OK entered and a green confirmation reading &quot;Voucher redeemed successfully.&quot;" title="" id="88" name="Picture"/>
+            <wp:docPr descr="Meals screen listing Breakfast, Lunch and Supper as active categories, with recent redemptions each tagged with the device that recorded them" title="" id="88" name="Picture"/>
             <a:graphic>
               <a:graphicData uri="http://schemas.openxmlformats.org/drawingml/2006/picture">
                 <pic:pic>
                   <pic:nvPicPr>
-                    <pic:cNvPr descr="../evidence-scan-accepted.png" id="89" name="Picture"/>
+                    <pic:cNvPr descr="../evidence-ui-meals.png" id="89" name="Picture"/>
                     <pic:cNvPicPr>
                       <a:picLocks noChangeArrowheads="1" noChangeAspect="1"/>
                     </pic:cNvPicPr>
@@ -20954,6 +21215,26 @@
     <w:p>
       <w:pPr>
         <w:pStyle w:val="BodyText"/>
+      </w:pPr>
+      <w:r>
+        <w:t xml:space="preserve">Three categories active at once, which is Objective 2's multiple-category</w:t>
+      </w:r>
+      <w:r>
+        <w:t xml:space="preserve"> </w:t>
+      </w:r>
+      <w:r>
+        <w:t xml:space="preserve">requirement in the interface, and a redemption list in which each entry names</w:t>
+      </w:r>
+      <w:r>
+        <w:t xml:space="preserve"> </w:t>
+      </w:r>
+      <w:r>
+        <w:t xml:space="preserve">the device that recorded it, which is the audit trail Section 3.3 describes.</w:t>
+      </w:r>
+    </w:p>
+    <w:p>
+      <w:pPr>
+        <w:pStyle w:val="BodyText"/>
         <w:keepNext/>
         <w:keepLines/>
         <w:jc w:val="left"/>
@@ -20963,7 +21244,7 @@
           <w:b/>
           <w:bCs/>
         </w:rPr>
-        <w:t xml:space="preserve">Figure 9. The same voucher refused on a second attempt (Objective 2).</w:t>
+        <w:t xml:space="preserve">Figure 9. Scanner accepting the voucher from Figure 7 (Objective 2).</w:t>
       </w:r>
     </w:p>
     <w:p>
@@ -20975,12 +21256,12 @@
           <wp:inline>
             <wp:extent cx="2674620" cy="5943600"/>
             <wp:effectExtent b="0" l="0" r="0" t="0"/>
-            <wp:docPr descr="Meal voucher scan screen with the same token re-entered and a red banner reading &quot;Meal voucher has already been redeemed or is not usable.&quot;" title="" id="91" name="Picture"/>
+            <wp:docPr descr="Meal voucher scan screen with the token MEAL-DEMO-1-3 entered and a green confirmation reading &quot;Voucher redeemed successfully.&quot;" title="" id="91" name="Picture"/>
             <a:graphic>
               <a:graphicData uri="http://schemas.openxmlformats.org/drawingml/2006/picture">
                 <pic:pic>
                   <pic:nvPicPr>
-                    <pic:cNvPr descr="../evidence-scan-duplicate-rejected.png" id="92" name="Picture"/>
+                    <pic:cNvPr descr="../evidence-scan-accepted.png" id="92" name="Picture"/>
                     <pic:cNvPicPr>
                       <a:picLocks noChangeArrowheads="1" noChangeAspect="1"/>
                     </pic:cNvPicPr>
@@ -21016,32 +21297,6 @@
     <w:p>
       <w:pPr>
         <w:pStyle w:val="BodyText"/>
-      </w:pPr>
-      <w:r>
-        <w:t xml:space="preserve">Figures 8 and 9 are the anti-fraud guarantee at the point of service: the same</w:t>
-      </w:r>
-      <w:r>
-        <w:t xml:space="preserve"> </w:t>
-      </w:r>
-      <w:r>
-        <w:t xml:space="preserve">token accepted once and refused on its second presentation. The measurements in</w:t>
-      </w:r>
-      <w:r>
-        <w:t xml:space="preserve"> </w:t>
-      </w:r>
-      <w:r>
-        <w:t xml:space="preserve">Section 6.2 count this behaviour 120 times; these are what a scanner operator</w:t>
-      </w:r>
-      <w:r>
-        <w:t xml:space="preserve"> </w:t>
-      </w:r>
-      <w:r>
-        <w:t xml:space="preserve">sees when it happens.</w:t>
-      </w:r>
-    </w:p>
-    <w:p>
-      <w:pPr>
-        <w:pStyle w:val="BodyText"/>
         <w:keepNext/>
         <w:keepLines/>
         <w:jc w:val="left"/>
@@ -21051,7 +21306,7 @@
           <w:b/>
           <w:bCs/>
         </w:rPr>
-        <w:t xml:space="preserve">Figure 10. Report exports available to an organiser (Objective 5).</w:t>
+        <w:t xml:space="preserve">Figure 10. The same voucher refused on a second attempt (Objective 2).</w:t>
       </w:r>
     </w:p>
     <w:p>
@@ -21063,12 +21318,12 @@
           <wp:inline>
             <wp:extent cx="2674620" cy="5943600"/>
             <wp:effectExtent b="0" l="0" r="0" t="0"/>
-            <wp:docPr descr="Reports screen listing four exports: Attendance Report, Meal Redemption Report, Session Attendance Report and Notification Report" title="" id="94" name="Picture"/>
+            <wp:docPr descr="Meal voucher scan screen with MEAL-DEMO-1-3 entered again and a red banner reading &quot;Meal voucher has already been redeemed or is not usable.&quot;" title="" id="94" name="Picture"/>
             <a:graphic>
               <a:graphicData uri="http://schemas.openxmlformats.org/drawingml/2006/picture">
                 <pic:pic>
                   <pic:nvPicPr>
-                    <pic:cNvPr descr="../evidence-ui-reports.png" id="95" name="Picture"/>
+                    <pic:cNvPr descr="../evidence-scan-duplicate-rejected.png" id="95" name="Picture"/>
                     <pic:cNvPicPr>
                       <a:picLocks noChangeArrowheads="1" noChangeAspect="1"/>
                     </pic:cNvPicPr>
@@ -21106,6 +21361,106 @@
         <w:pStyle w:val="BodyText"/>
       </w:pPr>
       <w:r>
+        <w:t xml:space="preserve">Figures 7, 9 and 10 are one end-to-end trial, run on 14 October 2026 and</w:t>
+      </w:r>
+      <w:r>
+        <w:t xml:space="preserve"> </w:t>
+      </w:r>
+      <w:r>
+        <w:t xml:space="preserve">recorded in Section 11 of the validation document: the attendee app shows the</w:t>
+      </w:r>
+      <w:r>
+        <w:t xml:space="preserve"> </w:t>
+      </w:r>
+      <w:r>
+        <w:t xml:space="preserve">voucher, the scanner submits it and the server answers 200, and the same token</w:t>
+      </w:r>
+      <w:r>
+        <w:t xml:space="preserve"> </w:t>
+      </w:r>
+      <w:r>
+        <w:t xml:space="preserve">is then answered 409. The evaluation in Section 6.8 refused 200 duplicate</w:t>
+      </w:r>
+      <w:r>
+        <w:t xml:space="preserve"> </w:t>
+      </w:r>
+      <w:r>
+        <w:t xml:space="preserve">submissions of this kind; these are what a scanner operator sees when it</w:t>
+      </w:r>
+      <w:r>
+        <w:t xml:space="preserve"> </w:t>
+      </w:r>
+      <w:r>
+        <w:t xml:space="preserve">happens.</w:t>
+      </w:r>
+    </w:p>
+    <w:p>
+      <w:pPr>
+        <w:pStyle w:val="BodyText"/>
+        <w:keepNext/>
+        <w:keepLines/>
+        <w:jc w:val="left"/>
+      </w:pPr>
+      <w:r>
+        <w:rPr>
+          <w:b/>
+          <w:bCs/>
+        </w:rPr>
+        <w:t xml:space="preserve">Figure 11. Report exports available to an organiser (Objective 5).</w:t>
+      </w:r>
+    </w:p>
+    <w:p>
+      <w:pPr>
+        <w:pStyle w:val="BodyText"/>
+      </w:pPr>
+      <w:r>
+        <w:drawing>
+          <wp:inline>
+            <wp:extent cx="2674620" cy="5943600"/>
+            <wp:effectExtent b="0" l="0" r="0" t="0"/>
+            <wp:docPr descr="Reports screen listing four exports: Attendance Report, Meal Redemption Report, Session Attendance Report and Notification Report" title="" id="97" name="Picture"/>
+            <a:graphic>
+              <a:graphicData uri="http://schemas.openxmlformats.org/drawingml/2006/picture">
+                <pic:pic>
+                  <pic:nvPicPr>
+                    <pic:cNvPr descr="../evidence-ui-reports.png" id="98" name="Picture"/>
+                    <pic:cNvPicPr>
+                      <a:picLocks noChangeArrowheads="1" noChangeAspect="1"/>
+                    </pic:cNvPicPr>
+                  </pic:nvPicPr>
+                  <pic:blipFill>
+                    <a:blip r:embed="rId96"/>
+                    <a:stretch>
+                      <a:fillRect/>
+                    </a:stretch>
+                  </pic:blipFill>
+                  <pic:spPr bwMode="auto">
+                    <a:xfrm>
+                      <a:off x="0" y="0"/>
+                      <a:ext cx="2674620" cy="5943600"/>
+                    </a:xfrm>
+                    <a:prstGeom prst="rect">
+                      <a:avLst/>
+                    </a:prstGeom>
+                    <a:noFill/>
+                    <a:ln w="9525">
+                      <a:noFill/>
+                      <a:headEnd/>
+                      <a:tailEnd/>
+                    </a:ln>
+                  </pic:spPr>
+                </pic:pic>
+              </a:graphicData>
+            </a:graphic>
+          </wp:inline>
+        </w:drawing>
+      </w:r>
+    </w:p>
+    <w:p>
+      <w:pPr>
+        <w:pStyle w:val="BodyText"/>
+      </w:pPr>
+      <w:r>
         <w:t xml:space="preserve">The four CSV exports whose row counts are checked against database ground truth</w:t>
       </w:r>
       <w:r>
@@ -21115,7 +21470,7 @@
         <w:t xml:space="preserve">in Section 6.6.</w:t>
       </w:r>
     </w:p>
-    <w:bookmarkStart w:id="96" w:name="e1-what-these-figures-do-and-do-not-show"/>
+    <w:bookmarkStart w:id="99" w:name="e1-what-these-figures-do-and-do-not-show"/>
     <w:p>
       <w:pPr>
         <w:pStyle w:val="Heading2"/>
@@ -21129,13 +21484,19 @@
         <w:pStyle w:val="FirstParagraph"/>
       </w:pPr>
       <w:r>
-        <w:t xml:space="preserve">Figures 8 and 9 were produced through the scanner's manual token entry rather</w:t>
-      </w:r>
-      <w:r>
-        <w:t xml:space="preserve"> </w:t>
-      </w:r>
-      <w:r>
-        <w:t xml:space="preserve">than by decoding a printed code with the camera. The submission path is</w:t>
+        <w:t xml:space="preserve">In the trial behind Figures 9 and 10 the scanner read the token by manual</w:t>
+      </w:r>
+      <w:r>
+        <w:t xml:space="preserve"> </w:t>
+      </w:r>
+      <w:r>
+        <w:t xml:space="preserve">entry, not with the camera: both roles ran in turn on one Android emulator, and</w:t>
+      </w:r>
+      <w:r>
+        <w:t xml:space="preserve"> </w:t>
+      </w:r>
+      <w:r>
+        <w:t xml:space="preserve">an emulator's camera cannot see another screen. The submission path is</w:t>
       </w:r>
       <w:r>
         <w:t xml:space="preserve"> </w:t>
@@ -21153,31 +21514,40 @@
         <w:t xml:space="preserve"> </w:t>
       </w:r>
       <w:r>
-        <w:t xml:space="preserve">decode step itself: these figures are evidence that a presented token is</w:t>
-      </w:r>
-      <w:r>
-        <w:t xml:space="preserve"> </w:t>
-      </w:r>
-      <w:r>
-        <w:t xml:space="preserve">accepted once and refused thereafter, not evidence that the camera reads a QR</w:t>
-      </w:r>
-      <w:r>
-        <w:t xml:space="preserve"> </w:t>
-      </w:r>
-      <w:r>
-        <w:t xml:space="preserve">symbol correctly. Decoding is exercised by the Flutter client's own tests and</w:t>
-      </w:r>
-      <w:r>
-        <w:t xml:space="preserve"> </w:t>
-      </w:r>
-      <w:r>
-        <w:t xml:space="preserve">by the attendee pass in Figure 6, which renders a real scannable token, but no</w:t>
-      </w:r>
-      <w:r>
-        <w:t xml:space="preserve"> </w:t>
-      </w:r>
-      <w:r>
-        <w:t xml:space="preserve">figure in this report shows a camera decoding one.</w:t>
+        <w:t xml:space="preserve">camera decode itself. The QR code in Figure 7 was decoded off the device and</w:t>
+      </w:r>
+      <w:r>
+        <w:t xml:space="preserve"> </w:t>
+      </w:r>
+      <w:r>
+        <w:t xml:space="preserve">reads the right token, but no figure shows the scanner's camera reading one,</w:t>
+      </w:r>
+      <w:r>
+        <w:t xml:space="preserve"> </w:t>
+      </w:r>
+      <w:r>
+        <w:t xml:space="preserve">and the Flutter tests do not cover camera decoding:</w:t>
+      </w:r>
+      <w:r>
+        <w:t xml:space="preserve"> </w:t>
+      </w:r>
+      <w:r>
+        <w:rPr>
+          <w:rStyle w:val="VerbatimChar"/>
+        </w:rPr>
+        <w:t xml:space="preserve">qr_parser_test.dart</w:t>
+      </w:r>
+      <w:r>
+        <w:t xml:space="preserve"> </w:t>
+      </w:r>
+      <w:r>
+        <w:t xml:space="preserve">tests</w:t>
+      </w:r>
+      <w:r>
+        <w:t xml:space="preserve"> </w:t>
+      </w:r>
+      <w:r>
+        <w:t xml:space="preserve">only the trimming of a manually entered token.</w:t>
       </w:r>
     </w:p>
     <w:p>
@@ -21200,9 +21570,9 @@
         <w:t xml:space="preserve">them as it does to the push-delivery timing.</w:t>
       </w:r>
     </w:p>
-    <w:bookmarkEnd w:id="96"/>
-    <w:bookmarkEnd w:id="97"/>
-    <w:bookmarkStart w:id="98" w:name="appendix-f-reference-verification-record"/>
+    <w:bookmarkEnd w:id="99"/>
+    <w:bookmarkEnd w:id="100"/>
+    <w:bookmarkStart w:id="101" w:name="appendix-f-reference-verification-record"/>
     <w:p>
       <w:pPr>
         <w:pStyle w:val="Heading1"/>
@@ -22546,7 +22916,7 @@
         <w:t xml:space="preserve">before being cited.</w:t>
       </w:r>
     </w:p>
-    <w:bookmarkEnd w:id="98"/>
+    <w:bookmarkEnd w:id="101"/>
     <w:sectPr>
       <w:footerReference w:type="default" r:id="rId10"/>
       <w:footnotePr>
@@ -22927,6 +23297,36 @@
   </w:num>
   <w:num w:numId="1003">
     <w:abstractNumId w:val="991"/>
+  </w:num>
+  <w:num w:numId="1004">
+    <w:abstractNumId w:val="99411"/>
+    <w:lvlOverride w:ilvl="0">
+      <w:startOverride w:val="1"/>
+    </w:lvlOverride>
+    <w:lvlOverride w:ilvl="1">
+      <w:startOverride w:val="1"/>
+    </w:lvlOverride>
+    <w:lvlOverride w:ilvl="2">
+      <w:startOverride w:val="1"/>
+    </w:lvlOverride>
+    <w:lvlOverride w:ilvl="3">
+      <w:startOverride w:val="1"/>
+    </w:lvlOverride>
+    <w:lvlOverride w:ilvl="4">
+      <w:startOverride w:val="1"/>
+    </w:lvlOverride>
+    <w:lvlOverride w:ilvl="5">
+      <w:startOverride w:val="1"/>
+    </w:lvlOverride>
+    <w:lvlOverride w:ilvl="6">
+      <w:startOverride w:val="1"/>
+    </w:lvlOverride>
+    <w:lvlOverride w:ilvl="7">
+      <w:startOverride w:val="1"/>
+    </w:lvlOverride>
+    <w:lvlOverride w:ilvl="8">
+      <w:startOverride w:val="1"/>
+    </w:lvlOverride>
   </w:num>
 </w:numbering>
 </file>

</xml_diff>

<commit_message>
shorter ai appendix in the report too
matches the trimmed log. rebuilt word and pdf.
</commit_message>
<xml_diff>
--- a/docs/deliverables/ConferenceCheck Final Report.docx
+++ b/docs/deliverables/ConferenceCheck Final Report.docx
@@ -2140,7 +2140,7 @@
               <w:jc w:val="left"/>
             </w:pPr>
             <w:r>
-              <w:t xml:space="preserve">Tool and scope</w:t>
+              <w:t xml:space="preserve">Use</w:t>
             </w:r>
           </w:p>
         </w:tc>
@@ -2184,7 +2184,7 @@
               <w:jc w:val="left"/>
             </w:pPr>
             <w:r>
-              <w:t xml:space="preserve">To 30 September 2026</w:t>
+              <w:t xml:space="preserve">Representative prompts</w:t>
             </w:r>
           </w:p>
         </w:tc>
@@ -2228,95 +2228,7 @@
               <w:jc w:val="left"/>
             </w:pPr>
             <w:r>
-              <w:t xml:space="preserve">From 7 October 2026</w:t>
-            </w:r>
-          </w:p>
-        </w:tc>
-        <w:tc>
-          <w:tcPr>
-            <w:tcW w:type="dxa" w:w="780"/>
-          </w:tcPr>
-          <w:p>
-            <w:pPr>
-              <w:pStyle w:val="Compact"/>
-              <w:jc w:val="left"/>
-            </w:pPr>
-            <w:r>
-              <w:t xml:space="preserve">27</w:t>
-            </w:r>
-          </w:p>
-        </w:tc>
-      </w:tr>
-      <w:tr>
-        <w:tc>
-          <w:tcPr>
-            <w:tcW w:type="dxa" w:w="1170"/>
-          </w:tcPr>
-          <w:p>
-            <w:pPr>
-              <w:pStyle w:val="Compact"/>
-              <w:jc w:val="left"/>
-            </w:pPr>
-            <w:r>
-              <w:t xml:space="preserve">A.4</w:t>
-            </w:r>
-          </w:p>
-        </w:tc>
-        <w:tc>
-          <w:tcPr>
-            <w:tcW w:type="dxa" w:w="7410"/>
-          </w:tcPr>
-          <w:p>
-            <w:pPr>
-              <w:pStyle w:val="Compact"/>
-              <w:jc w:val="left"/>
-            </w:pPr>
-            <w:r>
-              <w:t xml:space="preserve">How the output was checked</w:t>
-            </w:r>
-          </w:p>
-        </w:tc>
-        <w:tc>
-          <w:tcPr>
-            <w:tcW w:type="dxa" w:w="780"/>
-          </w:tcPr>
-          <w:p>
-            <w:pPr>
-              <w:pStyle w:val="Compact"/>
-              <w:jc w:val="left"/>
-            </w:pPr>
-            <w:r>
-              <w:t xml:space="preserve">28</w:t>
-            </w:r>
-          </w:p>
-        </w:tc>
-      </w:tr>
-      <w:tr>
-        <w:tc>
-          <w:tcPr>
-            <w:tcW w:type="dxa" w:w="1170"/>
-          </w:tcPr>
-          <w:p>
-            <w:pPr>
-              <w:pStyle w:val="Compact"/>
-              <w:jc w:val="left"/>
-            </w:pPr>
-            <w:r>
-              <w:t xml:space="preserve">A.5</w:t>
-            </w:r>
-          </w:p>
-        </w:tc>
-        <w:tc>
-          <w:tcPr>
-            <w:tcW w:type="dxa" w:w="7410"/>
-          </w:tcPr>
-          <w:p>
-            <w:pPr>
-              <w:pStyle w:val="Compact"/>
-              <w:jc w:val="left"/>
-            </w:pPr>
-            <w:r>
-              <w:t xml:space="preserve">Gap in the record</w:t>
+              <w:t xml:space="preserve">Checks and gaps</w:t>
             </w:r>
           </w:p>
         </w:tc>
@@ -2426,7 +2338,7 @@
               <w:jc w:val="left"/>
             </w:pPr>
             <w:r>
-              <w:t xml:space="preserve">30</w:t>
+              <w:t xml:space="preserve">29</w:t>
             </w:r>
           </w:p>
         </w:tc>
@@ -2522,7 +2434,7 @@
               <w:jc w:val="left"/>
             </w:pPr>
             <w:r>
-              <w:t xml:space="preserve">34</w:t>
+              <w:t xml:space="preserve">33</w:t>
             </w:r>
           </w:p>
         </w:tc>
@@ -2566,7 +2478,7 @@
               <w:jc w:val="left"/>
             </w:pPr>
             <w:r>
-              <w:t xml:space="preserve">44</w:t>
+              <w:t xml:space="preserve">43</w:t>
             </w:r>
           </w:p>
         </w:tc>
@@ -2614,7 +2526,7 @@
               <w:jc w:val="left"/>
             </w:pPr>
             <w:r>
-              <w:t xml:space="preserve">45</w:t>
+              <w:t xml:space="preserve">44</w:t>
             </w:r>
           </w:p>
         </w:tc>
@@ -3162,7 +3074,7 @@
               <w:jc w:val="left"/>
             </w:pPr>
             <w:r>
-              <w:t xml:space="preserve">29</w:t>
+              <w:t xml:space="preserve">28</w:t>
             </w:r>
           </w:p>
         </w:tc>
@@ -3229,7 +3141,7 @@
               <w:jc w:val="left"/>
             </w:pPr>
             <w:r>
-              <w:t xml:space="preserve">30</w:t>
+              <w:t xml:space="preserve">29</w:t>
             </w:r>
           </w:p>
         </w:tc>
@@ -3287,7 +3199,7 @@
               <w:jc w:val="left"/>
             </w:pPr>
             <w:r>
-              <w:t xml:space="preserve">45</w:t>
+              <w:t xml:space="preserve">44</w:t>
             </w:r>
           </w:p>
         </w:tc>
@@ -3487,7 +3399,7 @@
               <w:jc w:val="left"/>
             </w:pPr>
             <w:r>
-              <w:t xml:space="preserve">35</w:t>
+              <w:t xml:space="preserve">34</w:t>
             </w:r>
           </w:p>
         </w:tc>
@@ -3545,7 +3457,7 @@
               <w:jc w:val="left"/>
             </w:pPr>
             <w:r>
-              <w:t xml:space="preserve">36</w:t>
+              <w:t xml:space="preserve">35</w:t>
             </w:r>
           </w:p>
         </w:tc>
@@ -3603,7 +3515,7 @@
               <w:jc w:val="left"/>
             </w:pPr>
             <w:r>
-              <w:t xml:space="preserve">37</w:t>
+              <w:t xml:space="preserve">36</w:t>
             </w:r>
           </w:p>
         </w:tc>
@@ -3661,7 +3573,7 @@
               <w:jc w:val="left"/>
             </w:pPr>
             <w:r>
-              <w:t xml:space="preserve">38</w:t>
+              <w:t xml:space="preserve">37</w:t>
             </w:r>
           </w:p>
         </w:tc>
@@ -3719,7 +3631,7 @@
               <w:jc w:val="left"/>
             </w:pPr>
             <w:r>
-              <w:t xml:space="preserve">39</w:t>
+              <w:t xml:space="preserve">38</w:t>
             </w:r>
           </w:p>
         </w:tc>
@@ -3777,7 +3689,7 @@
               <w:jc w:val="left"/>
             </w:pPr>
             <w:r>
-              <w:t xml:space="preserve">40</w:t>
+              <w:t xml:space="preserve">39</w:t>
             </w:r>
           </w:p>
         </w:tc>
@@ -3835,7 +3747,7 @@
               <w:jc w:val="left"/>
             </w:pPr>
             <w:r>
-              <w:t xml:space="preserve">41</w:t>
+              <w:t xml:space="preserve">40</w:t>
             </w:r>
           </w:p>
         </w:tc>
@@ -3893,7 +3805,7 @@
               <w:jc w:val="left"/>
             </w:pPr>
             <w:r>
-              <w:t xml:space="preserve">42</w:t>
+              <w:t xml:space="preserve">41</w:t>
             </w:r>
           </w:p>
         </w:tc>
@@ -3951,7 +3863,7 @@
               <w:jc w:val="left"/>
             </w:pPr>
             <w:r>
-              <w:t xml:space="preserve">43</w:t>
+              <w:t xml:space="preserve">42</w:t>
             </w:r>
           </w:p>
         </w:tc>
@@ -4009,7 +3921,7 @@
               <w:jc w:val="left"/>
             </w:pPr>
             <w:r>
-              <w:t xml:space="preserve">44</w:t>
+              <w:t xml:space="preserve">43</w:t>
             </w:r>
           </w:p>
         </w:tc>
@@ -14318,7 +14230,7 @@
       </w:r>
     </w:p>
     <w:bookmarkEnd w:id="59"/>
-    <w:bookmarkStart w:id="65" w:name="X037053293eb9ad08c241ce36f243ee7ade64cd4"/>
+    <w:bookmarkStart w:id="63" w:name="X037053293eb9ad08c241ce36f243ee7ade64cd4"/>
     <w:p>
       <w:pPr>
         <w:pStyle w:val="Heading1"/>
@@ -14327,13 +14239,13 @@
         <w:t xml:space="preserve">Appendix A. Artificial intelligence usage disclosure</w:t>
       </w:r>
     </w:p>
-    <w:bookmarkStart w:id="60" w:name="a1-tool-and-scope"/>
+    <w:bookmarkStart w:id="60" w:name="a1-use"/>
     <w:p>
       <w:pPr>
         <w:pStyle w:val="Heading2"/>
       </w:pPr>
       <w:r>
-        <w:t xml:space="preserve">A.1 Tool and scope</w:t>
+        <w:t xml:space="preserve">A.1 Use</w:t>
       </w:r>
     </w:p>
     <w:p>
@@ -14341,35 +14253,7 @@
         <w:pStyle w:val="FirstParagraph"/>
       </w:pPr>
       <w:r>
-        <w:t xml:space="preserve">The one AI tool used was Claude (Anthropic), through Claude Code. The proposal</w:t>
-      </w:r>
-      <w:r>
-        <w:t xml:space="preserve"> </w:t>
-      </w:r>
-      <w:r>
-        <w:t xml:space="preserve">limited AI help to boilerplate, proofreading and questions about library APIs</w:t>
-      </w:r>
-      <w:r>
-        <w:t xml:space="preserve"> </w:t>
-      </w:r>
-      <w:r>
-        <w:t xml:space="preserve">and syntax. That held until 30 September 2026. The work after the</w:t>
-      </w:r>
-      <w:r>
-        <w:t xml:space="preserve"> </w:t>
-      </w:r>
-      <w:r>
-        <w:t xml:space="preserve">supervisor's comments, from 7 October, went beyond it, and is set out in A.3.</w:t>
-      </w:r>
-    </w:p>
-    <w:bookmarkEnd w:id="60"/>
-    <w:bookmarkStart w:id="61" w:name="a2-to-30-september-2026"/>
-    <w:p>
-      <w:pPr>
-        <w:pStyle w:val="Heading2"/>
-      </w:pPr>
-      <w:r>
-        <w:t xml:space="preserve">A.2 To 30 September 2026</w:t>
+        <w:t xml:space="preserve">The tool used was Claude (Anthropic), through Claude Code.</w:t>
       </w:r>
     </w:p>
     <w:tbl>
@@ -14379,8 +14263,8 @@
         <w:tblLook w:firstRow="1" w:lastRow="0" w:firstColumn="0" w:lastColumn="0" w:noHBand="0" w:noVBand="0" w:val="0020"/>
       </w:tblPr>
       <w:tblGrid>
-        <w:gridCol w:w="5014"/>
-        <w:gridCol w:w="4345"/>
+        <w:gridCol w:w="1430"/>
+        <w:gridCol w:w="7930"/>
       </w:tblGrid>
       <w:tr>
         <w:trPr>
@@ -14388,29 +14272,29 @@
         </w:trPr>
         <w:tc>
           <w:tcPr>
-            <w:tcW w:type="dxa" w:w="5014"/>
-          </w:tcPr>
-          <w:p>
-            <w:pPr>
-              <w:pStyle w:val="Compact"/>
-              <w:jc w:val="left"/>
-            </w:pPr>
-            <w:r>
-              <w:t xml:space="preserve">Work</w:t>
-            </w:r>
-          </w:p>
-        </w:tc>
-        <w:tc>
-          <w:tcPr>
-            <w:tcW w:type="dxa" w:w="4345"/>
-          </w:tcPr>
-          <w:p>
-            <w:pPr>
-              <w:pStyle w:val="Compact"/>
-              <w:jc w:val="left"/>
-            </w:pPr>
-            <w:r>
-              <w:t xml:space="preserve">Use of AI</w:t>
+            <w:tcW w:type="dxa" w:w="1430"/>
+          </w:tcPr>
+          <w:p>
+            <w:pPr>
+              <w:pStyle w:val="Compact"/>
+              <w:jc w:val="left"/>
+            </w:pPr>
+            <w:r>
+              <w:t xml:space="preserve">Period</w:t>
+            </w:r>
+          </w:p>
+        </w:tc>
+        <w:tc>
+          <w:tcPr>
+            <w:tcW w:type="dxa" w:w="7930"/>
+          </w:tcPr>
+          <w:p>
+            <w:pPr>
+              <w:pStyle w:val="Compact"/>
+              <w:jc w:val="left"/>
+            </w:pPr>
+            <w:r>
+              <w:t xml:space="preserve">Use</w:t>
             </w:r>
           </w:p>
         </w:tc>
@@ -14418,29 +14302,29 @@
       <w:tr>
         <w:tc>
           <w:tcPr>
-            <w:tcW w:type="dxa" w:w="5014"/>
-          </w:tcPr>
-          <w:p>
-            <w:pPr>
-              <w:pStyle w:val="Compact"/>
-              <w:jc w:val="left"/>
-            </w:pPr>
-            <w:r>
-              <w:t xml:space="preserve">Backend and Flutter application</w:t>
-            </w:r>
-          </w:p>
-        </w:tc>
-        <w:tc>
-          <w:tcPr>
-            <w:tcW w:type="dxa" w:w="4345"/>
-          </w:tcPr>
-          <w:p>
-            <w:pPr>
-              <w:pStyle w:val="Compact"/>
-              <w:jc w:val="left"/>
-            </w:pPr>
-            <w:r>
-              <w:t xml:space="preserve">Boilerplate and questions about library APIs</w:t>
+            <w:tcW w:type="dxa" w:w="1430"/>
+          </w:tcPr>
+          <w:p>
+            <w:pPr>
+              <w:pStyle w:val="Compact"/>
+              <w:jc w:val="left"/>
+            </w:pPr>
+            <w:r>
+              <w:t xml:space="preserve">To 30 September 2026</w:t>
+            </w:r>
+          </w:p>
+        </w:tc>
+        <w:tc>
+          <w:tcPr>
+            <w:tcW w:type="dxa" w:w="7930"/>
+          </w:tcPr>
+          <w:p>
+            <w:pPr>
+              <w:pStyle w:val="Compact"/>
+              <w:jc w:val="left"/>
+            </w:pPr>
+            <w:r>
+              <w:t xml:space="preserve">Boilerplate, library and syntax questions, proofreading; help with the strict review and evaluation scripts</w:t>
             </w:r>
           </w:p>
         </w:tc>
@@ -14448,89 +14332,95 @@
       <w:tr>
         <w:tc>
           <w:tcPr>
-            <w:tcW w:type="dxa" w:w="5014"/>
-          </w:tcPr>
-          <w:p>
-            <w:pPr>
-              <w:pStyle w:val="Compact"/>
-              <w:jc w:val="left"/>
-            </w:pPr>
-            <w:r>
-              <w:t xml:space="preserve">Strict review (</w:t>
+            <w:tcW w:type="dxa" w:w="1430"/>
+          </w:tcPr>
+          <w:p>
+            <w:pPr>
+              <w:pStyle w:val="Compact"/>
+              <w:jc w:val="left"/>
+            </w:pPr>
+            <w:r>
+              <w:t xml:space="preserve">7 to 14 October 2026</w:t>
+            </w:r>
+          </w:p>
+        </w:tc>
+        <w:tc>
+          <w:tcPr>
+            <w:tcW w:type="dxa" w:w="7930"/>
+          </w:tcPr>
+          <w:p>
+            <w:pPr>
+              <w:pStyle w:val="Compact"/>
+              <w:jc w:val="left"/>
+            </w:pPr>
+            <w:r>
+              <w:t xml:space="preserve">Code and tests for the fixes the supervisor asked for, the concurrency and freshness scripts, the My meals screen,</w:t>
+            </w:r>
+            <w:r>
+              <w:t xml:space="preserve"> </w:t>
             </w:r>
             <w:r>
               <w:rPr>
                 <w:rStyle w:val="VerbatimChar"/>
               </w:rPr>
-              <w:t xml:space="preserve">docs/STRICT-REVIEW.md</w:t>
-            </w:r>
-            <w:r>
-              <w:t xml:space="preserve">) and evaluation tooling</w:t>
-            </w:r>
-          </w:p>
-        </w:tc>
-        <w:tc>
-          <w:tcPr>
-            <w:tcW w:type="dxa" w:w="4345"/>
-          </w:tcPr>
-          <w:p>
-            <w:pPr>
-              <w:pStyle w:val="Compact"/>
-              <w:jc w:val="left"/>
-            </w:pPr>
-            <w:r>
-              <w:t xml:space="preserve">Written by the student, with help from Claude</w:t>
-            </w:r>
-          </w:p>
-        </w:tc>
-      </w:tr>
-      <w:tr>
-        <w:tc>
-          <w:tcPr>
-            <w:tcW w:type="dxa" w:w="5014"/>
-          </w:tcPr>
-          <w:p>
-            <w:pPr>
-              <w:pStyle w:val="Compact"/>
-              <w:jc w:val="left"/>
-            </w:pPr>
-            <w:r>
-              <w:t xml:space="preserve">Report and validation document</w:t>
-            </w:r>
-          </w:p>
-        </w:tc>
-        <w:tc>
-          <w:tcPr>
-            <w:tcW w:type="dxa" w:w="4345"/>
-          </w:tcPr>
-          <w:p>
-            <w:pPr>
-              <w:pStyle w:val="Compact"/>
-              <w:jc w:val="left"/>
-            </w:pPr>
-            <w:r>
-              <w:t xml:space="preserve">Written by the student; Claude used for proofreading</w:t>
+              <w:t xml:space="preserve">tools/build_proposal_v4.py</w:t>
+            </w:r>
+            <w:r>
+              <w:t xml:space="preserve">, and drafts of the revised report, validation document and proposal</w:t>
             </w:r>
           </w:p>
         </w:tc>
       </w:tr>
     </w:tbl>
-    <w:bookmarkEnd w:id="61"/>
-    <w:bookmarkStart w:id="62" w:name="a3-from-7-october-2026"/>
+    <w:p>
+      <w:pPr>
+        <w:pStyle w:val="BodyText"/>
+      </w:pPr>
+      <w:r>
+        <w:t xml:space="preserve">From 7 October this went beyond the proposal's scope (Section 9). The student</w:t>
+      </w:r>
+      <w:r>
+        <w:t xml:space="preserve"> </w:t>
+      </w:r>
+      <w:r>
+        <w:t xml:space="preserve">chose what to fix and in what order, reviewed every change before committing</w:t>
+      </w:r>
+      <w:r>
+        <w:t xml:space="preserve"> </w:t>
+      </w:r>
+      <w:r>
+        <w:t xml:space="preserve">it, and checked the test and experiment results. Each change is a commit in the</w:t>
+      </w:r>
+      <w:r>
+        <w:t xml:space="preserve"> </w:t>
+      </w:r>
+      <w:r>
+        <w:t xml:space="preserve">repository history, and</w:t>
+      </w:r>
+      <w:r>
+        <w:t xml:space="preserve"> </w:t>
+      </w:r>
+      <w:r>
+        <w:rPr>
+          <w:rStyle w:val="VerbatimChar"/>
+        </w:rPr>
+        <w:t xml:space="preserve">docs/ai_usage_log.md</w:t>
+      </w:r>
+      <w:r>
+        <w:t xml:space="preserve"> </w:t>
+      </w:r>
+      <w:r>
+        <w:t xml:space="preserve">is the log.</w:t>
+      </w:r>
+    </w:p>
+    <w:bookmarkEnd w:id="60"/>
+    <w:bookmarkStart w:id="61" w:name="a2-representative-prompts"/>
     <w:p>
       <w:pPr>
         <w:pStyle w:val="Heading2"/>
       </w:pPr>
       <w:r>
-        <w:t xml:space="preserve">A.3 From 7 October 2026</w:t>
-      </w:r>
-    </w:p>
-    <w:p>
-      <w:pPr>
-        <w:pStyle w:val="FirstParagraph"/>
-      </w:pPr>
-      <w:r>
-        <w:t xml:space="preserve">Working from the supervisor's comments, Claude:</w:t>
+        <w:t xml:space="preserve">A.2 Representative prompts</w:t>
       </w:r>
     </w:p>
     <w:p>
@@ -14542,31 +14432,13 @@
         </w:numPr>
       </w:pPr>
       <w:r>
-        <w:t xml:space="preserve">wrote most of the code changes and their tests: the access-control fixes,</w:t>
-      </w:r>
-      <w:r>
-        <w:t xml:space="preserve"> </w:t>
-      </w:r>
-      <w:r>
-        <w:t xml:space="preserve">the 409 handling and row locks on the scan paths, chunked exports, the</w:t>
-      </w:r>
-      <w:r>
-        <w:t xml:space="preserve"> </w:t>
-      </w:r>
-      <w:r>
-        <w:t xml:space="preserve">Firebase demo-mode and dispatch changes, the offline replay fixes, and,</w:t>
-      </w:r>
-      <w:r>
-        <w:t xml:space="preserve"> </w:t>
-      </w:r>
-      <w:r>
-        <w:t xml:space="preserve">on 14 October, the attendee's My meals screen and the offline meal-scan</w:t>
-      </w:r>
-      <w:r>
-        <w:t xml:space="preserve"> </w:t>
-      </w:r>
-      <w:r>
-        <w:t xml:space="preserve">message;</w:t>
+        <w:t xml:space="preserve">7 October: the supervisor's comments pasted in, then "what would we start</w:t>
+      </w:r>
+      <w:r>
+        <w:t xml:space="preserve"> </w:t>
+      </w:r>
+      <w:r>
+        <w:t xml:space="preserve">with fixing".</w:t>
       </w:r>
     </w:p>
     <w:p>
@@ -14578,13 +14450,7 @@
         </w:numPr>
       </w:pPr>
       <w:r>
-        <w:t xml:space="preserve">designed, wrote and ran the concurrency experiment and the freshness</w:t>
-      </w:r>
-      <w:r>
-        <w:t xml:space="preserve"> </w:t>
-      </w:r>
-      <w:r>
-        <w:t xml:space="preserve">measurement, and added the SQL export checks;</w:t>
+        <w:t xml:space="preserve">9 and 10 October: "do the next 6 commits".</w:t>
       </w:r>
     </w:p>
     <w:p>
@@ -14596,37 +14462,23 @@
         </w:numPr>
       </w:pPr>
       <w:r>
-        <w:t xml:space="preserve">wrote</w:t>
-      </w:r>
-      <w:r>
-        <w:t xml:space="preserve"> </w:t>
-      </w:r>
-      <w:r>
-        <w:rPr>
-          <w:rStyle w:val="VerbatimChar"/>
-        </w:rPr>
-        <w:t xml:space="preserve">tools/build_proposal_v4.py</w:t>
-      </w:r>
-      <w:r>
-        <w:t xml:space="preserve">, which builds the proposal v4 documents;</w:t>
-      </w:r>
-    </w:p>
-    <w:p>
-      <w:pPr>
-        <w:pStyle w:val="Compact"/>
-        <w:numPr>
-          <w:ilvl w:val="0"/>
-          <w:numId w:val="1003"/>
-        </w:numPr>
-      </w:pPr>
-      <w:r>
-        <w:t xml:space="preserve">drafted the revised text of this report, the validation document and the</w:t>
-      </w:r>
-      <w:r>
-        <w:t xml:space="preserve"> </w:t>
-      </w:r>
-      <w:r>
-        <w:t xml:space="preserve">proposal v4.</w:t>
+        <w:t xml:space="preserve">14 October: the supervisor's comments pasted in, then "work on everything</w:t>
+      </w:r>
+      <w:r>
+        <w:t xml:space="preserve"> </w:t>
+      </w:r>
+      <w:r>
+        <w:t xml:space="preserve">he wants us to".</w:t>
+      </w:r>
+    </w:p>
+    <w:bookmarkEnd w:id="61"/>
+    <w:bookmarkStart w:id="62" w:name="a3-checks-and-gaps"/>
+    <w:p>
+      <w:pPr>
+        <w:pStyle w:val="Heading2"/>
+      </w:pPr>
+      <w:r>
+        <w:t xml:space="preserve">A.3 Checks and gaps</w:t>
       </w:r>
     </w:p>
     <w:p>
@@ -14634,282 +14486,24 @@
         <w:pStyle w:val="FirstParagraph"/>
       </w:pPr>
       <w:r>
-        <w:t xml:space="preserve">The student decided what to fix and in what order, reviewed each change before</w:t>
-      </w:r>
-      <w:r>
-        <w:t xml:space="preserve"> </w:t>
-      </w:r>
-      <w:r>
-        <w:t xml:space="preserve">committing it, and checked the test and experiment results. Each change is a</w:t>
-      </w:r>
-      <w:r>
-        <w:t xml:space="preserve"> </w:t>
-      </w:r>
-      <w:r>
-        <w:t xml:space="preserve">commit in the repository history.</w:t>
-      </w:r>
-    </w:p>
-    <w:p>
-      <w:pPr>
-        <w:pStyle w:val="BodyText"/>
-      </w:pPr>
-      <w:r>
-        <w:rPr>
-          <w:b/>
-          <w:bCs/>
-        </w:rPr>
-        <w:t xml:space="preserve">Representative prompts.</w:t>
-      </w:r>
-      <w:r>
-        <w:t xml:space="preserve"> </w:t>
-      </w:r>
-      <w:r>
-        <w:t xml:space="preserve">The student's instructions were short and</w:t>
-      </w:r>
-      <w:r>
-        <w:t xml:space="preserve"> </w:t>
-      </w:r>
-      <w:r>
-        <w:t xml:space="preserve">directed the work rather than specifying the code. Typical ones, quoted from</w:t>
-      </w:r>
-      <w:r>
-        <w:t xml:space="preserve"> </w:t>
-      </w:r>
-      <w:r>
-        <w:t xml:space="preserve">the session record:</w:t>
-      </w:r>
-    </w:p>
-    <w:p>
-      <w:pPr>
-        <w:pStyle w:val="Compact"/>
-        <w:numPr>
-          <w:ilvl w:val="0"/>
-          <w:numId w:val="1004"/>
-        </w:numPr>
-      </w:pPr>
-      <w:r>
-        <w:t xml:space="preserve">7 October: the supervisor's comments on the validation document, pasted in</w:t>
-      </w:r>
-      <w:r>
-        <w:t xml:space="preserve"> </w:t>
-      </w:r>
-      <w:r>
-        <w:t xml:space="preserve">full, followed by "what would we start with fixing", asking for small</w:t>
-      </w:r>
-      <w:r>
-        <w:t xml:space="preserve"> </w:t>
-      </w:r>
-      <w:r>
-        <w:t xml:space="preserve">commits.</w:t>
-      </w:r>
-    </w:p>
-    <w:p>
-      <w:pPr>
-        <w:pStyle w:val="Compact"/>
-        <w:numPr>
-          <w:ilvl w:val="0"/>
-          <w:numId w:val="1004"/>
-        </w:numPr>
-      </w:pPr>
-      <w:r>
-        <w:t xml:space="preserve">9 and 10 October: "do the next 6 commits" and "lets do another 6", each</w:t>
-      </w:r>
-      <w:r>
-        <w:t xml:space="preserve"> </w:t>
-      </w:r>
-      <w:r>
-        <w:t xml:space="preserve">working through the next items of the agreed fix list.</w:t>
-      </w:r>
-    </w:p>
-    <w:p>
-      <w:pPr>
-        <w:pStyle w:val="Compact"/>
-        <w:numPr>
-          <w:ilvl w:val="0"/>
-          <w:numId w:val="1004"/>
-        </w:numPr>
-      </w:pPr>
-      <w:r>
-        <w:t xml:space="preserve">10 October: "for the next things if they are things to do with the</w:t>
-      </w:r>
-      <w:r>
-        <w:t xml:space="preserve"> </w:t>
-      </w:r>
-      <w:r>
-        <w:t xml:space="preserve">validation report do them at once then generate word files".</w:t>
-      </w:r>
-    </w:p>
-    <w:p>
-      <w:pPr>
-        <w:pStyle w:val="Compact"/>
-        <w:numPr>
-          <w:ilvl w:val="0"/>
-          <w:numId w:val="1004"/>
-        </w:numPr>
-      </w:pPr>
-      <w:r>
-        <w:t xml:space="preserve">14 October: the supervisor's comments on the proposal, the report and the</w:t>
-      </w:r>
-      <w:r>
-        <w:t xml:space="preserve"> </w:t>
-      </w:r>
-      <w:r>
-        <w:t xml:space="preserve">validation document, pasted in full, followed by "work on everything he</w:t>
-      </w:r>
-      <w:r>
-        <w:t xml:space="preserve"> </w:t>
-      </w:r>
-      <w:r>
-        <w:t xml:space="preserve">wants us to".</w:t>
+        <w:t xml:space="preserve">Each fix has a test that fails on the old code and passes now, and the</w:t>
+      </w:r>
+      <w:r>
+        <w:t xml:space="preserve"> </w:t>
+      </w:r>
+      <w:r>
+        <w:t xml:space="preserve">concurrency experiment has a negative control that failed as expected. The</w:t>
+      </w:r>
+      <w:r>
+        <w:t xml:space="preserve"> </w:t>
+      </w:r>
+      <w:r>
+        <w:t xml:space="preserve">per-use log promised in proposal Section 9.4 was not kept before October.</w:t>
       </w:r>
     </w:p>
     <w:bookmarkEnd w:id="62"/>
-    <w:bookmarkStart w:id="63" w:name="a4-how-the-output-was-checked"/>
-    <w:p>
-      <w:pPr>
-        <w:pStyle w:val="Heading2"/>
-      </w:pPr>
-      <w:r>
-        <w:t xml:space="preserve">A.4 How the output was checked</w:t>
-      </w:r>
-    </w:p>
-    <w:p>
-      <w:pPr>
-        <w:pStyle w:val="FirstParagraph"/>
-      </w:pPr>
-      <w:r>
-        <w:t xml:space="preserve">Each fix has a test that fails against the earlier code and passes now. The</w:t>
-      </w:r>
-      <w:r>
-        <w:t xml:space="preserve"> </w:t>
-      </w:r>
-      <w:r>
-        <w:t xml:space="preserve">concurrency experiment has a negative control, which failed as expected. The</w:t>
-      </w:r>
-      <w:r>
-        <w:t xml:space="preserve"> </w:t>
-      </w:r>
-      <w:r>
-        <w:t xml:space="preserve">backend tests, PHPStan, Pint,</w:t>
-      </w:r>
-      <w:r>
-        <w:t xml:space="preserve"> </w:t>
-      </w:r>
-      <w:r>
-        <w:rPr>
-          <w:rStyle w:val="VerbatimChar"/>
-        </w:rPr>
-        <w:t xml:space="preserve">flutter analyze</w:t>
-      </w:r>
-      <w:r>
-        <w:t xml:space="preserve"> </w:t>
-      </w:r>
-      <w:r>
-        <w:t xml:space="preserve">and</w:t>
-      </w:r>
-      <w:r>
-        <w:t xml:space="preserve"> </w:t>
-      </w:r>
-      <w:r>
-        <w:rPr>
-          <w:rStyle w:val="VerbatimChar"/>
-        </w:rPr>
-        <w:t xml:space="preserve">flutter test</w:t>
-      </w:r>
-      <w:r>
-        <w:t xml:space="preserve"> </w:t>
-      </w:r>
-      <w:r>
-        <w:t xml:space="preserve">were run</w:t>
-      </w:r>
-      <w:r>
-        <w:t xml:space="preserve"> </w:t>
-      </w:r>
-      <w:r>
-        <w:t xml:space="preserve">before each commit. The student is prepared to walk through</w:t>
-      </w:r>
-      <w:r>
-        <w:t xml:space="preserve"> </w:t>
-      </w:r>
-      <w:r>
-        <w:rPr>
-          <w:rStyle w:val="VerbatimChar"/>
-        </w:rPr>
-        <w:t xml:space="preserve">MealController::scanVoucher</w:t>
-      </w:r>
-      <w:r>
-        <w:t xml:space="preserve">,</w:t>
-      </w:r>
-      <w:r>
-        <w:t xml:space="preserve"> </w:t>
-      </w:r>
-      <w:r>
-        <w:rPr>
-          <w:rStyle w:val="VerbatimChar"/>
-        </w:rPr>
-        <w:t xml:space="preserve">tools/run-concurrency-experiment.py</w:t>
-      </w:r>
-      <w:r>
-        <w:t xml:space="preserve"> </w:t>
-      </w:r>
-      <w:r>
-        <w:t xml:space="preserve">and the</w:t>
-      </w:r>
-      <w:r>
-        <w:t xml:space="preserve"> </w:t>
-      </w:r>
-      <w:r>
-        <w:t xml:space="preserve">offline replay rules at the presentation.</w:t>
-      </w:r>
-    </w:p>
     <w:bookmarkEnd w:id="63"/>
-    <w:bookmarkStart w:id="64" w:name="a5-gap-in-the-record"/>
-    <w:p>
-      <w:pPr>
-        <w:pStyle w:val="Heading2"/>
-      </w:pPr>
-      <w:r>
-        <w:t xml:space="preserve">A.5 Gap in the record</w:t>
-      </w:r>
-    </w:p>
-    <w:p>
-      <w:pPr>
-        <w:pStyle w:val="FirstParagraph"/>
-      </w:pPr>
-      <w:r>
-        <w:t xml:space="preserve">The per-use AI log the proposal promised (Section 9.4) was not kept before</w:t>
-      </w:r>
-      <w:r>
-        <w:t xml:space="preserve"> </w:t>
-      </w:r>
-      <w:r>
-        <w:t xml:space="preserve">October. A.2 is the student's own account of that period. From October, the</w:t>
-      </w:r>
-      <w:r>
-        <w:t xml:space="preserve"> </w:t>
-      </w:r>
-      <w:r>
-        <w:t xml:space="preserve">commit history and</w:t>
-      </w:r>
-      <w:r>
-        <w:t xml:space="preserve"> </w:t>
-      </w:r>
-      <w:r>
-        <w:rPr>
-          <w:rStyle w:val="VerbatimChar"/>
-        </w:rPr>
-        <w:t xml:space="preserve">docs/ai_usage_log.md</w:t>
-      </w:r>
-      <w:r>
-        <w:t xml:space="preserve"> </w:t>
-      </w:r>
-      <w:r>
-        <w:t xml:space="preserve">are the record.</w:t>
-      </w:r>
-    </w:p>
-    <w:bookmarkEnd w:id="64"/>
-    <w:bookmarkEnd w:id="65"/>
-    <w:bookmarkStart w:id="66" w:name="X249f0d2157194399b77a8676c0e126e929c29b0"/>
+    <w:bookmarkStart w:id="64" w:name="X249f0d2157194399b77a8676c0e126e929c29b0"/>
     <w:p>
       <w:pPr>
         <w:pStyle w:val="Heading1"/>
@@ -15682,8 +15276,8 @@
         <w:t xml:space="preserve">of them this component's, and 30 of 30 Flutter tests.</w:t>
       </w:r>
     </w:p>
-    <w:bookmarkEnd w:id="66"/>
-    <w:bookmarkStart w:id="67" w:name="appendix-c-full-evaluation-figures"/>
+    <w:bookmarkEnd w:id="64"/>
+    <w:bookmarkStart w:id="65" w:name="appendix-c-full-evaluation-figures"/>
     <w:p>
       <w:pPr>
         <w:pStyle w:val="Heading1"/>
@@ -19746,8 +19340,8 @@
         <w:t xml:space="preserve">measured delays.</w:t>
       </w:r>
     </w:p>
-    <w:bookmarkEnd w:id="67"/>
-    <w:bookmarkStart w:id="68" w:name="appendix-d-reproduction-commands"/>
+    <w:bookmarkEnd w:id="65"/>
+    <w:bookmarkStart w:id="66" w:name="appendix-d-reproduction-commands"/>
     <w:p>
       <w:pPr>
         <w:pStyle w:val="Heading1"/>
@@ -20505,8 +20099,8 @@
         <w:t xml:space="preserve"> final-resubmission</w:t>
       </w:r>
     </w:p>
-    <w:bookmarkEnd w:id="68"/>
-    <w:bookmarkStart w:id="100" w:name="X3904e79689775bc93f65e393b9e8d9a787105b3"/>
+    <w:bookmarkEnd w:id="66"/>
+    <w:bookmarkStart w:id="98" w:name="X3904e79689775bc93f65e393b9e8d9a787105b3"/>
     <w:p>
       <w:pPr>
         <w:pStyle w:val="Heading1"/>
@@ -20565,18 +20159,18 @@
           <wp:inline>
             <wp:extent cx="2674620" cy="5943600"/>
             <wp:effectExtent b="0" l="0" r="0" t="0"/>
-            <wp:docPr descr="Organiser analytics dashboard showing check-in progress, meal redemption count and rate, session attendance, overcrowded session count and notification count" title="" id="70" name="Picture"/>
+            <wp:docPr descr="Organiser analytics dashboard showing check-in progress, meal redemption count and rate, session attendance, overcrowded session count and notification count" title="" id="68" name="Picture"/>
             <a:graphic>
               <a:graphicData uri="http://schemas.openxmlformats.org/drawingml/2006/picture">
                 <pic:pic>
                   <pic:nvPicPr>
-                    <pic:cNvPr descr="../evidence-ui-dashboard.png" id="71" name="Picture"/>
+                    <pic:cNvPr descr="../evidence-ui-dashboard.png" id="69" name="Picture"/>
                     <pic:cNvPicPr>
                       <a:picLocks noChangeArrowheads="1" noChangeAspect="1"/>
                     </pic:cNvPicPr>
                   </pic:nvPicPr>
                   <pic:blipFill>
-                    <a:blip r:embed="rId69"/>
+                    <a:blip r:embed="rId67"/>
                     <a:stretch>
                       <a:fillRect/>
                     </a:stretch>
@@ -20659,18 +20253,18 @@
           <wp:inline>
             <wp:extent cx="2674620" cy="5943600"/>
             <wp:effectExtent b="0" l="0" r="0" t="0"/>
-            <wp:docPr descr="Check-ins over time as a line chart, meal redemptions as a bar chart split by Breakfast, Lunch and Supper, and session capacity bars for two sessions" title="" id="73" name="Picture"/>
+            <wp:docPr descr="Check-ins over time as a line chart, meal redemptions as a bar chart split by Breakfast, Lunch and Supper, and session capacity bars for two sessions" title="" id="71" name="Picture"/>
             <a:graphic>
               <a:graphicData uri="http://schemas.openxmlformats.org/drawingml/2006/picture">
                 <pic:pic>
                   <pic:nvPicPr>
-                    <pic:cNvPr descr="../evidence-ui-charts.png" id="74" name="Picture"/>
+                    <pic:cNvPr descr="../evidence-ui-charts.png" id="72" name="Picture"/>
                     <pic:cNvPicPr>
                       <a:picLocks noChangeArrowheads="1" noChangeAspect="1"/>
                     </pic:cNvPicPr>
                   </pic:nvPicPr>
                   <pic:blipFill>
-                    <a:blip r:embed="rId72"/>
+                    <a:blip r:embed="rId70"/>
                     <a:stretch>
                       <a:fillRect/>
                     </a:stretch>
@@ -20759,18 +20353,18 @@
           <wp:inline>
             <wp:extent cx="2674620" cy="5943600"/>
             <wp:effectExtent b="0" l="0" r="0" t="0"/>
-            <wp:docPr descr="Android notification shade showing two alerts from conference_check_mobile: Session over capacity, and Session filling up, both for the Closing Panel session" title="" id="76" name="Picture"/>
+            <wp:docPr descr="Android notification shade showing two alerts from conference_check_mobile: Session over capacity, and Session filling up, both for the Closing Panel session" title="" id="74" name="Picture"/>
             <a:graphic>
               <a:graphicData uri="http://schemas.openxmlformats.org/drawingml/2006/picture">
                 <pic:pic>
                   <pic:nvPicPr>
-                    <pic:cNvPr descr="../evidence-capacity-alerts.png" id="77" name="Picture"/>
+                    <pic:cNvPr descr="../evidence-capacity-alerts.png" id="75" name="Picture"/>
                     <pic:cNvPicPr>
                       <a:picLocks noChangeArrowheads="1" noChangeAspect="1"/>
                     </pic:cNvPicPr>
                   </pic:nvPicPr>
                   <pic:blipFill>
-                    <a:blip r:embed="rId75"/>
+                    <a:blip r:embed="rId73"/>
                     <a:stretch>
                       <a:fillRect/>
                     </a:stretch>
@@ -20853,18 +20447,18 @@
           <wp:inline>
             <wp:extent cx="2674620" cy="5943600"/>
             <wp:effectExtent b="0" l="0" r="0" t="0"/>
-            <wp:docPr descr="Android notification shade showing a notification from conference_check_mobile reading &quot;Lunch is served. Vouchers are now redeemable at Hall B.&quot;" title="" id="79" name="Picture"/>
+            <wp:docPr descr="Android notification shade showing a notification from conference_check_mobile reading &quot;Lunch is served. Vouchers are now redeemable at Hall B.&quot;" title="" id="77" name="Picture"/>
             <a:graphic>
               <a:graphicData uri="http://schemas.openxmlformats.org/drawingml/2006/picture">
                 <pic:pic>
                   <pic:nvPicPr>
-                    <pic:cNvPr descr="../evidence-push-delivered.png" id="80" name="Picture"/>
+                    <pic:cNvPr descr="../evidence-push-delivered.png" id="78" name="Picture"/>
                     <pic:cNvPicPr>
                       <a:picLocks noChangeArrowheads="1" noChangeAspect="1"/>
                     </pic:cNvPicPr>
                   </pic:nvPicPr>
                   <pic:blipFill>
-                    <a:blip r:embed="rId78"/>
+                    <a:blip r:embed="rId76"/>
                     <a:stretch>
                       <a:fillRect/>
                     </a:stretch>
@@ -20941,18 +20535,18 @@
           <wp:inline>
             <wp:extent cx="2674620" cy="5943600"/>
             <wp:effectExtent b="0" l="0" r="0" t="0"/>
-            <wp:docPr descr="Attendee pass screen showing a QR code with the ticket code CONF-2026-001 for Demo Attendee" title="" id="82" name="Picture"/>
+            <wp:docPr descr="Attendee pass screen showing a QR code with the ticket code CONF-2026-001 for Demo Attendee" title="" id="80" name="Picture"/>
             <a:graphic>
               <a:graphicData uri="http://schemas.openxmlformats.org/drawingml/2006/picture">
                 <pic:pic>
                   <pic:nvPicPr>
-                    <pic:cNvPr descr="../evidence-ui-attendee-pass.png" id="83" name="Picture"/>
+                    <pic:cNvPr descr="../evidence-ui-attendee-pass.png" id="81" name="Picture"/>
                     <pic:cNvPicPr>
                       <a:picLocks noChangeArrowheads="1" noChangeAspect="1"/>
                     </pic:cNvPicPr>
                   </pic:nvPicPr>
                   <pic:blipFill>
-                    <a:blip r:embed="rId81"/>
+                    <a:blip r:embed="rId79"/>
                     <a:stretch>
                       <a:fillRect/>
                     </a:stretch>
@@ -21035,18 +20629,18 @@
           <wp:inline>
             <wp:extent cx="2674620" cy="5943600"/>
             <wp:effectExtent b="0" l="0" r="0" t="0"/>
-            <wp:docPr descr="My meals screen showing Supper as Unused with a QR code above the token MEAL-DEMO-1-3, and Lunch and Breakfast as Redeemed with their redemption times" title="" id="85" name="Picture"/>
+            <wp:docPr descr="My meals screen showing Supper as Unused with a QR code above the token MEAL-DEMO-1-3, and Lunch and Breakfast as Redeemed with their redemption times" title="" id="83" name="Picture"/>
             <a:graphic>
               <a:graphicData uri="http://schemas.openxmlformats.org/drawingml/2006/picture">
                 <pic:pic>
                   <pic:nvPicPr>
-                    <pic:cNvPr descr="../evidence-ui-my-meals.png" id="86" name="Picture"/>
+                    <pic:cNvPr descr="../evidence-ui-my-meals.png" id="84" name="Picture"/>
                     <pic:cNvPicPr>
                       <a:picLocks noChangeArrowheads="1" noChangeAspect="1"/>
                     </pic:cNvPicPr>
                   </pic:nvPicPr>
                   <pic:blipFill>
-                    <a:blip r:embed="rId84"/>
+                    <a:blip r:embed="rId82"/>
                     <a:stretch>
                       <a:fillRect/>
                     </a:stretch>
@@ -21174,18 +20768,18 @@
           <wp:inline>
             <wp:extent cx="2674620" cy="5943600"/>
             <wp:effectExtent b="0" l="0" r="0" t="0"/>
-            <wp:docPr descr="Meals screen listing Breakfast, Lunch and Supper as active categories, with recent redemptions each tagged with the device that recorded them" title="" id="88" name="Picture"/>
+            <wp:docPr descr="Meals screen listing Breakfast, Lunch and Supper as active categories, with recent redemptions each tagged with the device that recorded them" title="" id="86" name="Picture"/>
             <a:graphic>
               <a:graphicData uri="http://schemas.openxmlformats.org/drawingml/2006/picture">
                 <pic:pic>
                   <pic:nvPicPr>
-                    <pic:cNvPr descr="../evidence-ui-meals.png" id="89" name="Picture"/>
+                    <pic:cNvPr descr="../evidence-ui-meals.png" id="87" name="Picture"/>
                     <pic:cNvPicPr>
                       <a:picLocks noChangeArrowheads="1" noChangeAspect="1"/>
                     </pic:cNvPicPr>
                   </pic:nvPicPr>
                   <pic:blipFill>
-                    <a:blip r:embed="rId87"/>
+                    <a:blip r:embed="rId85"/>
                     <a:stretch>
                       <a:fillRect/>
                     </a:stretch>
@@ -21256,18 +20850,18 @@
           <wp:inline>
             <wp:extent cx="2674620" cy="5943600"/>
             <wp:effectExtent b="0" l="0" r="0" t="0"/>
-            <wp:docPr descr="Meal voucher scan screen with the token MEAL-DEMO-1-3 entered and a green confirmation reading &quot;Voucher redeemed successfully.&quot;" title="" id="91" name="Picture"/>
+            <wp:docPr descr="Meal voucher scan screen with the token MEAL-DEMO-1-3 entered and a green confirmation reading &quot;Voucher redeemed successfully.&quot;" title="" id="89" name="Picture"/>
             <a:graphic>
               <a:graphicData uri="http://schemas.openxmlformats.org/drawingml/2006/picture">
                 <pic:pic>
                   <pic:nvPicPr>
-                    <pic:cNvPr descr="../evidence-scan-accepted.png" id="92" name="Picture"/>
+                    <pic:cNvPr descr="../evidence-scan-accepted.png" id="90" name="Picture"/>
                     <pic:cNvPicPr>
                       <a:picLocks noChangeArrowheads="1" noChangeAspect="1"/>
                     </pic:cNvPicPr>
                   </pic:nvPicPr>
                   <pic:blipFill>
-                    <a:blip r:embed="rId90"/>
+                    <a:blip r:embed="rId88"/>
                     <a:stretch>
                       <a:fillRect/>
                     </a:stretch>
@@ -21318,18 +20912,18 @@
           <wp:inline>
             <wp:extent cx="2674620" cy="5943600"/>
             <wp:effectExtent b="0" l="0" r="0" t="0"/>
-            <wp:docPr descr="Meal voucher scan screen with MEAL-DEMO-1-3 entered again and a red banner reading &quot;Meal voucher has already been redeemed or is not usable.&quot;" title="" id="94" name="Picture"/>
+            <wp:docPr descr="Meal voucher scan screen with MEAL-DEMO-1-3 entered again and a red banner reading &quot;Meal voucher has already been redeemed or is not usable.&quot;" title="" id="92" name="Picture"/>
             <a:graphic>
               <a:graphicData uri="http://schemas.openxmlformats.org/drawingml/2006/picture">
                 <pic:pic>
                   <pic:nvPicPr>
-                    <pic:cNvPr descr="../evidence-scan-duplicate-rejected.png" id="95" name="Picture"/>
+                    <pic:cNvPr descr="../evidence-scan-duplicate-rejected.png" id="93" name="Picture"/>
                     <pic:cNvPicPr>
                       <a:picLocks noChangeArrowheads="1" noChangeAspect="1"/>
                     </pic:cNvPicPr>
                   </pic:nvPicPr>
                   <pic:blipFill>
-                    <a:blip r:embed="rId93"/>
+                    <a:blip r:embed="rId91"/>
                     <a:stretch>
                       <a:fillRect/>
                     </a:stretch>
@@ -21418,18 +21012,18 @@
           <wp:inline>
             <wp:extent cx="2674620" cy="5943600"/>
             <wp:effectExtent b="0" l="0" r="0" t="0"/>
-            <wp:docPr descr="Reports screen listing four exports: Attendance Report, Meal Redemption Report, Session Attendance Report and Notification Report" title="" id="97" name="Picture"/>
+            <wp:docPr descr="Reports screen listing four exports: Attendance Report, Meal Redemption Report, Session Attendance Report and Notification Report" title="" id="95" name="Picture"/>
             <a:graphic>
               <a:graphicData uri="http://schemas.openxmlformats.org/drawingml/2006/picture">
                 <pic:pic>
                   <pic:nvPicPr>
-                    <pic:cNvPr descr="../evidence-ui-reports.png" id="98" name="Picture"/>
+                    <pic:cNvPr descr="../evidence-ui-reports.png" id="96" name="Picture"/>
                     <pic:cNvPicPr>
                       <a:picLocks noChangeArrowheads="1" noChangeAspect="1"/>
                     </pic:cNvPicPr>
                   </pic:nvPicPr>
                   <pic:blipFill>
-                    <a:blip r:embed="rId96"/>
+                    <a:blip r:embed="rId94"/>
                     <a:stretch>
                       <a:fillRect/>
                     </a:stretch>
@@ -21470,7 +21064,7 @@
         <w:t xml:space="preserve">in Section 6.6.</w:t>
       </w:r>
     </w:p>
-    <w:bookmarkStart w:id="99" w:name="e1-what-these-figures-do-and-do-not-show"/>
+    <w:bookmarkStart w:id="97" w:name="e1-what-these-figures-do-and-do-not-show"/>
     <w:p>
       <w:pPr>
         <w:pStyle w:val="Heading2"/>
@@ -21570,9 +21164,9 @@
         <w:t xml:space="preserve">them as it does to the push-delivery timing.</w:t>
       </w:r>
     </w:p>
-    <w:bookmarkEnd w:id="99"/>
-    <w:bookmarkEnd w:id="100"/>
-    <w:bookmarkStart w:id="101" w:name="appendix-f-reference-verification-record"/>
+    <w:bookmarkEnd w:id="97"/>
+    <w:bookmarkEnd w:id="98"/>
+    <w:bookmarkStart w:id="99" w:name="appendix-f-reference-verification-record"/>
     <w:p>
       <w:pPr>
         <w:pStyle w:val="Heading1"/>
@@ -22916,7 +22510,7 @@
         <w:t xml:space="preserve">before being cited.</w:t>
       </w:r>
     </w:p>
-    <w:bookmarkEnd w:id="101"/>
+    <w:bookmarkEnd w:id="99"/>
     <w:sectPr>
       <w:footerReference w:type="default" r:id="rId10"/>
       <w:footnotePr>
@@ -23127,109 +22721,6 @@
       <w:pPr>
         <w:ind w:left="6480" w:hanging="360"/>
       </w:pPr>
-    </w:lvl>
-  </w:abstractNum>
-  <w:abstractNum w:abstractNumId="991">
-    <w:nsid w:val="0000A991"/>
-    <w:multiLevelType w:val="multilevel"/>
-    <w:lvl w:ilvl="0">
-      <w:numFmt w:val="bullet"/>
-      <w:lvlText w:val=""/>
-      <w:lvlJc w:val="left"/>
-      <w:pPr>
-        <w:ind w:left="720" w:hanging="360"/>
-      </w:pPr>
-      <w:rPr>
-        <w:rFonts w:ascii="Symbol" w:hAnsi="Symbol" w:cs="Symbol" w:hint="default"/>
-      </w:rPr>
-    </w:lvl>
-    <w:lvl w:ilvl="1">
-      <w:numFmt w:val="bullet"/>
-      <w:lvlText w:val="o"/>
-      <w:lvlJc w:val="left"/>
-      <w:pPr>
-        <w:ind w:left="1440" w:hanging="360"/>
-      </w:pPr>
-      <w:rPr>
-        <w:rFonts w:ascii="Courier New" w:hAnsi="Courier New" w:cs="Courier New" w:hint="default"/>
-      </w:rPr>
-    </w:lvl>
-    <w:lvl w:ilvl="2">
-      <w:numFmt w:val="bullet"/>
-      <w:lvlText w:val=""/>
-      <w:lvlJc w:val="left"/>
-      <w:pPr>
-        <w:ind w:left="2160" w:hanging="360"/>
-      </w:pPr>
-      <w:rPr>
-        <w:rFonts w:ascii="Wingdings" w:hAnsi="Wingdings" w:cs="Wingdings" w:hint="default"/>
-      </w:rPr>
-    </w:lvl>
-    <w:lvl w:ilvl="3">
-      <w:numFmt w:val="bullet"/>
-      <w:lvlText w:val=""/>
-      <w:lvlJc w:val="left"/>
-      <w:pPr>
-        <w:ind w:left="2880" w:hanging="360"/>
-      </w:pPr>
-      <w:rPr>
-        <w:rFonts w:ascii="Symbol" w:hAnsi="Symbol" w:cs="Symbol" w:hint="default"/>
-      </w:rPr>
-    </w:lvl>
-    <w:lvl w:ilvl="4">
-      <w:numFmt w:val="bullet"/>
-      <w:lvlText w:val="o"/>
-      <w:lvlJc w:val="left"/>
-      <w:pPr>
-        <w:ind w:left="3600" w:hanging="360"/>
-      </w:pPr>
-      <w:rPr>
-        <w:rFonts w:ascii="Courier New" w:hAnsi="Courier New" w:cs="Courier New" w:hint="default"/>
-      </w:rPr>
-    </w:lvl>
-    <w:lvl w:ilvl="5">
-      <w:numFmt w:val="bullet"/>
-      <w:lvlText w:val=""/>
-      <w:lvlJc w:val="left"/>
-      <w:pPr>
-        <w:ind w:left="4320" w:hanging="360"/>
-      </w:pPr>
-      <w:rPr>
-        <w:rFonts w:ascii="Wingdings" w:hAnsi="Wingdings" w:cs="Wingdings" w:hint="default"/>
-      </w:rPr>
-    </w:lvl>
-    <w:lvl w:ilvl="6">
-      <w:numFmt w:val="bullet"/>
-      <w:lvlText w:val=""/>
-      <w:lvlJc w:val="left"/>
-      <w:pPr>
-        <w:ind w:left="5040" w:hanging="360"/>
-      </w:pPr>
-      <w:rPr>
-        <w:rFonts w:ascii="Symbol" w:hAnsi="Symbol" w:cs="Symbol" w:hint="default"/>
-      </w:rPr>
-    </w:lvl>
-    <w:lvl w:ilvl="7">
-      <w:numFmt w:val="bullet"/>
-      <w:lvlText w:val="o"/>
-      <w:lvlJc w:val="left"/>
-      <w:pPr>
-        <w:ind w:left="5760" w:hanging="360"/>
-      </w:pPr>
-      <w:rPr>
-        <w:rFonts w:ascii="Courier New" w:hAnsi="Courier New" w:cs="Courier New" w:hint="default"/>
-      </w:rPr>
-    </w:lvl>
-    <w:lvl w:ilvl="8">
-      <w:numFmt w:val="bullet"/>
-      <w:lvlText w:val=""/>
-      <w:lvlJc w:val="left"/>
-      <w:pPr>
-        <w:ind w:left="6480" w:hanging="360"/>
-      </w:pPr>
-      <w:rPr>
-        <w:rFonts w:ascii="Wingdings" w:hAnsi="Wingdings" w:cs="Wingdings" w:hint="default"/>
-      </w:rPr>
     </w:lvl>
   </w:abstractNum>
   <w:num w:numId="1000">
@@ -23296,9 +22787,6 @@
     </w:lvlOverride>
   </w:num>
   <w:num w:numId="1003">
-    <w:abstractNumId w:val="991"/>
-  </w:num>
-  <w:num w:numId="1004">
     <w:abstractNumId w:val="99411"/>
     <w:lvlOverride w:ilvl="0">
       <w:startOverride w:val="1"/>

</xml_diff>

<commit_message>
validation doc cites resubmission-16-october, rebuild word and pdf
</commit_message>
<xml_diff>
--- a/docs/deliverables/ConferenceCheck Final Report.docx
+++ b/docs/deliverables/ConferenceCheck Final Report.docx
@@ -4,136 +4,330 @@
   <w:body>
     <w:p>
       <w:pPr>
-        <w:pStyle w:val="FirstParagraph"/>
-        <w:spacing w:after="360"/>
+        <w:spacing w:before="960" w:after="480"/>
         <w:jc w:val="center"/>
       </w:pPr>
       <w:r>
-        <w:rPr>
-          <w:b/>
-          <w:bCs/>
-        </w:rPr>
-        <w:t xml:space="preserve">THE UNIVERSITY OF ZAMBIA</w:t>
+        <w:drawing>
+          <wp:inline>
+            <wp:extent cx="1737360" cy="1737360"/>
+            <wp:docPr id="138" name="Picture 138"/>
+            <wp:cNvGraphicFramePr>
+              <a:graphicFrameLocks noChangeAspect="1"/>
+            </wp:cNvGraphicFramePr>
+            <a:graphic>
+              <a:graphicData uri="http://schemas.openxmlformats.org/drawingml/2006/picture">
+                <pic:pic>
+                  <pic:nvPicPr>
+                    <pic:cNvPr id="0" name="unza-crest.jpeg"/>
+                    <pic:cNvPicPr/>
+                  </pic:nvPicPr>
+                  <pic:blipFill>
+                    <a:blip r:embed="rId11"/>
+                    <a:stretch>
+                      <a:fillRect/>
+                    </a:stretch>
+                  </pic:blipFill>
+                  <pic:spPr>
+                    <a:xfrm>
+                      <a:off x="0" y="0"/>
+                      <a:ext cx="1737360" cy="1737360"/>
+                    </a:xfrm>
+                    <a:prstGeom prst="rect"/>
+                  </pic:spPr>
+                </pic:pic>
+              </a:graphicData>
+            </a:graphic>
+          </wp:inline>
+        </w:drawing>
       </w:r>
     </w:p>
     <w:p>
       <w:pPr>
-        <w:pStyle w:val="BodyText"/>
-        <w:spacing w:after="360"/>
+        <w:spacing w:after="280" w:before="0" w:line="240" w:lineRule="auto"/>
         <w:jc w:val="center"/>
       </w:pPr>
       <w:r>
         <w:rPr>
           <w:b/>
-          <w:bCs/>
-        </w:rPr>
-        <w:t xml:space="preserve">SCHOOL OF NATURAL AND APPLIED SCIENCES</w:t>
+          <w:sz w:val="44"/>
+          <w:u w:val="none"/>
+        </w:rPr>
+        <w:t>THE UNIVERSITY OF ZAMBIA</w:t>
       </w:r>
     </w:p>
     <w:p>
       <w:pPr>
-        <w:pStyle w:val="BodyText"/>
-        <w:spacing w:after="360"/>
+        <w:spacing w:after="200" w:before="0" w:line="240" w:lineRule="auto"/>
         <w:jc w:val="center"/>
       </w:pPr>
       <w:r>
         <w:rPr>
-          <w:b/>
-          <w:bCs/>
-        </w:rPr>
-        <w:t xml:space="preserve">DEPARTMENT OF COMPUTING AND INFORMATICS</w:t>
+          <w:b w:val="0"/>
+          <w:sz w:val="30"/>
+          <w:u w:val="none"/>
+        </w:rPr>
+        <w:t>SCHOOL OF NATURAL AND APPLIED SCIENCES</w:t>
       </w:r>
     </w:p>
     <w:p>
       <w:pPr>
-        <w:pStyle w:val="BodyText"/>
-        <w:spacing w:after="720" w:before="720"/>
+        <w:spacing w:after="480" w:before="0" w:line="240" w:lineRule="auto"/>
         <w:jc w:val="center"/>
       </w:pPr>
       <w:r>
         <w:rPr>
-          <w:b/>
-          <w:sz w:val="36"/>
-        </w:rPr>
-        <w:t xml:space="preserve">Fraud-Resistant Meal Voucher Redemption and Real-Time Operational Analytics for Conference Management: Design and Evaluation of ConferenceCheck Mobile</w:t>
+          <w:b w:val="0"/>
+          <w:sz w:val="30"/>
+          <w:u w:val="none"/>
+        </w:rPr>
+        <w:t>DEPARTMENT OF COMPUTING AND INFORMATICS</w:t>
       </w:r>
     </w:p>
     <w:p>
       <w:pPr>
-        <w:pStyle w:val="BodyText"/>
-        <w:spacing w:after="360"/>
+        <w:spacing w:after="80" w:before="0" w:line="240" w:lineRule="auto"/>
         <w:jc w:val="center"/>
       </w:pPr>
       <w:r>
-        <w:t xml:space="preserve">A final year project report submitted in partial fulfilment of the requirements for the award of the degree of [DEGREE PROGRAMME: to be completed by the student]</w:t>
+        <w:rPr>
+          <w:b/>
+          <w:sz w:val="32"/>
+          <w:u w:val="single"/>
+        </w:rPr>
+        <w:t>Fraud-Resistant Meal Voucher Redemption and Real-Time Operational Analytics for Conference Management: Design and Evaluation of ConferenceCheck Mobile</w:t>
       </w:r>
     </w:p>
     <w:p>
       <w:pPr>
-        <w:pStyle w:val="BodyText"/>
-        <w:spacing w:after="360"/>
+        <w:spacing w:after="200" w:before="0" w:line="240" w:lineRule="auto"/>
         <w:jc w:val="center"/>
       </w:pPr>
       <w:r>
         <w:rPr>
           <w:b/>
-          <w:bCs/>
-        </w:rPr>
-        <w:t xml:space="preserve">Ndashi Bwalya Chisanga</w:t>
+          <w:sz w:val="32"/>
+          <w:u w:val="single"/>
+        </w:rPr>
+        <w:t>FINAL YEAR PROJECT REPORT</w:t>
       </w:r>
     </w:p>
     <w:p>
       <w:pPr>
-        <w:pStyle w:val="BodyText"/>
-        <w:spacing w:after="360"/>
+        <w:spacing w:after="80" w:before="0" w:line="240" w:lineRule="auto"/>
         <w:jc w:val="center"/>
       </w:pPr>
       <w:r>
-        <w:t xml:space="preserve">Computer number: 2021470105</w:t>
+        <w:rPr>
+          <w:b w:val="0"/>
+          <w:sz w:val="24"/>
+          <w:u w:val="none"/>
+        </w:rPr>
+        <w:t>A report submitted in partial fulfilment of the requirements for the degree of Bachelor of Science in Computer Science</w:t>
       </w:r>
     </w:p>
     <w:p>
       <w:pPr>
-        <w:pStyle w:val="BodyText"/>
-        <w:spacing w:after="360"/>
+        <w:spacing w:after="360" w:before="0" w:line="240" w:lineRule="auto"/>
         <w:jc w:val="center"/>
       </w:pPr>
       <w:r>
-        <w:t xml:space="preserve">Supervisor: Mr. Mofya Phiri</w:t>
+        <w:rPr>
+          <w:b/>
+          <w:sz w:val="24"/>
+          <w:u w:val="none"/>
+        </w:rPr>
+        <w:t>Academic Year 2026</w:t>
       </w:r>
     </w:p>
-    <w:p>
-      <w:pPr>
-        <w:pStyle w:val="BodyText"/>
-        <w:spacing w:after="360"/>
-        <w:jc w:val="center"/>
-      </w:pPr>
-      <w:r>
-        <w:t xml:space="preserve">October 2026</w:t>
-      </w:r>
-    </w:p>
-    <w:p>
-      <w:pPr>
-        <w:pStyle w:val="BodyText"/>
-        <w:spacing w:after="360"/>
-        <w:jc w:val="center"/>
-      </w:pPr>
-      <w:r>
-        <w:t xml:space="preserve">Repository:</w:t>
-      </w:r>
-      <w:r>
-        <w:t xml:space="preserve"> </w:t>
-      </w:r>
-      <w:hyperlink r:id="rId9">
-        <w:r>
-          <w:rPr>
-            <w:rStyle w:val="Hyperlink"/>
-          </w:rPr>
-          <w:t xml:space="preserve">https://github.com/ndashi-chisanga6/ConferenceCheck-Mobile-Analytics-Meals-and-Notifications</w:t>
-        </w:r>
-      </w:hyperlink>
-    </w:p>
-    <w:bookmarkStart w:id="10" w:name="declaration"/>
+    <w:tbl>
+      <w:tblPr>
+        <w:tblW w:type="auto" w:w="0"/>
+        <w:tblBorders>
+          <w:top w:val="nil"/>
+          <w:left w:val="nil"/>
+          <w:bottom w:val="nil"/>
+          <w:right w:val="nil"/>
+          <w:insideH w:val="nil"/>
+          <w:insideV w:val="nil"/>
+        </w:tblBorders>
+        <w:tblLook w:firstRow="0" w:lastRow="0" w:firstColumn="0" w:lastColumn="0" w:val="0000"/>
+      </w:tblPr>
+      <w:tblGrid>
+        <w:gridCol w:w="4680"/>
+        <w:gridCol w:w="4680"/>
+      </w:tblGrid>
+      <w:tr>
+        <w:tc>
+          <w:tcPr>
+            <w:tcW w:type="dxa" w:w="3456"/>
+          </w:tcPr>
+          <w:p>
+            <w:pPr>
+              <w:spacing w:after="160" w:line="240" w:lineRule="auto"/>
+            </w:pPr>
+            <w:r>
+              <w:rPr>
+                <w:sz w:val="24"/>
+              </w:rPr>
+              <w:t>NAME:</w:t>
+            </w:r>
+          </w:p>
+        </w:tc>
+        <w:tc>
+          <w:tcPr>
+            <w:tcW w:type="dxa" w:w="5472"/>
+          </w:tcPr>
+          <w:p>
+            <w:pPr>
+              <w:spacing w:after="160" w:line="240" w:lineRule="auto"/>
+            </w:pPr>
+            <w:r>
+              <w:rPr>
+                <w:sz w:val="24"/>
+              </w:rPr>
+              <w:t>NDASHI BWALYA CHISANGA</w:t>
+            </w:r>
+          </w:p>
+        </w:tc>
+      </w:tr>
+      <w:tr>
+        <w:tc>
+          <w:tcPr>
+            <w:tcW w:type="dxa" w:w="3456"/>
+          </w:tcPr>
+          <w:p>
+            <w:pPr>
+              <w:spacing w:after="160" w:line="240" w:lineRule="auto"/>
+            </w:pPr>
+            <w:r>
+              <w:rPr>
+                <w:sz w:val="24"/>
+              </w:rPr>
+              <w:t>COMPUTER NUMBER:</w:t>
+            </w:r>
+          </w:p>
+        </w:tc>
+        <w:tc>
+          <w:tcPr>
+            <w:tcW w:type="dxa" w:w="5472"/>
+          </w:tcPr>
+          <w:p>
+            <w:pPr>
+              <w:spacing w:after="160" w:line="240" w:lineRule="auto"/>
+            </w:pPr>
+            <w:r>
+              <w:rPr>
+                <w:sz w:val="24"/>
+              </w:rPr>
+              <w:t>2021470105</w:t>
+            </w:r>
+          </w:p>
+        </w:tc>
+      </w:tr>
+      <w:tr>
+        <w:tc>
+          <w:tcPr>
+            <w:tcW w:type="dxa" w:w="3456"/>
+          </w:tcPr>
+          <w:p>
+            <w:pPr>
+              <w:spacing w:after="160" w:line="240" w:lineRule="auto"/>
+            </w:pPr>
+            <w:r>
+              <w:rPr>
+                <w:sz w:val="24"/>
+              </w:rPr>
+              <w:t>SUPERVISOR:</w:t>
+            </w:r>
+          </w:p>
+        </w:tc>
+        <w:tc>
+          <w:tcPr>
+            <w:tcW w:type="dxa" w:w="5472"/>
+          </w:tcPr>
+          <w:p>
+            <w:pPr>
+              <w:spacing w:after="160" w:line="240" w:lineRule="auto"/>
+            </w:pPr>
+            <w:r>
+              <w:rPr>
+                <w:sz w:val="24"/>
+              </w:rPr>
+              <w:t>Mr. Mofya Phiri</w:t>
+            </w:r>
+          </w:p>
+        </w:tc>
+      </w:tr>
+      <w:tr>
+        <w:tc>
+          <w:tcPr>
+            <w:tcW w:type="dxa" w:w="3456"/>
+          </w:tcPr>
+          <w:p>
+            <w:pPr>
+              <w:spacing w:after="160" w:line="240" w:lineRule="auto"/>
+            </w:pPr>
+            <w:r>
+              <w:rPr>
+                <w:sz w:val="24"/>
+              </w:rPr>
+              <w:t>REPOSITORY TAG:</w:t>
+            </w:r>
+          </w:p>
+        </w:tc>
+        <w:tc>
+          <w:tcPr>
+            <w:tcW w:type="dxa" w:w="5472"/>
+          </w:tcPr>
+          <w:p>
+            <w:pPr>
+              <w:spacing w:after="160" w:line="240" w:lineRule="auto"/>
+            </w:pPr>
+            <w:r>
+              <w:rPr>
+                <w:sz w:val="24"/>
+              </w:rPr>
+              <w:t>resubmission-16-october</w:t>
+            </w:r>
+          </w:p>
+        </w:tc>
+      </w:tr>
+      <w:tr>
+        <w:tc>
+          <w:tcPr>
+            <w:tcW w:type="dxa" w:w="3456"/>
+          </w:tcPr>
+          <w:p>
+            <w:pPr>
+              <w:spacing w:after="160" w:line="240" w:lineRule="auto"/>
+            </w:pPr>
+            <w:r>
+              <w:rPr>
+                <w:sz w:val="24"/>
+              </w:rPr>
+              <w:t>DATE:</w:t>
+            </w:r>
+          </w:p>
+        </w:tc>
+        <w:tc>
+          <w:tcPr>
+            <w:tcW w:type="dxa" w:w="5472"/>
+          </w:tcPr>
+          <w:p>
+            <w:pPr>
+              <w:spacing w:after="160" w:line="240" w:lineRule="auto"/>
+            </w:pPr>
+            <w:r>
+              <w:rPr>
+                <w:sz w:val="24"/>
+              </w:rPr>
+              <w:t>October 2026</w:t>
+            </w:r>
+          </w:p>
+        </w:tc>
+      </w:tr>
+    </w:tbl>
     <w:p>
       <w:pPr>
         <w:pStyle w:val="Heading1"/>
@@ -33771,7 +33965,19 @@
         <w:pStyle w:val="BodyText"/>
       </w:pPr>
       <w:r>
-        <w:t xml:space="preserve">Validated state, and the commit it resolves to:</w:t>
+        <w:t xml:space="preserve">Validated state, tag</w:t>
+      </w:r>
+      <w:r>
+        <w:t xml:space="preserve"> </w:t>
+      </w:r>
+      <w:r>
+        <w:rPr>
+          <w:rStyle w:val="VerbatimChar"/>
+        </w:rPr>
+        <w:t xml:space="preserve">resubmission-16-october</w:t>
+      </w:r>
+      <w:r>
+        <w:t xml:space="preserve">, and the commit it resolves to:</w:t>
       </w:r>
     </w:p>
     <w:p>
@@ -33800,7 +34006,7 @@
         <w:rPr>
           <w:rStyle w:val="NormalTok"/>
         </w:rPr>
-        <w:t xml:space="preserve"> final-resubmission</w:t>
+        <w:t xml:space="preserve"> resubmission-16-october</w:t>
       </w:r>
     </w:p>
     <w:bookmarkEnd w:id="107"/>
@@ -36225,6 +36431,12 @@
       <w:footnotePr>
         <w:numRestart w:val="eachSect"/>
       </w:footnotePr>
+      <w:pgBorders w:display="firstPage" w:offsetFrom="page">
+        <w:top w:val="single" w:sz="4" w:space="24" w:color="auto"/>
+        <w:left w:val="single" w:sz="4" w:space="24" w:color="auto"/>
+        <w:bottom w:val="single" w:sz="4" w:space="24" w:color="auto"/>
+        <w:right w:val="single" w:sz="4" w:space="24" w:color="auto"/>
+      </w:pgBorders>
     </w:sectPr>
   </w:body>
 </w:document>

</xml_diff>